<commit_message>
Databse schema complete and Prisma client generated too
</commit_message>
<xml_diff>
--- a/note.docx
+++ b/note.docx
@@ -200,21 +200,33 @@
     <w:p/>
     <w:p>
       <w:r>
-        <w:t xml:space="preserve">                   1:N                            </w:t>
+        <w:t xml:space="preserve">                   </w:t>
+      </w:r>
+      <w:proofErr w:type="gramStart"/>
+      <w:r>
+        <w:t>1:N</w:t>
+      </w:r>
+      <w:proofErr w:type="gramEnd"/>
+      <w:r>
+        <w:t xml:space="preserve">                            </w:t>
       </w:r>
       <w:proofErr w:type="spellStart"/>
+      <w:proofErr w:type="gramStart"/>
       <w:r>
         <w:t>1:N</w:t>
       </w:r>
       <w:proofErr w:type="spellEnd"/>
+      <w:proofErr w:type="gramEnd"/>
       <w:r>
         <w:t xml:space="preserve">                      </w:t>
       </w:r>
       <w:proofErr w:type="spellStart"/>
+      <w:proofErr w:type="gramStart"/>
       <w:r>
         <w:t>1:N</w:t>
       </w:r>
       <w:proofErr w:type="spellEnd"/>
+      <w:proofErr w:type="gramEnd"/>
     </w:p>
     <w:p>
       <w:r>
@@ -355,8 +367,37 @@
     </w:p>
     <w:p>
       <w:r>
-        <w:t xml:space="preserve">      │1:1          │1:N             │1:N             │1:N        │1:N</w:t>
-      </w:r>
+        <w:t xml:space="preserve">      │1:1          │</w:t>
+      </w:r>
+      <w:proofErr w:type="gramStart"/>
+      <w:r>
+        <w:t>1:N</w:t>
+      </w:r>
+      <w:proofErr w:type="gramEnd"/>
+      <w:r>
+        <w:t xml:space="preserve">             │</w:t>
+      </w:r>
+      <w:proofErr w:type="gramStart"/>
+      <w:r>
+        <w:t>1:N</w:t>
+      </w:r>
+      <w:proofErr w:type="gramEnd"/>
+      <w:r>
+        <w:t xml:space="preserve">             │</w:t>
+      </w:r>
+      <w:proofErr w:type="gramStart"/>
+      <w:r>
+        <w:t>1:N</w:t>
+      </w:r>
+      <w:proofErr w:type="gramEnd"/>
+      <w:r>
+        <w:t xml:space="preserve">        │</w:t>
+      </w:r>
+      <w:proofErr w:type="gramStart"/>
+      <w:r>
+        <w:t>1:N</w:t>
+      </w:r>
+      <w:proofErr w:type="gramEnd"/>
     </w:p>
     <w:p>
       <w:r>
@@ -423,8 +464,13 @@
     </w:p>
     <w:p>
       <w:r>
-        <w:t>│LOCATION    │ │SECTIONS      │ │GALLERY      │ │DOCUMENTS     │ │SPECIFICATIONS  │</w:t>
-      </w:r>
+        <w:t>│LOCATION    │ │SECTIONS      │ │GALLERY      │ │DOCUMENTS     │ │</w:t>
+      </w:r>
+      <w:proofErr w:type="gramStart"/>
+      <w:r>
+        <w:t>SPECIFICATIONS  │</w:t>
+      </w:r>
+      <w:proofErr w:type="gramEnd"/>
     </w:p>
     <w:p>
       <w:r>
@@ -1062,8 +1108,13 @@
             <w:hideMark/>
           </w:tcPr>
           <w:p>
-            <w:r>
-              <w:t>1 : N</w:t>
+            <w:proofErr w:type="gramStart"/>
+            <w:r>
+              <w:t>1 :</w:t>
+            </w:r>
+            <w:proofErr w:type="gramEnd"/>
+            <w:r>
+              <w:t xml:space="preserve"> N</w:t>
             </w:r>
           </w:p>
         </w:tc>
@@ -1103,8 +1154,13 @@
             <w:hideMark/>
           </w:tcPr>
           <w:p>
-            <w:r>
-              <w:t>1 : N</w:t>
+            <w:proofErr w:type="gramStart"/>
+            <w:r>
+              <w:t>1 :</w:t>
+            </w:r>
+            <w:proofErr w:type="gramEnd"/>
+            <w:r>
+              <w:t xml:space="preserve"> N</w:t>
             </w:r>
           </w:p>
         </w:tc>
@@ -1144,8 +1200,13 @@
             <w:hideMark/>
           </w:tcPr>
           <w:p>
-            <w:r>
-              <w:t>1 : N</w:t>
+            <w:proofErr w:type="gramStart"/>
+            <w:r>
+              <w:t>1 :</w:t>
+            </w:r>
+            <w:proofErr w:type="gramEnd"/>
+            <w:r>
+              <w:t xml:space="preserve"> N</w:t>
             </w:r>
           </w:p>
         </w:tc>
@@ -1185,8 +1246,13 @@
             <w:hideMark/>
           </w:tcPr>
           <w:p>
-            <w:r>
-              <w:t>1 : 1</w:t>
+            <w:proofErr w:type="gramStart"/>
+            <w:r>
+              <w:t>1 :</w:t>
+            </w:r>
+            <w:proofErr w:type="gramEnd"/>
+            <w:r>
+              <w:t xml:space="preserve"> 1</w:t>
             </w:r>
           </w:p>
         </w:tc>
@@ -1226,8 +1292,13 @@
             <w:hideMark/>
           </w:tcPr>
           <w:p>
-            <w:r>
-              <w:t>1 : N</w:t>
+            <w:proofErr w:type="gramStart"/>
+            <w:r>
+              <w:t>1 :</w:t>
+            </w:r>
+            <w:proofErr w:type="gramEnd"/>
+            <w:r>
+              <w:t xml:space="preserve"> N</w:t>
             </w:r>
           </w:p>
         </w:tc>
@@ -1267,8 +1338,13 @@
             <w:hideMark/>
           </w:tcPr>
           <w:p>
-            <w:r>
-              <w:t>1 : N</w:t>
+            <w:proofErr w:type="gramStart"/>
+            <w:r>
+              <w:t>1 :</w:t>
+            </w:r>
+            <w:proofErr w:type="gramEnd"/>
+            <w:r>
+              <w:t xml:space="preserve"> N</w:t>
             </w:r>
           </w:p>
         </w:tc>
@@ -1308,8 +1384,13 @@
             <w:hideMark/>
           </w:tcPr>
           <w:p>
-            <w:r>
-              <w:t>1 : N</w:t>
+            <w:proofErr w:type="gramStart"/>
+            <w:r>
+              <w:t>1 :</w:t>
+            </w:r>
+            <w:proofErr w:type="gramEnd"/>
+            <w:r>
+              <w:t xml:space="preserve"> N</w:t>
             </w:r>
           </w:p>
         </w:tc>
@@ -1349,8 +1430,13 @@
             <w:hideMark/>
           </w:tcPr>
           <w:p>
-            <w:r>
-              <w:t>1 : N</w:t>
+            <w:proofErr w:type="gramStart"/>
+            <w:r>
+              <w:t>1 :</w:t>
+            </w:r>
+            <w:proofErr w:type="gramEnd"/>
+            <w:r>
+              <w:t xml:space="preserve"> N</w:t>
             </w:r>
           </w:p>
         </w:tc>
@@ -1390,8 +1476,13 @@
             <w:hideMark/>
           </w:tcPr>
           <w:p>
-            <w:r>
-              <w:t>1 : N</w:t>
+            <w:proofErr w:type="gramStart"/>
+            <w:r>
+              <w:t>1 :</w:t>
+            </w:r>
+            <w:proofErr w:type="gramEnd"/>
+            <w:r>
+              <w:t xml:space="preserve"> N</w:t>
             </w:r>
           </w:p>
         </w:tc>
@@ -1431,8 +1522,13 @@
             <w:hideMark/>
           </w:tcPr>
           <w:p>
-            <w:r>
-              <w:t>1 : N (references Projects)</w:t>
+            <w:proofErr w:type="gramStart"/>
+            <w:r>
+              <w:t>1 :</w:t>
+            </w:r>
+            <w:proofErr w:type="gramEnd"/>
+            <w:r>
+              <w:t xml:space="preserve"> N (references Projects)</w:t>
             </w:r>
           </w:p>
         </w:tc>
@@ -1472,8 +1568,13 @@
             <w:hideMark/>
           </w:tcPr>
           <w:p>
-            <w:r>
-              <w:t>1 : N (references News)</w:t>
+            <w:proofErr w:type="gramStart"/>
+            <w:r>
+              <w:t>1 :</w:t>
+            </w:r>
+            <w:proofErr w:type="gramEnd"/>
+            <w:r>
+              <w:t xml:space="preserve"> N (references News)</w:t>
             </w:r>
           </w:p>
         </w:tc>
@@ -1513,8 +1614,13 @@
             <w:hideMark/>
           </w:tcPr>
           <w:p>
-            <w:r>
-              <w:t>1 : N</w:t>
+            <w:proofErr w:type="gramStart"/>
+            <w:r>
+              <w:t>1 :</w:t>
+            </w:r>
+            <w:proofErr w:type="gramEnd"/>
+            <w:r>
+              <w:t xml:space="preserve"> N</w:t>
             </w:r>
           </w:p>
         </w:tc>
@@ -1554,8 +1660,13 @@
             <w:hideMark/>
           </w:tcPr>
           <w:p>
-            <w:r>
-              <w:t>1 : N</w:t>
+            <w:proofErr w:type="gramStart"/>
+            <w:r>
+              <w:t>1 :</w:t>
+            </w:r>
+            <w:proofErr w:type="gramEnd"/>
+            <w:r>
+              <w:t xml:space="preserve"> N</w:t>
             </w:r>
           </w:p>
         </w:tc>
@@ -1595,8 +1706,13 @@
             <w:hideMark/>
           </w:tcPr>
           <w:p>
-            <w:r>
-              <w:t>1 : N</w:t>
+            <w:proofErr w:type="gramStart"/>
+            <w:r>
+              <w:t>1 :</w:t>
+            </w:r>
+            <w:proofErr w:type="gramEnd"/>
+            <w:r>
+              <w:t xml:space="preserve"> N</w:t>
             </w:r>
           </w:p>
         </w:tc>
@@ -3322,34 +3438,1021 @@
       </w:r>
     </w:p>
     <w:p>
+      <w:r>
+        <w:t>-- ============================================================</w:t>
+      </w:r>
+    </w:p>
+    <w:p>
+      <w:r>
+        <w:t xml:space="preserve">-- Project    </w:t>
+      </w:r>
+      <w:proofErr w:type="gramStart"/>
+      <w:r>
+        <w:t xml:space="preserve">  :</w:t>
+      </w:r>
+      <w:proofErr w:type="gramEnd"/>
+      <w:r>
+        <w:t xml:space="preserve"> NHPC Website</w:t>
+      </w:r>
+    </w:p>
+    <w:p>
+      <w:r>
+        <w:t xml:space="preserve">-- File       </w:t>
+      </w:r>
+      <w:proofErr w:type="gramStart"/>
+      <w:r>
+        <w:t xml:space="preserve">  :</w:t>
+      </w:r>
+      <w:proofErr w:type="gramEnd"/>
+      <w:r>
+        <w:t xml:space="preserve"> 04_operational_power_stations.sql</w:t>
+      </w:r>
+    </w:p>
+    <w:p>
+      <w:r>
+        <w:t xml:space="preserve">-- Module     </w:t>
+      </w:r>
+      <w:proofErr w:type="gramStart"/>
+      <w:r>
+        <w:t xml:space="preserve">  :</w:t>
+      </w:r>
+      <w:proofErr w:type="gramEnd"/>
+      <w:r>
+        <w:t xml:space="preserve"> Operational Power Stations</w:t>
+      </w:r>
+    </w:p>
+    <w:p>
+      <w:r>
+        <w:t xml:space="preserve">-- </w:t>
+      </w:r>
+      <w:proofErr w:type="gramStart"/>
+      <w:r>
+        <w:t>Description  :</w:t>
+      </w:r>
+      <w:proofErr w:type="gramEnd"/>
+      <w:r>
+        <w:t xml:space="preserve"> Operational generating stations of NHPC</w:t>
+      </w:r>
+    </w:p>
+    <w:p>
+      <w:r>
+        <w:t xml:space="preserve">-- Database   </w:t>
+      </w:r>
+      <w:proofErr w:type="gramStart"/>
+      <w:r>
+        <w:t xml:space="preserve">  :</w:t>
+      </w:r>
+      <w:proofErr w:type="gramEnd"/>
+      <w:r>
+        <w:t xml:space="preserve"> PostgreSQL 18+</w:t>
+      </w:r>
+    </w:p>
+    <w:p>
+      <w:r>
+        <w:t>-- ============================================================</w:t>
+      </w:r>
+    </w:p>
+    <w:p/>
+    <w:p>
+      <w:r>
+        <w:t>SET TIME ZONE 'UTC';</w:t>
+      </w:r>
+    </w:p>
+    <w:p/>
+    <w:p>
+      <w:r>
+        <w:t xml:space="preserve">CREATE TABLE </w:t>
+      </w:r>
+      <w:proofErr w:type="spellStart"/>
+      <w:r>
+        <w:t>operational_power_stations</w:t>
+      </w:r>
+      <w:proofErr w:type="spellEnd"/>
+      <w:r>
+        <w:t xml:space="preserve"> (</w:t>
+      </w:r>
+    </w:p>
+    <w:p/>
+    <w:p>
+      <w:r>
+        <w:t xml:space="preserve">    id BIGINT GENERATED BY DEFAULT AS IDENTITY,</w:t>
+      </w:r>
+    </w:p>
+    <w:p/>
+    <w:p>
+      <w:r>
+        <w:t xml:space="preserve">    name </w:t>
+      </w:r>
+      <w:proofErr w:type="gramStart"/>
+      <w:r>
+        <w:t>VARCHAR(</w:t>
+      </w:r>
+      <w:proofErr w:type="gramEnd"/>
+      <w:r>
+        <w:t>200) NOT NULL,</w:t>
+      </w:r>
+    </w:p>
+    <w:p/>
+    <w:p>
+      <w:r>
+        <w:lastRenderedPageBreak/>
+        <w:t xml:space="preserve">    slug </w:t>
+      </w:r>
+      <w:proofErr w:type="gramStart"/>
+      <w:r>
+        <w:t>VARCHAR(</w:t>
+      </w:r>
+      <w:proofErr w:type="gramEnd"/>
+      <w:r>
+        <w:t>250) NOT NULL,</w:t>
+      </w:r>
+    </w:p>
+    <w:p/>
+    <w:p>
+      <w:r>
+        <w:t xml:space="preserve">    </w:t>
+      </w:r>
+      <w:proofErr w:type="spellStart"/>
+      <w:r>
+        <w:t>state_id</w:t>
+      </w:r>
+      <w:proofErr w:type="spellEnd"/>
+      <w:r>
+        <w:t xml:space="preserve"> BIGINT NOT NULL,</w:t>
+      </w:r>
+    </w:p>
+    <w:p/>
+    <w:p>
+      <w:r>
+        <w:t xml:space="preserve">    </w:t>
+      </w:r>
+      <w:proofErr w:type="spellStart"/>
+      <w:r>
+        <w:t>project_type_id</w:t>
+      </w:r>
+      <w:proofErr w:type="spellEnd"/>
+      <w:r>
+        <w:t xml:space="preserve"> BIGINT NOT NULL,</w:t>
+      </w:r>
+    </w:p>
+    <w:p/>
+    <w:p>
+      <w:r>
+        <w:t xml:space="preserve">    </w:t>
+      </w:r>
+      <w:proofErr w:type="spellStart"/>
+      <w:r>
+        <w:t>installed_capacity</w:t>
+      </w:r>
+      <w:proofErr w:type="spellEnd"/>
+      <w:r>
+        <w:t xml:space="preserve"> </w:t>
+      </w:r>
+      <w:proofErr w:type="gramStart"/>
+      <w:r>
+        <w:t>NUMERIC(</w:t>
+      </w:r>
+      <w:proofErr w:type="gramEnd"/>
+      <w:r>
+        <w:t>10,2) NOT NULL,</w:t>
+      </w:r>
+    </w:p>
+    <w:p/>
+    <w:p>
+      <w:r>
+        <w:t xml:space="preserve">    </w:t>
+      </w:r>
+      <w:proofErr w:type="spellStart"/>
+      <w:r>
+        <w:t>capacity_unit_id</w:t>
+      </w:r>
+      <w:proofErr w:type="spellEnd"/>
+      <w:r>
+        <w:t xml:space="preserve"> BIGINT NOT NULL,</w:t>
+      </w:r>
+    </w:p>
+    <w:p/>
+    <w:p>
+      <w:r>
+        <w:t xml:space="preserve">    </w:t>
+      </w:r>
+      <w:proofErr w:type="spellStart"/>
+      <w:r>
+        <w:t>commissioned_on</w:t>
+      </w:r>
+      <w:proofErr w:type="spellEnd"/>
+      <w:r>
+        <w:t xml:space="preserve"> DATE,</w:t>
+      </w:r>
+    </w:p>
+    <w:p/>
+    <w:p>
+      <w:r>
+        <w:t xml:space="preserve">    latitude </w:t>
+      </w:r>
+      <w:proofErr w:type="gramStart"/>
+      <w:r>
+        <w:t>DECIMAL(</w:t>
+      </w:r>
+      <w:proofErr w:type="gramEnd"/>
+      <w:r>
+        <w:t>10,7),</w:t>
+      </w:r>
+    </w:p>
+    <w:p/>
+    <w:p>
+      <w:r>
+        <w:t xml:space="preserve">    longitude </w:t>
+      </w:r>
+      <w:proofErr w:type="gramStart"/>
+      <w:r>
+        <w:t>DECIMAL(</w:t>
+      </w:r>
+      <w:proofErr w:type="gramEnd"/>
+      <w:r>
+        <w:t>10,7),</w:t>
+      </w:r>
+    </w:p>
+    <w:p/>
+    <w:p>
+      <w:r>
+        <w:t xml:space="preserve">    description TEXT,</w:t>
+      </w:r>
+    </w:p>
+    <w:p/>
+    <w:p>
+      <w:r>
+        <w:t xml:space="preserve">    </w:t>
+      </w:r>
+      <w:proofErr w:type="spellStart"/>
+      <w:r>
+        <w:t>is_featured</w:t>
+      </w:r>
+      <w:proofErr w:type="spellEnd"/>
+      <w:r>
+        <w:t xml:space="preserve"> BOOLEAN NOT NULL DEFAULT FALSE,</w:t>
+      </w:r>
+    </w:p>
+    <w:p/>
+    <w:p>
+      <w:r>
+        <w:t xml:space="preserve">    </w:t>
+      </w:r>
+      <w:proofErr w:type="spellStart"/>
+      <w:r>
+        <w:t>display_order</w:t>
+      </w:r>
+      <w:proofErr w:type="spellEnd"/>
+      <w:r>
+        <w:t xml:space="preserve"> INTEGER NOT NULL DEFAULT 1,</w:t>
+      </w:r>
+    </w:p>
+    <w:p/>
+    <w:p>
+      <w:r>
+        <w:t xml:space="preserve">    </w:t>
+      </w:r>
+      <w:proofErr w:type="spellStart"/>
+      <w:r>
+        <w:t>is_active</w:t>
+      </w:r>
+      <w:proofErr w:type="spellEnd"/>
+      <w:r>
+        <w:t xml:space="preserve"> BOOLEAN NOT NULL DEFAULT TRUE,</w:t>
+      </w:r>
+    </w:p>
+    <w:p/>
+    <w:p>
+      <w:r>
+        <w:t xml:space="preserve">    </w:t>
+      </w:r>
+      <w:proofErr w:type="spellStart"/>
+      <w:r>
+        <w:t>created_at</w:t>
+      </w:r>
+      <w:proofErr w:type="spellEnd"/>
+      <w:r>
+        <w:t xml:space="preserve"> TIMESTAMPTZ NOT NULL DEFAULT CURRENT_TIMESTAMP,</w:t>
+      </w:r>
+    </w:p>
+    <w:p/>
+    <w:p>
+      <w:r>
+        <w:t xml:space="preserve">    </w:t>
+      </w:r>
+      <w:proofErr w:type="spellStart"/>
+      <w:r>
+        <w:t>updated_at</w:t>
+      </w:r>
+      <w:proofErr w:type="spellEnd"/>
+      <w:r>
+        <w:t xml:space="preserve"> TIMESTAMPTZ NOT NULL DEFAULT CURRENT_TIMESTAMP,</w:t>
+      </w:r>
+    </w:p>
+    <w:p/>
+    <w:p>
+      <w:r>
+        <w:lastRenderedPageBreak/>
+        <w:t xml:space="preserve">    CONSTRAINT </w:t>
+      </w:r>
+      <w:proofErr w:type="spellStart"/>
+      <w:r>
+        <w:t>pk_operational_power_stations</w:t>
+      </w:r>
+      <w:proofErr w:type="spellEnd"/>
+    </w:p>
+    <w:p>
+      <w:r>
+        <w:t xml:space="preserve">        PRIMARY KEY (id),</w:t>
+      </w:r>
+    </w:p>
+    <w:p/>
+    <w:p>
+      <w:r>
+        <w:t xml:space="preserve">    CONSTRAINT </w:t>
+      </w:r>
+      <w:proofErr w:type="spellStart"/>
+      <w:r>
+        <w:t>uq_operational_power_stations_slug</w:t>
+      </w:r>
+      <w:proofErr w:type="spellEnd"/>
+    </w:p>
+    <w:p>
+      <w:r>
+        <w:t xml:space="preserve">        UNIQUE (slug),</w:t>
+      </w:r>
+    </w:p>
+    <w:p/>
+    <w:p>
+      <w:r>
+        <w:t xml:space="preserve">    CONSTRAINT </w:t>
+      </w:r>
+      <w:proofErr w:type="spellStart"/>
+      <w:r>
+        <w:t>fk_ops_state</w:t>
+      </w:r>
+      <w:proofErr w:type="spellEnd"/>
+    </w:p>
+    <w:p>
+      <w:r>
+        <w:t xml:space="preserve">        FOREIGN KEY (</w:t>
+      </w:r>
+      <w:proofErr w:type="spellStart"/>
+      <w:r>
+        <w:t>state_id</w:t>
+      </w:r>
+      <w:proofErr w:type="spellEnd"/>
+      <w:r>
+        <w:t>)</w:t>
+      </w:r>
+    </w:p>
+    <w:p>
+      <w:r>
+        <w:t xml:space="preserve">        REFERENCES states(id),</w:t>
+      </w:r>
+    </w:p>
+    <w:p/>
+    <w:p>
+      <w:r>
+        <w:t xml:space="preserve">    CONSTRAINT </w:t>
+      </w:r>
+      <w:proofErr w:type="spellStart"/>
+      <w:r>
+        <w:t>fk_ops_project_type</w:t>
+      </w:r>
+      <w:proofErr w:type="spellEnd"/>
+    </w:p>
+    <w:p>
+      <w:r>
+        <w:t xml:space="preserve">        FOREIGN KEY (</w:t>
+      </w:r>
+      <w:proofErr w:type="spellStart"/>
+      <w:r>
+        <w:t>project_type_id</w:t>
+      </w:r>
+      <w:proofErr w:type="spellEnd"/>
+      <w:r>
+        <w:t>)</w:t>
+      </w:r>
+    </w:p>
+    <w:p>
+      <w:r>
+        <w:t xml:space="preserve">        REFERENCES </w:t>
+      </w:r>
+      <w:proofErr w:type="spellStart"/>
+      <w:r>
+        <w:t>project_types</w:t>
+      </w:r>
+      <w:proofErr w:type="spellEnd"/>
+      <w:r>
+        <w:t>(id),</w:t>
+      </w:r>
+    </w:p>
+    <w:p/>
+    <w:p>
+      <w:r>
+        <w:t xml:space="preserve">    CONSTRAINT </w:t>
+      </w:r>
+      <w:proofErr w:type="spellStart"/>
+      <w:r>
+        <w:t>fk_ops_capacity_unit</w:t>
+      </w:r>
+      <w:proofErr w:type="spellEnd"/>
+    </w:p>
+    <w:p>
+      <w:r>
+        <w:t xml:space="preserve">        FOREIGN KEY (</w:t>
+      </w:r>
+      <w:proofErr w:type="spellStart"/>
+      <w:r>
+        <w:t>capacity_unit_id</w:t>
+      </w:r>
+      <w:proofErr w:type="spellEnd"/>
+      <w:r>
+        <w:t>)</w:t>
+      </w:r>
+    </w:p>
+    <w:p>
+      <w:r>
+        <w:t xml:space="preserve">        REFERENCES </w:t>
+      </w:r>
+      <w:proofErr w:type="spellStart"/>
+      <w:r>
+        <w:t>capacity_units</w:t>
+      </w:r>
+      <w:proofErr w:type="spellEnd"/>
+      <w:r>
+        <w:t>(id),</w:t>
+      </w:r>
+    </w:p>
+    <w:p/>
+    <w:p>
+      <w:r>
+        <w:t xml:space="preserve">    CONSTRAINT </w:t>
+      </w:r>
+      <w:proofErr w:type="spellStart"/>
+      <w:r>
+        <w:t>chk_ops_display_order</w:t>
+      </w:r>
+      <w:proofErr w:type="spellEnd"/>
+    </w:p>
+    <w:p>
+      <w:r>
+        <w:t xml:space="preserve">        CHECK (</w:t>
+      </w:r>
+      <w:proofErr w:type="spellStart"/>
+      <w:r>
+        <w:t>display_order</w:t>
+      </w:r>
+      <w:proofErr w:type="spellEnd"/>
+      <w:r>
+        <w:t xml:space="preserve"> &gt; 0)</w:t>
+      </w:r>
+    </w:p>
+    <w:p/>
+    <w:p>
+      <w:r>
+        <w:t>);</w:t>
+      </w:r>
+    </w:p>
+    <w:p/>
+    <w:p>
+      <w:r>
+        <w:t xml:space="preserve">CREATE INDEX </w:t>
+      </w:r>
+      <w:proofErr w:type="spellStart"/>
+      <w:r>
+        <w:t>idx_ops_slug</w:t>
+      </w:r>
+      <w:proofErr w:type="spellEnd"/>
+    </w:p>
+    <w:p>
+      <w:r>
+        <w:t xml:space="preserve">ON </w:t>
+      </w:r>
+      <w:proofErr w:type="spellStart"/>
+      <w:r>
+        <w:t>operational_power_stations</w:t>
+      </w:r>
+      <w:proofErr w:type="spellEnd"/>
+      <w:r>
+        <w:t>(slug);</w:t>
+      </w:r>
+    </w:p>
+    <w:p/>
+    <w:p>
+      <w:r>
+        <w:t xml:space="preserve">CREATE INDEX </w:t>
+      </w:r>
+      <w:proofErr w:type="spellStart"/>
+      <w:r>
+        <w:t>idx_ops_state</w:t>
+      </w:r>
+      <w:proofErr w:type="spellEnd"/>
+    </w:p>
+    <w:p>
+      <w:r>
+        <w:t xml:space="preserve">ON </w:t>
+      </w:r>
+      <w:proofErr w:type="spellStart"/>
+      <w:r>
+        <w:t>operational_power_stations</w:t>
+      </w:r>
+      <w:proofErr w:type="spellEnd"/>
+      <w:r>
+        <w:t>(</w:t>
+      </w:r>
+      <w:proofErr w:type="spellStart"/>
+      <w:r>
+        <w:t>state_id</w:t>
+      </w:r>
+      <w:proofErr w:type="spellEnd"/>
+      <w:r>
+        <w:t>);</w:t>
+      </w:r>
+    </w:p>
+    <w:p/>
+    <w:p>
+      <w:r>
+        <w:t xml:space="preserve">CREATE INDEX </w:t>
+      </w:r>
+      <w:proofErr w:type="spellStart"/>
+      <w:r>
+        <w:t>idx_ops_featured</w:t>
+      </w:r>
+      <w:proofErr w:type="spellEnd"/>
+    </w:p>
+    <w:p>
+      <w:r>
+        <w:t xml:space="preserve">ON </w:t>
+      </w:r>
+      <w:proofErr w:type="spellStart"/>
+      <w:r>
+        <w:t>operational_power_stations</w:t>
+      </w:r>
+      <w:proofErr w:type="spellEnd"/>
+      <w:r>
+        <w:t>(</w:t>
+      </w:r>
+      <w:proofErr w:type="spellStart"/>
+      <w:r>
+        <w:t>is_featured</w:t>
+      </w:r>
+      <w:proofErr w:type="spellEnd"/>
+      <w:r>
+        <w:t>);</w:t>
+      </w:r>
+    </w:p>
+    <w:p/>
+    <w:p>
+      <w:r>
+        <w:t xml:space="preserve">CREATE INDEX </w:t>
+      </w:r>
+      <w:proofErr w:type="spellStart"/>
+      <w:r>
+        <w:t>idx_ops_active</w:t>
+      </w:r>
+      <w:proofErr w:type="spellEnd"/>
+    </w:p>
+    <w:p>
+      <w:r>
+        <w:t xml:space="preserve">ON </w:t>
+      </w:r>
+      <w:proofErr w:type="spellStart"/>
+      <w:r>
+        <w:t>operational_power_stations</w:t>
+      </w:r>
+      <w:proofErr w:type="spellEnd"/>
+      <w:r>
+        <w:t>(</w:t>
+      </w:r>
+      <w:proofErr w:type="spellStart"/>
+      <w:r>
+        <w:t>is_active</w:t>
+      </w:r>
+      <w:proofErr w:type="spellEnd"/>
+      <w:r>
+        <w:t>);</w:t>
+      </w:r>
+    </w:p>
+    <w:p/>
+    <w:p>
+      <w:r>
+        <w:t xml:space="preserve">CREATE INDEX </w:t>
+      </w:r>
+      <w:proofErr w:type="spellStart"/>
+      <w:r>
+        <w:t>idx_ops_display_order</w:t>
+      </w:r>
+      <w:proofErr w:type="spellEnd"/>
+    </w:p>
+    <w:p>
+      <w:r>
+        <w:t xml:space="preserve">ON </w:t>
+      </w:r>
+      <w:proofErr w:type="spellStart"/>
+      <w:r>
+        <w:t>operational_power_stations</w:t>
+      </w:r>
+      <w:proofErr w:type="spellEnd"/>
+      <w:r>
+        <w:t>(</w:t>
+      </w:r>
+      <w:proofErr w:type="spellStart"/>
+      <w:r>
+        <w:t>display_order</w:t>
+      </w:r>
+      <w:proofErr w:type="spellEnd"/>
+      <w:r>
+        <w:t>);</w:t>
+      </w:r>
+    </w:p>
+    <w:p/>
+    <w:p>
+      <w:r>
+        <w:t xml:space="preserve">CREATE TRIGGER </w:t>
+      </w:r>
+      <w:proofErr w:type="spellStart"/>
+      <w:r>
+        <w:t>trg_operational_power_stations_updated_at</w:t>
+      </w:r>
+      <w:proofErr w:type="spellEnd"/>
+    </w:p>
+    <w:p>
+      <w:r>
+        <w:t xml:space="preserve">BEFORE UPDATE ON </w:t>
+      </w:r>
+      <w:proofErr w:type="spellStart"/>
+      <w:r>
+        <w:t>operational_power_stations</w:t>
+      </w:r>
+      <w:proofErr w:type="spellEnd"/>
+    </w:p>
+    <w:p>
+      <w:r>
+        <w:t>FOR EACH RO</w:t>
+      </w:r>
+    </w:p>
+    <w:p>
+      <w:r>
+        <w:t xml:space="preserve">EXECUTE FUNCTION </w:t>
+      </w:r>
+      <w:proofErr w:type="spellStart"/>
+      <w:r>
+        <w:t>fn_update_updated_</w:t>
+      </w:r>
+      <w:proofErr w:type="gramStart"/>
+      <w:r>
+        <w:t>at</w:t>
+      </w:r>
+      <w:proofErr w:type="spellEnd"/>
+      <w:r>
+        <w:t>(</w:t>
+      </w:r>
+      <w:proofErr w:type="gramEnd"/>
+      <w:r>
+        <w:t>);</w:t>
+      </w:r>
+    </w:p>
+    <w:p>
       <w:pPr>
         <w:rPr>
           <w:b/>
           <w:bCs/>
         </w:rPr>
       </w:pPr>
-      <w:r>
+    </w:p>
+    <w:p>
+      <w:pPr>
         <w:rPr>
           <w:b/>
           <w:bCs/>
         </w:rPr>
-        <w:t>-- ============================================================</w:t>
-      </w:r>
-    </w:p>
-    <w:p>
-      <w:pPr>
+      </w:pPr>
+      <w:r>
         <w:rPr>
           <w:b/>
           <w:bCs/>
         </w:rPr>
-      </w:pPr>
-      <w:r>
+        <w:t>Final Database Statistics</w:t>
+      </w:r>
+    </w:p>
+    <w:tbl>
+      <w:tblPr>
+        <w:tblW w:w="0" w:type="auto"/>
+        <w:tblCellSpacing w:w="15" w:type="dxa"/>
+        <w:tblCellMar>
+          <w:top w:w="15" w:type="dxa"/>
+          <w:left w:w="15" w:type="dxa"/>
+          <w:bottom w:w="15" w:type="dxa"/>
+          <w:right w:w="15" w:type="dxa"/>
+        </w:tblCellMar>
+        <w:tblLook w:val="04A0" w:firstRow="1" w:lastRow="0" w:firstColumn="1" w:lastColumn="0" w:noHBand="0" w:noVBand="1"/>
+      </w:tblPr>
+      <w:tblGrid>
+        <w:gridCol w:w="1887"/>
+        <w:gridCol w:w="2272"/>
+      </w:tblGrid>
+      <w:tr>
+        <w:trPr>
+          <w:tblHeader/>
+          <w:tblCellSpacing w:w="15" w:type="dxa"/>
+        </w:trPr>
+        <w:tc>
+          <w:tcPr>
+            <w:tcW w:w="0" w:type="auto"/>
+            <w:vAlign w:val="center"/>
+            <w:hideMark/>
+          </w:tcPr>
+          <w:p>
+            <w:r>
+              <w:t>Component</w:t>
+            </w:r>
+          </w:p>
+        </w:tc>
+        <w:tc>
+          <w:tcPr>
+            <w:tcW w:w="0" w:type="auto"/>
+            <w:vAlign w:val="center"/>
+            <w:hideMark/>
+          </w:tcPr>
+          <w:p>
+            <w:r>
+              <w:t>Count</w:t>
+            </w:r>
+          </w:p>
+        </w:tc>
+      </w:tr>
+      <w:tr>
+        <w:trPr>
+          <w:tblCellSpacing w:w="15" w:type="dxa"/>
+        </w:trPr>
+        <w:tc>
+          <w:tcPr>
+            <w:tcW w:w="0" w:type="auto"/>
+            <w:vAlign w:val="center"/>
+            <w:hideMark/>
+          </w:tcPr>
+          <w:p>
+            <w:r>
+              <w:t>Database Tables</w:t>
+            </w:r>
+          </w:p>
+        </w:tc>
+        <w:tc>
+          <w:tcPr>
+            <w:tcW w:w="0" w:type="auto"/>
+            <w:vAlign w:val="center"/>
+            <w:hideMark/>
+          </w:tcPr>
+          <w:p>
+            <w:r>
+              <w:t>4</w:t>
+            </w:r>
+            <w:r>
+              <w:t>4</w:t>
+            </w:r>
+          </w:p>
+        </w:tc>
+      </w:tr>
+      <w:tr>
+        <w:trPr>
+          <w:tblCellSpacing w:w="15" w:type="dxa"/>
+        </w:trPr>
+        <w:tc>
+          <w:tcPr>
+            <w:tcW w:w="0" w:type="auto"/>
+            <w:vAlign w:val="center"/>
+            <w:hideMark/>
+          </w:tcPr>
+          <w:p>
+            <w:r>
+              <w:t>Lookup Tables</w:t>
+            </w:r>
+          </w:p>
+        </w:tc>
+        <w:tc>
+          <w:tcPr>
+            <w:tcW w:w="0" w:type="auto"/>
+            <w:vAlign w:val="center"/>
+            <w:hideMark/>
+          </w:tcPr>
+          <w:p>
+            <w:r>
+              <w:t>15</w:t>
+            </w:r>
+          </w:p>
+        </w:tc>
+      </w:tr>
+      <w:tr>
+        <w:trPr>
+          <w:tblCellSpacing w:w="15" w:type="dxa"/>
+        </w:trPr>
+        <w:tc>
+          <w:tcPr>
+            <w:tcW w:w="0" w:type="auto"/>
+            <w:vAlign w:val="center"/>
+            <w:hideMark/>
+          </w:tcPr>
+          <w:p>
+            <w:r>
+              <w:t>Business Modules</w:t>
+            </w:r>
+          </w:p>
+        </w:tc>
+        <w:tc>
+          <w:tcPr>
+            <w:tcW w:w="0" w:type="auto"/>
+            <w:vAlign w:val="center"/>
+            <w:hideMark/>
+          </w:tcPr>
+          <w:p>
+            <w:r>
+              <w:t>13</w:t>
+            </w:r>
+          </w:p>
+        </w:tc>
+      </w:tr>
+      <w:tr>
+        <w:trPr>
+          <w:tblCellSpacing w:w="15" w:type="dxa"/>
+        </w:trPr>
+        <w:tc>
+          <w:tcPr>
+            <w:tcW w:w="0" w:type="auto"/>
+            <w:vAlign w:val="center"/>
+            <w:hideMark/>
+          </w:tcPr>
+          <w:p>
+            <w:r>
+              <w:t>System Modules</w:t>
+            </w:r>
+          </w:p>
+        </w:tc>
+        <w:tc>
+          <w:tcPr>
+            <w:tcW w:w="0" w:type="auto"/>
+            <w:vAlign w:val="center"/>
+            <w:hideMark/>
+          </w:tcPr>
+          <w:p>
+            <w:r>
+              <w:t xml:space="preserve">2 (settings, </w:t>
+            </w:r>
+            <w:proofErr w:type="spellStart"/>
+            <w:r>
+              <w:t>audit_logs</w:t>
+            </w:r>
+            <w:proofErr w:type="spellEnd"/>
+            <w:r>
+              <w:t>)</w:t>
+            </w:r>
+          </w:p>
+        </w:tc>
+      </w:tr>
+      <w:tr>
+        <w:trPr>
+          <w:tblCellSpacing w:w="15" w:type="dxa"/>
+        </w:trPr>
+        <w:tc>
+          <w:tcPr>
+            <w:tcW w:w="0" w:type="auto"/>
+            <w:vAlign w:val="center"/>
+            <w:hideMark/>
+          </w:tcPr>
+          <w:p>
+            <w:r>
+              <w:t>Database Function</w:t>
+            </w:r>
+          </w:p>
+        </w:tc>
+        <w:tc>
+          <w:tcPr>
+            <w:tcW w:w="0" w:type="auto"/>
+            <w:vAlign w:val="center"/>
+            <w:hideMark/>
+          </w:tcPr>
+          <w:p>
+            <w:r>
+              <w:t>1</w:t>
+            </w:r>
+          </w:p>
+        </w:tc>
+      </w:tr>
+      <w:tr>
+        <w:trPr>
+          <w:tblCellSpacing w:w="15" w:type="dxa"/>
+        </w:trPr>
+        <w:tc>
+          <w:tcPr>
+            <w:tcW w:w="0" w:type="auto"/>
+            <w:vAlign w:val="center"/>
+            <w:hideMark/>
+          </w:tcPr>
+          <w:p>
+            <w:r>
+              <w:t>Database Views</w:t>
+            </w:r>
+          </w:p>
+        </w:tc>
+        <w:tc>
+          <w:tcPr>
+            <w:tcW w:w="0" w:type="auto"/>
+            <w:vAlign w:val="center"/>
+            <w:hideMark/>
+          </w:tcPr>
+          <w:p>
+            <w:r>
+              <w:t>6</w:t>
+            </w:r>
+          </w:p>
+        </w:tc>
+      </w:tr>
+      <w:tr>
+        <w:trPr>
+          <w:tblCellSpacing w:w="15" w:type="dxa"/>
+        </w:trPr>
+        <w:tc>
+          <w:tcPr>
+            <w:tcW w:w="0" w:type="auto"/>
+            <w:vAlign w:val="center"/>
+            <w:hideMark/>
+          </w:tcPr>
+          <w:p>
+            <w:r>
+              <w:t>Triggers</w:t>
+            </w:r>
+          </w:p>
+        </w:tc>
+        <w:tc>
+          <w:tcPr>
+            <w:tcW w:w="0" w:type="auto"/>
+            <w:vAlign w:val="center"/>
+            <w:hideMark/>
+          </w:tcPr>
+          <w:p>
+            <w:r>
+              <w:t>43+</w:t>
+            </w:r>
+          </w:p>
+        </w:tc>
+      </w:tr>
+      <w:tr>
+        <w:trPr>
+          <w:tblCellSpacing w:w="15" w:type="dxa"/>
+        </w:trPr>
+        <w:tc>
+          <w:tcPr>
+            <w:tcW w:w="0" w:type="auto"/>
+            <w:vAlign w:val="center"/>
+            <w:hideMark/>
+          </w:tcPr>
+          <w:p>
+            <w:r>
+              <w:t>Indexes</w:t>
+            </w:r>
+          </w:p>
+        </w:tc>
+        <w:tc>
+          <w:tcPr>
+            <w:tcW w:w="0" w:type="auto"/>
+            <w:vAlign w:val="center"/>
+            <w:hideMark/>
+          </w:tcPr>
+          <w:p>
+            <w:r>
+              <w:t>100+</w:t>
+            </w:r>
+          </w:p>
+        </w:tc>
+      </w:tr>
+      <w:tr>
+        <w:trPr>
+          <w:tblCellSpacing w:w="15" w:type="dxa"/>
+        </w:trPr>
+        <w:tc>
+          <w:tcPr>
+            <w:tcW w:w="0" w:type="auto"/>
+            <w:vAlign w:val="center"/>
+          </w:tcPr>
+          <w:p/>
+        </w:tc>
+        <w:tc>
+          <w:tcPr>
+            <w:tcW w:w="0" w:type="auto"/>
+            <w:vAlign w:val="center"/>
+          </w:tcPr>
+          <w:p/>
+        </w:tc>
+      </w:tr>
+    </w:tbl>
+    <w:p>
+      <w:pPr>
         <w:rPr>
           <w:b/>
           <w:bCs/>
         </w:rPr>
-        <w:t>-- Project      : NHPC Website</w:t>
-      </w:r>
+      </w:pPr>
     </w:p>
     <w:p>
       <w:pPr>
@@ -3363,1587 +4466,110 @@
           <w:b/>
           <w:bCs/>
         </w:rPr>
-        <w:t>-- File         : 04_operational_power_stations.sql</w:t>
-      </w:r>
-    </w:p>
-    <w:p>
-      <w:pPr>
+        <w:lastRenderedPageBreak/>
+        <w:t xml:space="preserve">workflow </w:t>
+      </w:r>
+      <w:r>
         <w:rPr>
           <w:b/>
           <w:bCs/>
         </w:rPr>
-      </w:pPr>
-      <w:r>
+        <w:t>is</w:t>
+      </w:r>
+    </w:p>
+    <w:p>
+      <w:pPr>
         <w:rPr>
           <w:b/>
           <w:bCs/>
         </w:rPr>
-        <w:t>-- Module       : Operational Power Stations</w:t>
-      </w:r>
-    </w:p>
-    <w:p>
-      <w:pPr>
+      </w:pPr>
+      <w:r>
+        <w:t>Database</w:t>
+      </w:r>
+      <w:r>
+        <w:br/>
+        <w:t xml:space="preserve">        ↓</w:t>
+      </w:r>
+      <w:r>
+        <w:br/>
+      </w:r>
+      <w:proofErr w:type="spellStart"/>
+      <w:r>
+        <w:t>db</w:t>
+      </w:r>
+      <w:proofErr w:type="spellEnd"/>
+      <w:r>
+        <w:t xml:space="preserve"> pull</w:t>
+      </w:r>
+      <w:r>
+        <w:br/>
+        <w:t xml:space="preserve">        ↓</w:t>
+      </w:r>
+      <w:r>
+        <w:br/>
+      </w:r>
+      <w:proofErr w:type="spellStart"/>
+      <w:proofErr w:type="gramStart"/>
+      <w:r>
+        <w:t>schema.prisma</w:t>
+      </w:r>
+      <w:proofErr w:type="spellEnd"/>
+      <w:proofErr w:type="gramEnd"/>
+      <w:r>
+        <w:t xml:space="preserve"> (generated)</w:t>
+      </w:r>
+      <w:r>
+        <w:br/>
+        <w:t xml:space="preserve">        ↓</w:t>
+      </w:r>
+      <w:r>
+        <w:br/>
+      </w:r>
+      <w:proofErr w:type="spellStart"/>
+      <w:r>
+        <w:t>prisma</w:t>
+      </w:r>
+      <w:proofErr w:type="spellEnd"/>
+      <w:r>
+        <w:t xml:space="preserve"> generate</w:t>
+      </w:r>
+      <w:r>
+        <w:br/>
+        <w:t xml:space="preserve">        ↓</w:t>
+      </w:r>
+      <w:r>
+        <w:br/>
+        <w:t>Repositories</w:t>
+      </w:r>
+      <w:r>
+        <w:br/>
+        <w:t xml:space="preserve">        ↓</w:t>
+      </w:r>
+      <w:r>
+        <w:br/>
+        <w:t>Services</w:t>
+      </w:r>
+      <w:r>
+        <w:br/>
+        <w:t xml:space="preserve">        ↓</w:t>
+      </w:r>
+      <w:r>
         <w:rPr>
           <w:b/>
           <w:bCs/>
         </w:rPr>
-      </w:pPr>
-      <w:r>
+        <w:br/>
+        <w:t>Controllers</w:t>
+      </w:r>
+    </w:p>
+    <w:p>
+      <w:pPr>
         <w:rPr>
           <w:b/>
           <w:bCs/>
         </w:rPr>
-        <w:t>-- Description  : Operational generating stations of NHPC</w:t>
-      </w:r>
-    </w:p>
-    <w:p>
-      <w:pPr>
-        <w:rPr>
-          <w:b/>
-          <w:bCs/>
-        </w:rPr>
       </w:pPr>
-      <w:r>
-        <w:rPr>
-          <w:b/>
-          <w:bCs/>
-        </w:rPr>
-        <w:t>-- Database     : PostgreSQL 18+</w:t>
-      </w:r>
-    </w:p>
-    <w:p>
-      <w:pPr>
-        <w:rPr>
-          <w:b/>
-          <w:bCs/>
-        </w:rPr>
-      </w:pPr>
-      <w:r>
-        <w:rPr>
-          <w:b/>
-          <w:bCs/>
-        </w:rPr>
-        <w:t>-- ============================================================</w:t>
-      </w:r>
-    </w:p>
-    <w:p>
-      <w:pPr>
-        <w:rPr>
-          <w:b/>
-          <w:bCs/>
-        </w:rPr>
-      </w:pPr>
-    </w:p>
-    <w:p>
-      <w:pPr>
-        <w:rPr>
-          <w:b/>
-          <w:bCs/>
-        </w:rPr>
-      </w:pPr>
-      <w:r>
-        <w:rPr>
-          <w:b/>
-          <w:bCs/>
-        </w:rPr>
-        <w:t>SET TIME ZONE 'UTC';</w:t>
-      </w:r>
-    </w:p>
-    <w:p>
-      <w:pPr>
-        <w:rPr>
-          <w:b/>
-          <w:bCs/>
-        </w:rPr>
-      </w:pPr>
-    </w:p>
-    <w:p>
-      <w:pPr>
-        <w:rPr>
-          <w:b/>
-          <w:bCs/>
-        </w:rPr>
-      </w:pPr>
-      <w:r>
-        <w:rPr>
-          <w:b/>
-          <w:bCs/>
-        </w:rPr>
-        <w:t xml:space="preserve">CREATE TABLE </w:t>
-      </w:r>
-      <w:proofErr w:type="spellStart"/>
-      <w:r>
-        <w:rPr>
-          <w:b/>
-          <w:bCs/>
-        </w:rPr>
-        <w:t>operational_power_stations</w:t>
-      </w:r>
-      <w:proofErr w:type="spellEnd"/>
-      <w:r>
-        <w:rPr>
-          <w:b/>
-          <w:bCs/>
-        </w:rPr>
-        <w:t xml:space="preserve"> (</w:t>
-      </w:r>
-    </w:p>
-    <w:p>
-      <w:pPr>
-        <w:rPr>
-          <w:b/>
-          <w:bCs/>
-        </w:rPr>
-      </w:pPr>
-    </w:p>
-    <w:p>
-      <w:pPr>
-        <w:rPr>
-          <w:b/>
-          <w:bCs/>
-        </w:rPr>
-      </w:pPr>
-      <w:r>
-        <w:rPr>
-          <w:b/>
-          <w:bCs/>
-        </w:rPr>
-        <w:t xml:space="preserve">    id BIGINT GENERATED BY DEFAULT AS IDENTITY,</w:t>
-      </w:r>
-    </w:p>
-    <w:p>
-      <w:pPr>
-        <w:rPr>
-          <w:b/>
-          <w:bCs/>
-        </w:rPr>
-      </w:pPr>
-    </w:p>
-    <w:p>
-      <w:pPr>
-        <w:rPr>
-          <w:b/>
-          <w:bCs/>
-        </w:rPr>
-      </w:pPr>
-      <w:r>
-        <w:rPr>
-          <w:b/>
-          <w:bCs/>
-        </w:rPr>
-        <w:t xml:space="preserve">    name VARCHAR(200) NOT NULL,</w:t>
-      </w:r>
-    </w:p>
-    <w:p>
-      <w:pPr>
-        <w:rPr>
-          <w:b/>
-          <w:bCs/>
-        </w:rPr>
-      </w:pPr>
-    </w:p>
-    <w:p>
-      <w:pPr>
-        <w:rPr>
-          <w:b/>
-          <w:bCs/>
-        </w:rPr>
-      </w:pPr>
-      <w:r>
-        <w:rPr>
-          <w:b/>
-          <w:bCs/>
-        </w:rPr>
-        <w:lastRenderedPageBreak/>
-        <w:t xml:space="preserve">    slug VARCHAR(250) NOT NULL,</w:t>
-      </w:r>
-    </w:p>
-    <w:p>
-      <w:pPr>
-        <w:rPr>
-          <w:b/>
-          <w:bCs/>
-        </w:rPr>
-      </w:pPr>
-    </w:p>
-    <w:p>
-      <w:pPr>
-        <w:rPr>
-          <w:b/>
-          <w:bCs/>
-        </w:rPr>
-      </w:pPr>
-      <w:r>
-        <w:rPr>
-          <w:b/>
-          <w:bCs/>
-        </w:rPr>
-        <w:t xml:space="preserve">    </w:t>
-      </w:r>
-      <w:proofErr w:type="spellStart"/>
-      <w:r>
-        <w:rPr>
-          <w:b/>
-          <w:bCs/>
-        </w:rPr>
-        <w:t>state_id</w:t>
-      </w:r>
-      <w:proofErr w:type="spellEnd"/>
-      <w:r>
-        <w:rPr>
-          <w:b/>
-          <w:bCs/>
-        </w:rPr>
-        <w:t xml:space="preserve"> BIGINT NOT NULL,</w:t>
-      </w:r>
-    </w:p>
-    <w:p>
-      <w:pPr>
-        <w:rPr>
-          <w:b/>
-          <w:bCs/>
-        </w:rPr>
-      </w:pPr>
-    </w:p>
-    <w:p>
-      <w:pPr>
-        <w:rPr>
-          <w:b/>
-          <w:bCs/>
-        </w:rPr>
-      </w:pPr>
-      <w:r>
-        <w:rPr>
-          <w:b/>
-          <w:bCs/>
-        </w:rPr>
-        <w:t xml:space="preserve">    </w:t>
-      </w:r>
-      <w:proofErr w:type="spellStart"/>
-      <w:r>
-        <w:rPr>
-          <w:b/>
-          <w:bCs/>
-        </w:rPr>
-        <w:t>project_type_id</w:t>
-      </w:r>
-      <w:proofErr w:type="spellEnd"/>
-      <w:r>
-        <w:rPr>
-          <w:b/>
-          <w:bCs/>
-        </w:rPr>
-        <w:t xml:space="preserve"> BIGINT NOT NULL,</w:t>
-      </w:r>
-    </w:p>
-    <w:p>
-      <w:pPr>
-        <w:rPr>
-          <w:b/>
-          <w:bCs/>
-        </w:rPr>
-      </w:pPr>
-    </w:p>
-    <w:p>
-      <w:pPr>
-        <w:rPr>
-          <w:b/>
-          <w:bCs/>
-        </w:rPr>
-      </w:pPr>
-      <w:r>
-        <w:rPr>
-          <w:b/>
-          <w:bCs/>
-        </w:rPr>
-        <w:t xml:space="preserve">    </w:t>
-      </w:r>
-      <w:proofErr w:type="spellStart"/>
-      <w:r>
-        <w:rPr>
-          <w:b/>
-          <w:bCs/>
-        </w:rPr>
-        <w:t>installed_capacity</w:t>
-      </w:r>
-      <w:proofErr w:type="spellEnd"/>
-      <w:r>
-        <w:rPr>
-          <w:b/>
-          <w:bCs/>
-        </w:rPr>
-        <w:t xml:space="preserve"> NUMERIC(10,2) NOT NULL,</w:t>
-      </w:r>
-    </w:p>
-    <w:p>
-      <w:pPr>
-        <w:rPr>
-          <w:b/>
-          <w:bCs/>
-        </w:rPr>
-      </w:pPr>
-    </w:p>
-    <w:p>
-      <w:pPr>
-        <w:rPr>
-          <w:b/>
-          <w:bCs/>
-        </w:rPr>
-      </w:pPr>
-      <w:r>
-        <w:rPr>
-          <w:b/>
-          <w:bCs/>
-        </w:rPr>
-        <w:t xml:space="preserve">    </w:t>
-      </w:r>
-      <w:proofErr w:type="spellStart"/>
-      <w:r>
-        <w:rPr>
-          <w:b/>
-          <w:bCs/>
-        </w:rPr>
-        <w:t>capacity_unit_id</w:t>
-      </w:r>
-      <w:proofErr w:type="spellEnd"/>
-      <w:r>
-        <w:rPr>
-          <w:b/>
-          <w:bCs/>
-        </w:rPr>
-        <w:t xml:space="preserve"> BIGINT NOT NULL,</w:t>
-      </w:r>
-    </w:p>
-    <w:p>
-      <w:pPr>
-        <w:rPr>
-          <w:b/>
-          <w:bCs/>
-        </w:rPr>
-      </w:pPr>
-    </w:p>
-    <w:p>
-      <w:pPr>
-        <w:rPr>
-          <w:b/>
-          <w:bCs/>
-        </w:rPr>
-      </w:pPr>
-      <w:r>
-        <w:rPr>
-          <w:b/>
-          <w:bCs/>
-        </w:rPr>
-        <w:t xml:space="preserve">    </w:t>
-      </w:r>
-      <w:proofErr w:type="spellStart"/>
-      <w:r>
-        <w:rPr>
-          <w:b/>
-          <w:bCs/>
-        </w:rPr>
-        <w:t>commissioned_on</w:t>
-      </w:r>
-      <w:proofErr w:type="spellEnd"/>
-      <w:r>
-        <w:rPr>
-          <w:b/>
-          <w:bCs/>
-        </w:rPr>
-        <w:t xml:space="preserve"> DATE,</w:t>
-      </w:r>
-    </w:p>
-    <w:p>
-      <w:pPr>
-        <w:rPr>
-          <w:b/>
-          <w:bCs/>
-        </w:rPr>
-      </w:pPr>
-    </w:p>
-    <w:p>
-      <w:pPr>
-        <w:rPr>
-          <w:b/>
-          <w:bCs/>
-        </w:rPr>
-      </w:pPr>
-      <w:r>
-        <w:rPr>
-          <w:b/>
-          <w:bCs/>
-        </w:rPr>
-        <w:t xml:space="preserve">    latitude DECIMAL(10,7),</w:t>
-      </w:r>
-    </w:p>
-    <w:p>
-      <w:pPr>
-        <w:rPr>
-          <w:b/>
-          <w:bCs/>
-        </w:rPr>
-      </w:pPr>
-    </w:p>
-    <w:p>
-      <w:pPr>
-        <w:rPr>
-          <w:b/>
-          <w:bCs/>
-        </w:rPr>
-      </w:pPr>
-      <w:r>
-        <w:rPr>
-          <w:b/>
-          <w:bCs/>
-        </w:rPr>
-        <w:t xml:space="preserve">    longitude DECIMAL(10,7),</w:t>
-      </w:r>
-    </w:p>
-    <w:p>
-      <w:pPr>
-        <w:rPr>
-          <w:b/>
-          <w:bCs/>
-        </w:rPr>
-      </w:pPr>
-    </w:p>
-    <w:p>
-      <w:pPr>
-        <w:rPr>
-          <w:b/>
-          <w:bCs/>
-        </w:rPr>
-      </w:pPr>
-      <w:r>
-        <w:rPr>
-          <w:b/>
-          <w:bCs/>
-        </w:rPr>
-        <w:t xml:space="preserve">    description TEXT,</w:t>
-      </w:r>
-    </w:p>
-    <w:p>
-      <w:pPr>
-        <w:rPr>
-          <w:b/>
-          <w:bCs/>
-        </w:rPr>
-      </w:pPr>
-    </w:p>
-    <w:p>
-      <w:pPr>
-        <w:rPr>
-          <w:b/>
-          <w:bCs/>
-        </w:rPr>
-      </w:pPr>
-      <w:r>
-        <w:rPr>
-          <w:b/>
-          <w:bCs/>
-        </w:rPr>
-        <w:t xml:space="preserve">    </w:t>
-      </w:r>
-      <w:proofErr w:type="spellStart"/>
-      <w:r>
-        <w:rPr>
-          <w:b/>
-          <w:bCs/>
-        </w:rPr>
-        <w:t>is_featured</w:t>
-      </w:r>
-      <w:proofErr w:type="spellEnd"/>
-      <w:r>
-        <w:rPr>
-          <w:b/>
-          <w:bCs/>
-        </w:rPr>
-        <w:t xml:space="preserve"> BOOLEAN NOT NULL DEFAULT FALSE,</w:t>
-      </w:r>
-    </w:p>
-    <w:p>
-      <w:pPr>
-        <w:rPr>
-          <w:b/>
-          <w:bCs/>
-        </w:rPr>
-      </w:pPr>
-    </w:p>
-    <w:p>
-      <w:pPr>
-        <w:rPr>
-          <w:b/>
-          <w:bCs/>
-        </w:rPr>
-      </w:pPr>
-      <w:r>
-        <w:rPr>
-          <w:b/>
-          <w:bCs/>
-        </w:rPr>
-        <w:t xml:space="preserve">    </w:t>
-      </w:r>
-      <w:proofErr w:type="spellStart"/>
-      <w:r>
-        <w:rPr>
-          <w:b/>
-          <w:bCs/>
-        </w:rPr>
-        <w:t>display_order</w:t>
-      </w:r>
-      <w:proofErr w:type="spellEnd"/>
-      <w:r>
-        <w:rPr>
-          <w:b/>
-          <w:bCs/>
-        </w:rPr>
-        <w:t xml:space="preserve"> INTEGER NOT NULL DEFAULT 1,</w:t>
-      </w:r>
-    </w:p>
-    <w:p>
-      <w:pPr>
-        <w:rPr>
-          <w:b/>
-          <w:bCs/>
-        </w:rPr>
-      </w:pPr>
-    </w:p>
-    <w:p>
-      <w:pPr>
-        <w:rPr>
-          <w:b/>
-          <w:bCs/>
-        </w:rPr>
-      </w:pPr>
-      <w:r>
-        <w:rPr>
-          <w:b/>
-          <w:bCs/>
-        </w:rPr>
-        <w:t xml:space="preserve">    </w:t>
-      </w:r>
-      <w:proofErr w:type="spellStart"/>
-      <w:r>
-        <w:rPr>
-          <w:b/>
-          <w:bCs/>
-        </w:rPr>
-        <w:t>is_active</w:t>
-      </w:r>
-      <w:proofErr w:type="spellEnd"/>
-      <w:r>
-        <w:rPr>
-          <w:b/>
-          <w:bCs/>
-        </w:rPr>
-        <w:t xml:space="preserve"> BOOLEAN NOT NULL DEFAULT TRUE,</w:t>
-      </w:r>
-    </w:p>
-    <w:p>
-      <w:pPr>
-        <w:rPr>
-          <w:b/>
-          <w:bCs/>
-        </w:rPr>
-      </w:pPr>
-    </w:p>
-    <w:p>
-      <w:pPr>
-        <w:rPr>
-          <w:b/>
-          <w:bCs/>
-        </w:rPr>
-      </w:pPr>
-      <w:r>
-        <w:rPr>
-          <w:b/>
-          <w:bCs/>
-        </w:rPr>
-        <w:t xml:space="preserve">    </w:t>
-      </w:r>
-      <w:proofErr w:type="spellStart"/>
-      <w:r>
-        <w:rPr>
-          <w:b/>
-          <w:bCs/>
-        </w:rPr>
-        <w:t>created_at</w:t>
-      </w:r>
-      <w:proofErr w:type="spellEnd"/>
-      <w:r>
-        <w:rPr>
-          <w:b/>
-          <w:bCs/>
-        </w:rPr>
-        <w:t xml:space="preserve"> TIMESTAMPTZ NOT NULL DEFAULT CURRENT_TIMESTAMP,</w:t>
-      </w:r>
-    </w:p>
-    <w:p>
-      <w:pPr>
-        <w:rPr>
-          <w:b/>
-          <w:bCs/>
-        </w:rPr>
-      </w:pPr>
-    </w:p>
-    <w:p>
-      <w:pPr>
-        <w:rPr>
-          <w:b/>
-          <w:bCs/>
-        </w:rPr>
-      </w:pPr>
-      <w:r>
-        <w:rPr>
-          <w:b/>
-          <w:bCs/>
-        </w:rPr>
-        <w:t xml:space="preserve">    </w:t>
-      </w:r>
-      <w:proofErr w:type="spellStart"/>
-      <w:r>
-        <w:rPr>
-          <w:b/>
-          <w:bCs/>
-        </w:rPr>
-        <w:t>updated_at</w:t>
-      </w:r>
-      <w:proofErr w:type="spellEnd"/>
-      <w:r>
-        <w:rPr>
-          <w:b/>
-          <w:bCs/>
-        </w:rPr>
-        <w:t xml:space="preserve"> TIMESTAMPTZ NOT NULL DEFAULT CURRENT_TIMESTAMP,</w:t>
-      </w:r>
-    </w:p>
-    <w:p>
-      <w:pPr>
-        <w:rPr>
-          <w:b/>
-          <w:bCs/>
-        </w:rPr>
-      </w:pPr>
-    </w:p>
-    <w:p>
-      <w:pPr>
-        <w:rPr>
-          <w:b/>
-          <w:bCs/>
-        </w:rPr>
-      </w:pPr>
-      <w:r>
-        <w:rPr>
-          <w:b/>
-          <w:bCs/>
-        </w:rPr>
-        <w:lastRenderedPageBreak/>
-        <w:t xml:space="preserve">    CONSTRAINT </w:t>
-      </w:r>
-      <w:proofErr w:type="spellStart"/>
-      <w:r>
-        <w:rPr>
-          <w:b/>
-          <w:bCs/>
-        </w:rPr>
-        <w:t>pk_operational_power_stations</w:t>
-      </w:r>
-      <w:proofErr w:type="spellEnd"/>
-    </w:p>
-    <w:p>
-      <w:pPr>
-        <w:rPr>
-          <w:b/>
-          <w:bCs/>
-        </w:rPr>
-      </w:pPr>
-      <w:r>
-        <w:rPr>
-          <w:b/>
-          <w:bCs/>
-        </w:rPr>
-        <w:t xml:space="preserve">        PRIMARY KEY (id),</w:t>
-      </w:r>
-    </w:p>
-    <w:p>
-      <w:pPr>
-        <w:rPr>
-          <w:b/>
-          <w:bCs/>
-        </w:rPr>
-      </w:pPr>
-    </w:p>
-    <w:p>
-      <w:pPr>
-        <w:rPr>
-          <w:b/>
-          <w:bCs/>
-        </w:rPr>
-      </w:pPr>
-      <w:r>
-        <w:rPr>
-          <w:b/>
-          <w:bCs/>
-        </w:rPr>
-        <w:t xml:space="preserve">    CONSTRAINT </w:t>
-      </w:r>
-      <w:proofErr w:type="spellStart"/>
-      <w:r>
-        <w:rPr>
-          <w:b/>
-          <w:bCs/>
-        </w:rPr>
-        <w:t>uq_operational_power_stations_slug</w:t>
-      </w:r>
-      <w:proofErr w:type="spellEnd"/>
-    </w:p>
-    <w:p>
-      <w:pPr>
-        <w:rPr>
-          <w:b/>
-          <w:bCs/>
-        </w:rPr>
-      </w:pPr>
-      <w:r>
-        <w:rPr>
-          <w:b/>
-          <w:bCs/>
-        </w:rPr>
-        <w:t xml:space="preserve">        UNIQUE (slug),</w:t>
-      </w:r>
-    </w:p>
-    <w:p>
-      <w:pPr>
-        <w:rPr>
-          <w:b/>
-          <w:bCs/>
-        </w:rPr>
-      </w:pPr>
-    </w:p>
-    <w:p>
-      <w:pPr>
-        <w:rPr>
-          <w:b/>
-          <w:bCs/>
-        </w:rPr>
-      </w:pPr>
-      <w:r>
-        <w:rPr>
-          <w:b/>
-          <w:bCs/>
-        </w:rPr>
-        <w:t xml:space="preserve">    CONSTRAINT </w:t>
-      </w:r>
-      <w:proofErr w:type="spellStart"/>
-      <w:r>
-        <w:rPr>
-          <w:b/>
-          <w:bCs/>
-        </w:rPr>
-        <w:t>fk_ops_state</w:t>
-      </w:r>
-      <w:proofErr w:type="spellEnd"/>
-    </w:p>
-    <w:p>
-      <w:pPr>
-        <w:rPr>
-          <w:b/>
-          <w:bCs/>
-        </w:rPr>
-      </w:pPr>
-      <w:r>
-        <w:rPr>
-          <w:b/>
-          <w:bCs/>
-        </w:rPr>
-        <w:t xml:space="preserve">        FOREIGN KEY (</w:t>
-      </w:r>
-      <w:proofErr w:type="spellStart"/>
-      <w:r>
-        <w:rPr>
-          <w:b/>
-          <w:bCs/>
-        </w:rPr>
-        <w:t>state_id</w:t>
-      </w:r>
-      <w:proofErr w:type="spellEnd"/>
-      <w:r>
-        <w:rPr>
-          <w:b/>
-          <w:bCs/>
-        </w:rPr>
-        <w:t>)</w:t>
-      </w:r>
-    </w:p>
-    <w:p>
-      <w:pPr>
-        <w:rPr>
-          <w:b/>
-          <w:bCs/>
-        </w:rPr>
-      </w:pPr>
-      <w:r>
-        <w:rPr>
-          <w:b/>
-          <w:bCs/>
-        </w:rPr>
-        <w:t xml:space="preserve">        REFERENCES states(id),</w:t>
-      </w:r>
-    </w:p>
-    <w:p>
-      <w:pPr>
-        <w:rPr>
-          <w:b/>
-          <w:bCs/>
-        </w:rPr>
-      </w:pPr>
-    </w:p>
-    <w:p>
-      <w:pPr>
-        <w:rPr>
-          <w:b/>
-          <w:bCs/>
-        </w:rPr>
-      </w:pPr>
-      <w:r>
-        <w:rPr>
-          <w:b/>
-          <w:bCs/>
-        </w:rPr>
-        <w:t xml:space="preserve">    CONSTRAINT </w:t>
-      </w:r>
-      <w:proofErr w:type="spellStart"/>
-      <w:r>
-        <w:rPr>
-          <w:b/>
-          <w:bCs/>
-        </w:rPr>
-        <w:t>fk_ops_project_type</w:t>
-      </w:r>
-      <w:proofErr w:type="spellEnd"/>
-    </w:p>
-    <w:p>
-      <w:pPr>
-        <w:rPr>
-          <w:b/>
-          <w:bCs/>
-        </w:rPr>
-      </w:pPr>
-      <w:r>
-        <w:rPr>
-          <w:b/>
-          <w:bCs/>
-        </w:rPr>
-        <w:t xml:space="preserve">        FOREIGN KEY (</w:t>
-      </w:r>
-      <w:proofErr w:type="spellStart"/>
-      <w:r>
-        <w:rPr>
-          <w:b/>
-          <w:bCs/>
-        </w:rPr>
-        <w:t>project_type_id</w:t>
-      </w:r>
-      <w:proofErr w:type="spellEnd"/>
-      <w:r>
-        <w:rPr>
-          <w:b/>
-          <w:bCs/>
-        </w:rPr>
-        <w:t>)</w:t>
-      </w:r>
-    </w:p>
-    <w:p>
-      <w:pPr>
-        <w:rPr>
-          <w:b/>
-          <w:bCs/>
-        </w:rPr>
-      </w:pPr>
-      <w:r>
-        <w:rPr>
-          <w:b/>
-          <w:bCs/>
-        </w:rPr>
-        <w:t xml:space="preserve">        REFERENCES </w:t>
-      </w:r>
-      <w:proofErr w:type="spellStart"/>
-      <w:r>
-        <w:rPr>
-          <w:b/>
-          <w:bCs/>
-        </w:rPr>
-        <w:t>project_types</w:t>
-      </w:r>
-      <w:proofErr w:type="spellEnd"/>
-      <w:r>
-        <w:rPr>
-          <w:b/>
-          <w:bCs/>
-        </w:rPr>
-        <w:t>(id),</w:t>
-      </w:r>
-    </w:p>
-    <w:p>
-      <w:pPr>
-        <w:rPr>
-          <w:b/>
-          <w:bCs/>
-        </w:rPr>
-      </w:pPr>
-    </w:p>
-    <w:p>
-      <w:pPr>
-        <w:rPr>
-          <w:b/>
-          <w:bCs/>
-        </w:rPr>
-      </w:pPr>
-      <w:r>
-        <w:rPr>
-          <w:b/>
-          <w:bCs/>
-        </w:rPr>
-        <w:t xml:space="preserve">    CONSTRAINT </w:t>
-      </w:r>
-      <w:proofErr w:type="spellStart"/>
-      <w:r>
-        <w:rPr>
-          <w:b/>
-          <w:bCs/>
-        </w:rPr>
-        <w:t>fk_ops_capacity_unit</w:t>
-      </w:r>
-      <w:proofErr w:type="spellEnd"/>
-    </w:p>
-    <w:p>
-      <w:pPr>
-        <w:rPr>
-          <w:b/>
-          <w:bCs/>
-        </w:rPr>
-      </w:pPr>
-      <w:r>
-        <w:rPr>
-          <w:b/>
-          <w:bCs/>
-        </w:rPr>
-        <w:t xml:space="preserve">        FOREIGN KEY (</w:t>
-      </w:r>
-      <w:proofErr w:type="spellStart"/>
-      <w:r>
-        <w:rPr>
-          <w:b/>
-          <w:bCs/>
-        </w:rPr>
-        <w:t>capacity_unit_id</w:t>
-      </w:r>
-      <w:proofErr w:type="spellEnd"/>
-      <w:r>
-        <w:rPr>
-          <w:b/>
-          <w:bCs/>
-        </w:rPr>
-        <w:t>)</w:t>
-      </w:r>
-    </w:p>
-    <w:p>
-      <w:pPr>
-        <w:rPr>
-          <w:b/>
-          <w:bCs/>
-        </w:rPr>
-      </w:pPr>
-      <w:r>
-        <w:rPr>
-          <w:b/>
-          <w:bCs/>
-        </w:rPr>
-        <w:t xml:space="preserve">        REFERENCES </w:t>
-      </w:r>
-      <w:proofErr w:type="spellStart"/>
-      <w:r>
-        <w:rPr>
-          <w:b/>
-          <w:bCs/>
-        </w:rPr>
-        <w:t>capacity_units</w:t>
-      </w:r>
-      <w:proofErr w:type="spellEnd"/>
-      <w:r>
-        <w:rPr>
-          <w:b/>
-          <w:bCs/>
-        </w:rPr>
-        <w:t>(id),</w:t>
-      </w:r>
-    </w:p>
-    <w:p>
-      <w:pPr>
-        <w:rPr>
-          <w:b/>
-          <w:bCs/>
-        </w:rPr>
-      </w:pPr>
-    </w:p>
-    <w:p>
-      <w:pPr>
-        <w:rPr>
-          <w:b/>
-          <w:bCs/>
-        </w:rPr>
-      </w:pPr>
-      <w:r>
-        <w:rPr>
-          <w:b/>
-          <w:bCs/>
-        </w:rPr>
-        <w:t xml:space="preserve">    CONSTRAINT </w:t>
-      </w:r>
-      <w:proofErr w:type="spellStart"/>
-      <w:r>
-        <w:rPr>
-          <w:b/>
-          <w:bCs/>
-        </w:rPr>
-        <w:t>chk_ops_display_order</w:t>
-      </w:r>
-      <w:proofErr w:type="spellEnd"/>
-    </w:p>
-    <w:p>
-      <w:pPr>
-        <w:rPr>
-          <w:b/>
-          <w:bCs/>
-        </w:rPr>
-      </w:pPr>
-      <w:r>
-        <w:rPr>
-          <w:b/>
-          <w:bCs/>
-        </w:rPr>
-        <w:t xml:space="preserve">        CHECK (</w:t>
-      </w:r>
-      <w:proofErr w:type="spellStart"/>
-      <w:r>
-        <w:rPr>
-          <w:b/>
-          <w:bCs/>
-        </w:rPr>
-        <w:t>display_order</w:t>
-      </w:r>
-      <w:proofErr w:type="spellEnd"/>
-      <w:r>
-        <w:rPr>
-          <w:b/>
-          <w:bCs/>
-        </w:rPr>
-        <w:t xml:space="preserve"> &gt; 0)</w:t>
-      </w:r>
-    </w:p>
-    <w:p>
-      <w:pPr>
-        <w:rPr>
-          <w:b/>
-          <w:bCs/>
-        </w:rPr>
-      </w:pPr>
-    </w:p>
-    <w:p>
-      <w:pPr>
-        <w:rPr>
-          <w:b/>
-          <w:bCs/>
-        </w:rPr>
-      </w:pPr>
-      <w:r>
-        <w:rPr>
-          <w:b/>
-          <w:bCs/>
-        </w:rPr>
-        <w:t>);</w:t>
-      </w:r>
-    </w:p>
-    <w:p>
-      <w:pPr>
-        <w:rPr>
-          <w:b/>
-          <w:bCs/>
-        </w:rPr>
-      </w:pPr>
-    </w:p>
-    <w:p>
-      <w:pPr>
-        <w:rPr>
-          <w:b/>
-          <w:bCs/>
-        </w:rPr>
-      </w:pPr>
-      <w:r>
-        <w:rPr>
-          <w:b/>
-          <w:bCs/>
-        </w:rPr>
-        <w:t xml:space="preserve">CREATE INDEX </w:t>
-      </w:r>
-      <w:proofErr w:type="spellStart"/>
-      <w:r>
-        <w:rPr>
-          <w:b/>
-          <w:bCs/>
-        </w:rPr>
-        <w:t>idx_ops_slug</w:t>
-      </w:r>
-      <w:proofErr w:type="spellEnd"/>
-    </w:p>
-    <w:p>
-      <w:pPr>
-        <w:rPr>
-          <w:b/>
-          <w:bCs/>
-        </w:rPr>
-      </w:pPr>
-      <w:r>
-        <w:rPr>
-          <w:b/>
-          <w:bCs/>
-        </w:rPr>
-        <w:t xml:space="preserve">ON </w:t>
-      </w:r>
-      <w:proofErr w:type="spellStart"/>
-      <w:r>
-        <w:rPr>
-          <w:b/>
-          <w:bCs/>
-        </w:rPr>
-        <w:t>operational_power_stations</w:t>
-      </w:r>
-      <w:proofErr w:type="spellEnd"/>
-      <w:r>
-        <w:rPr>
-          <w:b/>
-          <w:bCs/>
-        </w:rPr>
-        <w:t>(slug);</w:t>
-      </w:r>
-    </w:p>
-    <w:p>
-      <w:pPr>
-        <w:rPr>
-          <w:b/>
-          <w:bCs/>
-        </w:rPr>
-      </w:pPr>
-    </w:p>
-    <w:p>
-      <w:pPr>
-        <w:rPr>
-          <w:b/>
-          <w:bCs/>
-        </w:rPr>
-      </w:pPr>
-      <w:r>
-        <w:rPr>
-          <w:b/>
-          <w:bCs/>
-        </w:rPr>
-        <w:t xml:space="preserve">CREATE INDEX </w:t>
-      </w:r>
-      <w:proofErr w:type="spellStart"/>
-      <w:r>
-        <w:rPr>
-          <w:b/>
-          <w:bCs/>
-        </w:rPr>
-        <w:t>idx_ops_state</w:t>
-      </w:r>
-      <w:proofErr w:type="spellEnd"/>
-    </w:p>
-    <w:p>
-      <w:pPr>
-        <w:rPr>
-          <w:b/>
-          <w:bCs/>
-        </w:rPr>
-      </w:pPr>
-      <w:r>
-        <w:rPr>
-          <w:b/>
-          <w:bCs/>
-        </w:rPr>
-        <w:t xml:space="preserve">ON </w:t>
-      </w:r>
-      <w:proofErr w:type="spellStart"/>
-      <w:r>
-        <w:rPr>
-          <w:b/>
-          <w:bCs/>
-        </w:rPr>
-        <w:t>operational_power_stations</w:t>
-      </w:r>
-      <w:proofErr w:type="spellEnd"/>
-      <w:r>
-        <w:rPr>
-          <w:b/>
-          <w:bCs/>
-        </w:rPr>
-        <w:t>(</w:t>
-      </w:r>
-      <w:proofErr w:type="spellStart"/>
-      <w:r>
-        <w:rPr>
-          <w:b/>
-          <w:bCs/>
-        </w:rPr>
-        <w:t>state_id</w:t>
-      </w:r>
-      <w:proofErr w:type="spellEnd"/>
-      <w:r>
-        <w:rPr>
-          <w:b/>
-          <w:bCs/>
-        </w:rPr>
-        <w:t>);</w:t>
-      </w:r>
-    </w:p>
-    <w:p>
-      <w:pPr>
-        <w:rPr>
-          <w:b/>
-          <w:bCs/>
-        </w:rPr>
-      </w:pPr>
-    </w:p>
-    <w:p>
-      <w:pPr>
-        <w:rPr>
-          <w:b/>
-          <w:bCs/>
-        </w:rPr>
-      </w:pPr>
-      <w:r>
-        <w:rPr>
-          <w:b/>
-          <w:bCs/>
-        </w:rPr>
-        <w:t xml:space="preserve">CREATE INDEX </w:t>
-      </w:r>
-      <w:proofErr w:type="spellStart"/>
-      <w:r>
-        <w:rPr>
-          <w:b/>
-          <w:bCs/>
-        </w:rPr>
-        <w:t>idx_ops_featured</w:t>
-      </w:r>
-      <w:proofErr w:type="spellEnd"/>
-    </w:p>
-    <w:p>
-      <w:pPr>
-        <w:rPr>
-          <w:b/>
-          <w:bCs/>
-        </w:rPr>
-      </w:pPr>
-      <w:r>
-        <w:rPr>
-          <w:b/>
-          <w:bCs/>
-        </w:rPr>
-        <w:t xml:space="preserve">ON </w:t>
-      </w:r>
-      <w:proofErr w:type="spellStart"/>
-      <w:r>
-        <w:rPr>
-          <w:b/>
-          <w:bCs/>
-        </w:rPr>
-        <w:t>operational_power_stations</w:t>
-      </w:r>
-      <w:proofErr w:type="spellEnd"/>
-      <w:r>
-        <w:rPr>
-          <w:b/>
-          <w:bCs/>
-        </w:rPr>
-        <w:t>(</w:t>
-      </w:r>
-      <w:proofErr w:type="spellStart"/>
-      <w:r>
-        <w:rPr>
-          <w:b/>
-          <w:bCs/>
-        </w:rPr>
-        <w:t>is_featured</w:t>
-      </w:r>
-      <w:proofErr w:type="spellEnd"/>
-      <w:r>
-        <w:rPr>
-          <w:b/>
-          <w:bCs/>
-        </w:rPr>
-        <w:t>);</w:t>
-      </w:r>
-    </w:p>
-    <w:p>
-      <w:pPr>
-        <w:rPr>
-          <w:b/>
-          <w:bCs/>
-        </w:rPr>
-      </w:pPr>
-    </w:p>
-    <w:p>
-      <w:pPr>
-        <w:rPr>
-          <w:b/>
-          <w:bCs/>
-        </w:rPr>
-      </w:pPr>
-      <w:r>
-        <w:rPr>
-          <w:b/>
-          <w:bCs/>
-        </w:rPr>
-        <w:t xml:space="preserve">CREATE INDEX </w:t>
-      </w:r>
-      <w:proofErr w:type="spellStart"/>
-      <w:r>
-        <w:rPr>
-          <w:b/>
-          <w:bCs/>
-        </w:rPr>
-        <w:t>idx_ops_active</w:t>
-      </w:r>
-      <w:proofErr w:type="spellEnd"/>
-    </w:p>
-    <w:p>
-      <w:pPr>
-        <w:rPr>
-          <w:b/>
-          <w:bCs/>
-        </w:rPr>
-      </w:pPr>
-      <w:r>
-        <w:rPr>
-          <w:b/>
-          <w:bCs/>
-        </w:rPr>
-        <w:t xml:space="preserve">ON </w:t>
-      </w:r>
-      <w:proofErr w:type="spellStart"/>
-      <w:r>
-        <w:rPr>
-          <w:b/>
-          <w:bCs/>
-        </w:rPr>
-        <w:t>operational_power_stations</w:t>
-      </w:r>
-      <w:proofErr w:type="spellEnd"/>
-      <w:r>
-        <w:rPr>
-          <w:b/>
-          <w:bCs/>
-        </w:rPr>
-        <w:t>(</w:t>
-      </w:r>
-      <w:proofErr w:type="spellStart"/>
-      <w:r>
-        <w:rPr>
-          <w:b/>
-          <w:bCs/>
-        </w:rPr>
-        <w:t>is_active</w:t>
-      </w:r>
-      <w:proofErr w:type="spellEnd"/>
-      <w:r>
-        <w:rPr>
-          <w:b/>
-          <w:bCs/>
-        </w:rPr>
-        <w:t>);</w:t>
-      </w:r>
-    </w:p>
-    <w:p>
-      <w:pPr>
-        <w:rPr>
-          <w:b/>
-          <w:bCs/>
-        </w:rPr>
-      </w:pPr>
-    </w:p>
-    <w:p>
-      <w:pPr>
-        <w:rPr>
-          <w:b/>
-          <w:bCs/>
-        </w:rPr>
-      </w:pPr>
-      <w:r>
-        <w:rPr>
-          <w:b/>
-          <w:bCs/>
-        </w:rPr>
-        <w:t xml:space="preserve">CREATE INDEX </w:t>
-      </w:r>
-      <w:proofErr w:type="spellStart"/>
-      <w:r>
-        <w:rPr>
-          <w:b/>
-          <w:bCs/>
-        </w:rPr>
-        <w:t>idx_ops_display_order</w:t>
-      </w:r>
-      <w:proofErr w:type="spellEnd"/>
-    </w:p>
-    <w:p>
-      <w:pPr>
-        <w:rPr>
-          <w:b/>
-          <w:bCs/>
-        </w:rPr>
-      </w:pPr>
-      <w:r>
-        <w:rPr>
-          <w:b/>
-          <w:bCs/>
-        </w:rPr>
-        <w:t xml:space="preserve">ON </w:t>
-      </w:r>
-      <w:proofErr w:type="spellStart"/>
-      <w:r>
-        <w:rPr>
-          <w:b/>
-          <w:bCs/>
-        </w:rPr>
-        <w:t>operational_power_stations</w:t>
-      </w:r>
-      <w:proofErr w:type="spellEnd"/>
-      <w:r>
-        <w:rPr>
-          <w:b/>
-          <w:bCs/>
-        </w:rPr>
-        <w:t>(</w:t>
-      </w:r>
-      <w:proofErr w:type="spellStart"/>
-      <w:r>
-        <w:rPr>
-          <w:b/>
-          <w:bCs/>
-        </w:rPr>
-        <w:t>display_order</w:t>
-      </w:r>
-      <w:proofErr w:type="spellEnd"/>
-      <w:r>
-        <w:rPr>
-          <w:b/>
-          <w:bCs/>
-        </w:rPr>
-        <w:t>);</w:t>
-      </w:r>
-    </w:p>
-    <w:p>
-      <w:pPr>
-        <w:rPr>
-          <w:b/>
-          <w:bCs/>
-        </w:rPr>
-      </w:pPr>
-    </w:p>
-    <w:p>
-      <w:pPr>
-        <w:rPr>
-          <w:b/>
-          <w:bCs/>
-        </w:rPr>
-      </w:pPr>
-      <w:r>
-        <w:rPr>
-          <w:b/>
-          <w:bCs/>
-        </w:rPr>
-        <w:t xml:space="preserve">CREATE TRIGGER </w:t>
-      </w:r>
-      <w:proofErr w:type="spellStart"/>
-      <w:r>
-        <w:rPr>
-          <w:b/>
-          <w:bCs/>
-        </w:rPr>
-        <w:t>trg_operational_power_stations_updated_at</w:t>
-      </w:r>
-      <w:proofErr w:type="spellEnd"/>
-    </w:p>
-    <w:p>
-      <w:pPr>
-        <w:rPr>
-          <w:b/>
-          <w:bCs/>
-        </w:rPr>
-      </w:pPr>
-      <w:r>
-        <w:rPr>
-          <w:b/>
-          <w:bCs/>
-        </w:rPr>
-        <w:t xml:space="preserve">BEFORE UPDATE ON </w:t>
-      </w:r>
-      <w:proofErr w:type="spellStart"/>
-      <w:r>
-        <w:rPr>
-          <w:b/>
-          <w:bCs/>
-        </w:rPr>
-        <w:t>operational_power_stations</w:t>
-      </w:r>
-      <w:proofErr w:type="spellEnd"/>
-    </w:p>
-    <w:p>
-      <w:pPr>
-        <w:rPr>
-          <w:b/>
-          <w:bCs/>
-        </w:rPr>
-      </w:pPr>
-      <w:r>
-        <w:rPr>
-          <w:b/>
-          <w:bCs/>
-        </w:rPr>
-        <w:t>FOR EACH ROW</w:t>
-      </w:r>
-    </w:p>
-    <w:p>
-      <w:pPr>
-        <w:rPr>
-          <w:b/>
-          <w:bCs/>
-        </w:rPr>
-      </w:pPr>
-      <w:r>
-        <w:rPr>
-          <w:b/>
-          <w:bCs/>
-        </w:rPr>
-        <w:t xml:space="preserve">EXECUTE FUNCTION </w:t>
-      </w:r>
-      <w:proofErr w:type="spellStart"/>
-      <w:r>
-        <w:rPr>
-          <w:b/>
-          <w:bCs/>
-        </w:rPr>
-        <w:t>fn_update_updated_at</w:t>
-      </w:r>
-      <w:proofErr w:type="spellEnd"/>
-      <w:r>
-        <w:rPr>
-          <w:b/>
-          <w:bCs/>
-        </w:rPr>
-        <w:t>();</w:t>
-      </w:r>
     </w:p>
     <w:sectPr>
       <w:pgSz w:w="11906" w:h="16838"/>

</xml_diff>

<commit_message>
Media module implemented and tested
</commit_message>
<xml_diff>
--- a/note.docx
+++ b/note.docx
@@ -200,33 +200,21 @@
     <w:p/>
     <w:p>
       <w:r>
-        <w:t xml:space="preserve">                   </w:t>
-      </w:r>
-      <w:proofErr w:type="gramStart"/>
+        <w:t xml:space="preserve">                   1:N                            </w:t>
+      </w:r>
+      <w:proofErr w:type="spellStart"/>
       <w:r>
         <w:t>1:N</w:t>
       </w:r>
-      <w:proofErr w:type="gramEnd"/>
-      <w:r>
-        <w:t xml:space="preserve">                            </w:t>
+      <w:proofErr w:type="spellEnd"/>
+      <w:r>
+        <w:t xml:space="preserve">                      </w:t>
       </w:r>
       <w:proofErr w:type="spellStart"/>
-      <w:proofErr w:type="gramStart"/>
       <w:r>
         <w:t>1:N</w:t>
       </w:r>
       <w:proofErr w:type="spellEnd"/>
-      <w:proofErr w:type="gramEnd"/>
-      <w:r>
-        <w:t xml:space="preserve">                      </w:t>
-      </w:r>
-      <w:proofErr w:type="spellStart"/>
-      <w:proofErr w:type="gramStart"/>
-      <w:r>
-        <w:t>1:N</w:t>
-      </w:r>
-      <w:proofErr w:type="spellEnd"/>
-      <w:proofErr w:type="gramEnd"/>
     </w:p>
     <w:p>
       <w:r>
@@ -367,37 +355,8 @@
     </w:p>
     <w:p>
       <w:r>
-        <w:t xml:space="preserve">      │1:1          │</w:t>
-      </w:r>
-      <w:proofErr w:type="gramStart"/>
-      <w:r>
-        <w:t>1:N</w:t>
-      </w:r>
-      <w:proofErr w:type="gramEnd"/>
-      <w:r>
-        <w:t xml:space="preserve">             │</w:t>
-      </w:r>
-      <w:proofErr w:type="gramStart"/>
-      <w:r>
-        <w:t>1:N</w:t>
-      </w:r>
-      <w:proofErr w:type="gramEnd"/>
-      <w:r>
-        <w:t xml:space="preserve">             │</w:t>
-      </w:r>
-      <w:proofErr w:type="gramStart"/>
-      <w:r>
-        <w:t>1:N</w:t>
-      </w:r>
-      <w:proofErr w:type="gramEnd"/>
-      <w:r>
-        <w:t xml:space="preserve">        │</w:t>
-      </w:r>
-      <w:proofErr w:type="gramStart"/>
-      <w:r>
-        <w:t>1:N</w:t>
-      </w:r>
-      <w:proofErr w:type="gramEnd"/>
+        <w:t xml:space="preserve">      │1:1          │1:N             │1:N             │1:N        │1:N</w:t>
+      </w:r>
     </w:p>
     <w:p>
       <w:r>
@@ -464,13 +423,8 @@
     </w:p>
     <w:p>
       <w:r>
-        <w:t>│LOCATION    │ │SECTIONS      │ │GALLERY      │ │DOCUMENTS     │ │</w:t>
-      </w:r>
-      <w:proofErr w:type="gramStart"/>
-      <w:r>
-        <w:t>SPECIFICATIONS  │</w:t>
-      </w:r>
-      <w:proofErr w:type="gramEnd"/>
+        <w:t>│LOCATION    │ │SECTIONS      │ │GALLERY      │ │DOCUMENTS     │ │SPECIFICATIONS  │</w:t>
+      </w:r>
     </w:p>
     <w:p>
       <w:r>
@@ -1108,13 +1062,8 @@
             <w:hideMark/>
           </w:tcPr>
           <w:p>
-            <w:proofErr w:type="gramStart"/>
-            <w:r>
-              <w:t>1 :</w:t>
-            </w:r>
-            <w:proofErr w:type="gramEnd"/>
-            <w:r>
-              <w:t xml:space="preserve"> N</w:t>
+            <w:r>
+              <w:t>1 : N</w:t>
             </w:r>
           </w:p>
         </w:tc>
@@ -1154,13 +1103,8 @@
             <w:hideMark/>
           </w:tcPr>
           <w:p>
-            <w:proofErr w:type="gramStart"/>
-            <w:r>
-              <w:t>1 :</w:t>
-            </w:r>
-            <w:proofErr w:type="gramEnd"/>
-            <w:r>
-              <w:t xml:space="preserve"> N</w:t>
+            <w:r>
+              <w:t>1 : N</w:t>
             </w:r>
           </w:p>
         </w:tc>
@@ -1200,13 +1144,8 @@
             <w:hideMark/>
           </w:tcPr>
           <w:p>
-            <w:proofErr w:type="gramStart"/>
-            <w:r>
-              <w:t>1 :</w:t>
-            </w:r>
-            <w:proofErr w:type="gramEnd"/>
-            <w:r>
-              <w:t xml:space="preserve"> N</w:t>
+            <w:r>
+              <w:t>1 : N</w:t>
             </w:r>
           </w:p>
         </w:tc>
@@ -1246,13 +1185,8 @@
             <w:hideMark/>
           </w:tcPr>
           <w:p>
-            <w:proofErr w:type="gramStart"/>
-            <w:r>
-              <w:t>1 :</w:t>
-            </w:r>
-            <w:proofErr w:type="gramEnd"/>
-            <w:r>
-              <w:t xml:space="preserve"> 1</w:t>
+            <w:r>
+              <w:t>1 : 1</w:t>
             </w:r>
           </w:p>
         </w:tc>
@@ -1292,13 +1226,8 @@
             <w:hideMark/>
           </w:tcPr>
           <w:p>
-            <w:proofErr w:type="gramStart"/>
-            <w:r>
-              <w:t>1 :</w:t>
-            </w:r>
-            <w:proofErr w:type="gramEnd"/>
-            <w:r>
-              <w:t xml:space="preserve"> N</w:t>
+            <w:r>
+              <w:t>1 : N</w:t>
             </w:r>
           </w:p>
         </w:tc>
@@ -1338,13 +1267,8 @@
             <w:hideMark/>
           </w:tcPr>
           <w:p>
-            <w:proofErr w:type="gramStart"/>
-            <w:r>
-              <w:t>1 :</w:t>
-            </w:r>
-            <w:proofErr w:type="gramEnd"/>
-            <w:r>
-              <w:t xml:space="preserve"> N</w:t>
+            <w:r>
+              <w:t>1 : N</w:t>
             </w:r>
           </w:p>
         </w:tc>
@@ -1384,13 +1308,8 @@
             <w:hideMark/>
           </w:tcPr>
           <w:p>
-            <w:proofErr w:type="gramStart"/>
-            <w:r>
-              <w:t>1 :</w:t>
-            </w:r>
-            <w:proofErr w:type="gramEnd"/>
-            <w:r>
-              <w:t xml:space="preserve"> N</w:t>
+            <w:r>
+              <w:t>1 : N</w:t>
             </w:r>
           </w:p>
         </w:tc>
@@ -1430,13 +1349,8 @@
             <w:hideMark/>
           </w:tcPr>
           <w:p>
-            <w:proofErr w:type="gramStart"/>
-            <w:r>
-              <w:t>1 :</w:t>
-            </w:r>
-            <w:proofErr w:type="gramEnd"/>
-            <w:r>
-              <w:t xml:space="preserve"> N</w:t>
+            <w:r>
+              <w:t>1 : N</w:t>
             </w:r>
           </w:p>
         </w:tc>
@@ -1476,13 +1390,8 @@
             <w:hideMark/>
           </w:tcPr>
           <w:p>
-            <w:proofErr w:type="gramStart"/>
-            <w:r>
-              <w:t>1 :</w:t>
-            </w:r>
-            <w:proofErr w:type="gramEnd"/>
-            <w:r>
-              <w:t xml:space="preserve"> N</w:t>
+            <w:r>
+              <w:t>1 : N</w:t>
             </w:r>
           </w:p>
         </w:tc>
@@ -1522,13 +1431,8 @@
             <w:hideMark/>
           </w:tcPr>
           <w:p>
-            <w:proofErr w:type="gramStart"/>
-            <w:r>
-              <w:t>1 :</w:t>
-            </w:r>
-            <w:proofErr w:type="gramEnd"/>
-            <w:r>
-              <w:t xml:space="preserve"> N (references Projects)</w:t>
+            <w:r>
+              <w:t>1 : N (references Projects)</w:t>
             </w:r>
           </w:p>
         </w:tc>
@@ -1568,13 +1472,8 @@
             <w:hideMark/>
           </w:tcPr>
           <w:p>
-            <w:proofErr w:type="gramStart"/>
-            <w:r>
-              <w:t>1 :</w:t>
-            </w:r>
-            <w:proofErr w:type="gramEnd"/>
-            <w:r>
-              <w:t xml:space="preserve"> N (references News)</w:t>
+            <w:r>
+              <w:t>1 : N (references News)</w:t>
             </w:r>
           </w:p>
         </w:tc>
@@ -1614,13 +1513,8 @@
             <w:hideMark/>
           </w:tcPr>
           <w:p>
-            <w:proofErr w:type="gramStart"/>
-            <w:r>
-              <w:t>1 :</w:t>
-            </w:r>
-            <w:proofErr w:type="gramEnd"/>
-            <w:r>
-              <w:t xml:space="preserve"> N</w:t>
+            <w:r>
+              <w:t>1 : N</w:t>
             </w:r>
           </w:p>
         </w:tc>
@@ -1660,13 +1554,8 @@
             <w:hideMark/>
           </w:tcPr>
           <w:p>
-            <w:proofErr w:type="gramStart"/>
-            <w:r>
-              <w:t>1 :</w:t>
-            </w:r>
-            <w:proofErr w:type="gramEnd"/>
-            <w:r>
-              <w:t xml:space="preserve"> N</w:t>
+            <w:r>
+              <w:t>1 : N</w:t>
             </w:r>
           </w:p>
         </w:tc>
@@ -1706,13 +1595,8 @@
             <w:hideMark/>
           </w:tcPr>
           <w:p>
-            <w:proofErr w:type="gramStart"/>
-            <w:r>
-              <w:t>1 :</w:t>
-            </w:r>
-            <w:proofErr w:type="gramEnd"/>
-            <w:r>
-              <w:t xml:space="preserve"> N</w:t>
+            <w:r>
+              <w:t>1 : N</w:t>
             </w:r>
           </w:p>
         </w:tc>
@@ -3444,67 +3328,27 @@
     </w:p>
     <w:p>
       <w:r>
-        <w:t xml:space="preserve">-- Project    </w:t>
-      </w:r>
-      <w:proofErr w:type="gramStart"/>
-      <w:r>
-        <w:t xml:space="preserve">  :</w:t>
-      </w:r>
-      <w:proofErr w:type="gramEnd"/>
-      <w:r>
-        <w:t xml:space="preserve"> NHPC Website</w:t>
-      </w:r>
-    </w:p>
-    <w:p>
-      <w:r>
-        <w:t xml:space="preserve">-- File       </w:t>
-      </w:r>
-      <w:proofErr w:type="gramStart"/>
-      <w:r>
-        <w:t xml:space="preserve">  :</w:t>
-      </w:r>
-      <w:proofErr w:type="gramEnd"/>
-      <w:r>
-        <w:t xml:space="preserve"> 04_operational_power_stations.sql</w:t>
-      </w:r>
-    </w:p>
-    <w:p>
-      <w:r>
-        <w:t xml:space="preserve">-- Module     </w:t>
-      </w:r>
-      <w:proofErr w:type="gramStart"/>
-      <w:r>
-        <w:t xml:space="preserve">  :</w:t>
-      </w:r>
-      <w:proofErr w:type="gramEnd"/>
-      <w:r>
-        <w:t xml:space="preserve"> Operational Power Stations</w:t>
-      </w:r>
-    </w:p>
-    <w:p>
-      <w:r>
-        <w:t xml:space="preserve">-- </w:t>
-      </w:r>
-      <w:proofErr w:type="gramStart"/>
-      <w:r>
-        <w:t>Description  :</w:t>
-      </w:r>
-      <w:proofErr w:type="gramEnd"/>
-      <w:r>
-        <w:t xml:space="preserve"> Operational generating stations of NHPC</w:t>
-      </w:r>
-    </w:p>
-    <w:p>
-      <w:r>
-        <w:t xml:space="preserve">-- Database   </w:t>
-      </w:r>
-      <w:proofErr w:type="gramStart"/>
-      <w:r>
-        <w:t xml:space="preserve">  :</w:t>
-      </w:r>
-      <w:proofErr w:type="gramEnd"/>
-      <w:r>
-        <w:t xml:space="preserve"> PostgreSQL 18+</w:t>
+        <w:t>-- Project      : NHPC Website</w:t>
+      </w:r>
+    </w:p>
+    <w:p>
+      <w:r>
+        <w:t>-- File         : 04_operational_power_stations.sql</w:t>
+      </w:r>
+    </w:p>
+    <w:p>
+      <w:r>
+        <w:t>-- Module       : Operational Power Stations</w:t>
+      </w:r>
+    </w:p>
+    <w:p>
+      <w:r>
+        <w:t>-- Description  : Operational generating stations of NHPC</w:t>
+      </w:r>
+    </w:p>
+    <w:p>
+      <w:r>
+        <w:t>-- Database     : PostgreSQL 18+</w:t>
       </w:r>
     </w:p>
     <w:p>
@@ -3541,30 +3385,14 @@
     <w:p/>
     <w:p>
       <w:r>
-        <w:t xml:space="preserve">    name </w:t>
-      </w:r>
-      <w:proofErr w:type="gramStart"/>
-      <w:r>
-        <w:t>VARCHAR(</w:t>
-      </w:r>
-      <w:proofErr w:type="gramEnd"/>
-      <w:r>
-        <w:t>200) NOT NULL,</w:t>
+        <w:t xml:space="preserve">    name VARCHAR(200) NOT NULL,</w:t>
       </w:r>
     </w:p>
     <w:p/>
     <w:p>
       <w:r>
         <w:lastRenderedPageBreak/>
-        <w:t xml:space="preserve">    slug </w:t>
-      </w:r>
-      <w:proofErr w:type="gramStart"/>
-      <w:r>
-        <w:t>VARCHAR(</w:t>
-      </w:r>
-      <w:proofErr w:type="gramEnd"/>
-      <w:r>
-        <w:t>250) NOT NULL,</w:t>
+        <w:t xml:space="preserve">    slug VARCHAR(250) NOT NULL,</w:t>
       </w:r>
     </w:p>
     <w:p/>
@@ -3606,15 +3434,7 @@
       </w:r>
       <w:proofErr w:type="spellEnd"/>
       <w:r>
-        <w:t xml:space="preserve"> </w:t>
-      </w:r>
-      <w:proofErr w:type="gramStart"/>
-      <w:r>
-        <w:t>NUMERIC(</w:t>
-      </w:r>
-      <w:proofErr w:type="gramEnd"/>
-      <w:r>
-        <w:t>10,2) NOT NULL,</w:t>
+        <w:t xml:space="preserve"> NUMERIC(10,2) NOT NULL,</w:t>
       </w:r>
     </w:p>
     <w:p/>
@@ -3648,29 +3468,13 @@
     <w:p/>
     <w:p>
       <w:r>
-        <w:t xml:space="preserve">    latitude </w:t>
-      </w:r>
-      <w:proofErr w:type="gramStart"/>
-      <w:r>
-        <w:t>DECIMAL(</w:t>
-      </w:r>
-      <w:proofErr w:type="gramEnd"/>
-      <w:r>
-        <w:t>10,7),</w:t>
-      </w:r>
-    </w:p>
-    <w:p/>
-    <w:p>
-      <w:r>
-        <w:t xml:space="preserve">    longitude </w:t>
-      </w:r>
-      <w:proofErr w:type="gramStart"/>
-      <w:r>
-        <w:t>DECIMAL(</w:t>
-      </w:r>
-      <w:proofErr w:type="gramEnd"/>
-      <w:r>
-        <w:t>10,7),</w:t>
+        <w:t xml:space="preserve">    latitude DECIMAL(10,7),</w:t>
+      </w:r>
+    </w:p>
+    <w:p/>
+    <w:p>
+      <w:r>
+        <w:t xml:space="preserve">    longitude DECIMAL(10,7),</w:t>
       </w:r>
     </w:p>
     <w:p/>
@@ -4099,19 +3903,11 @@
       </w:r>
       <w:proofErr w:type="spellStart"/>
       <w:r>
-        <w:t>fn_update_updated_</w:t>
-      </w:r>
-      <w:proofErr w:type="gramStart"/>
-      <w:r>
-        <w:t>at</w:t>
+        <w:t>fn_update_updated_at</w:t>
       </w:r>
       <w:proofErr w:type="spellEnd"/>
       <w:r>
-        <w:t>(</w:t>
-      </w:r>
-      <w:proofErr w:type="gramEnd"/>
-      <w:r>
-        <w:t>);</w:t>
+        <w:t>();</w:t>
       </w:r>
     </w:p>
     <w:p>
@@ -4510,12 +4306,10 @@
         <w:br/>
       </w:r>
       <w:proofErr w:type="spellStart"/>
-      <w:proofErr w:type="gramStart"/>
       <w:r>
         <w:t>schema.prisma</w:t>
       </w:r>
       <w:proofErr w:type="spellEnd"/>
-      <w:proofErr w:type="gramEnd"/>
       <w:r>
         <w:t xml:space="preserve"> (generated)</w:t>
       </w:r>
@@ -5125,6 +4919,587 @@
         <w:t>Prisma</w:t>
       </w:r>
     </w:p>
+    <w:p>
+      <w:pPr>
+        <w:rPr>
+          <w:b/>
+          <w:bCs/>
+        </w:rPr>
+      </w:pPr>
+      <w:r>
+        <w:rPr>
+          <w:b/>
+          <w:bCs/>
+        </w:rPr>
+        <w:t xml:space="preserve"> </w:t>
+      </w:r>
+    </w:p>
+    <w:p>
+      <w:pPr>
+        <w:rPr>
+          <w:b/>
+          <w:bCs/>
+        </w:rPr>
+      </w:pPr>
+      <w:r>
+        <w:rPr>
+          <w:b/>
+          <w:bCs/>
+        </w:rPr>
+        <w:t>Media Module</w:t>
+      </w:r>
+    </w:p>
+    <w:tbl>
+      <w:tblPr>
+        <w:tblW w:w="0" w:type="auto"/>
+        <w:tblCellSpacing w:w="15" w:type="dxa"/>
+        <w:tblCellMar>
+          <w:top w:w="15" w:type="dxa"/>
+          <w:left w:w="15" w:type="dxa"/>
+          <w:bottom w:w="15" w:type="dxa"/>
+          <w:right w:w="15" w:type="dxa"/>
+        </w:tblCellMar>
+        <w:tblLook w:val="04A0" w:firstRow="1" w:lastRow="0" w:firstColumn="1" w:lastColumn="0" w:noHBand="0" w:noVBand="1"/>
+      </w:tblPr>
+      <w:tblGrid>
+        <w:gridCol w:w="1810"/>
+        <w:gridCol w:w="1937"/>
+      </w:tblGrid>
+      <w:tr>
+        <w:trPr>
+          <w:tblHeader/>
+          <w:tblCellSpacing w:w="15" w:type="dxa"/>
+        </w:trPr>
+        <w:tc>
+          <w:tcPr>
+            <w:tcW w:w="0" w:type="auto"/>
+            <w:vAlign w:val="center"/>
+            <w:hideMark/>
+          </w:tcPr>
+          <w:p>
+            <w:pPr>
+              <w:rPr>
+                <w:b/>
+                <w:bCs/>
+              </w:rPr>
+            </w:pPr>
+            <w:r>
+              <w:rPr>
+                <w:b/>
+                <w:bCs/>
+              </w:rPr>
+              <w:t xml:space="preserve">DB </w:t>
+            </w:r>
+            <w:r>
+              <w:rPr>
+                <w:b/>
+                <w:bCs/>
+              </w:rPr>
+              <w:t>Column</w:t>
+            </w:r>
+          </w:p>
+        </w:tc>
+        <w:tc>
+          <w:tcPr>
+            <w:tcW w:w="0" w:type="auto"/>
+            <w:vAlign w:val="center"/>
+            <w:hideMark/>
+          </w:tcPr>
+          <w:p>
+            <w:pPr>
+              <w:rPr>
+                <w:b/>
+                <w:bCs/>
+              </w:rPr>
+            </w:pPr>
+            <w:r>
+              <w:rPr>
+                <w:b/>
+                <w:bCs/>
+              </w:rPr>
+              <w:t>Source</w:t>
+            </w:r>
+          </w:p>
+        </w:tc>
+      </w:tr>
+      <w:tr>
+        <w:trPr>
+          <w:tblCellSpacing w:w="15" w:type="dxa"/>
+        </w:trPr>
+        <w:tc>
+          <w:tcPr>
+            <w:tcW w:w="0" w:type="auto"/>
+            <w:vAlign w:val="center"/>
+            <w:hideMark/>
+          </w:tcPr>
+          <w:p>
+            <w:proofErr w:type="spellStart"/>
+            <w:r>
+              <w:t>original_name</w:t>
+            </w:r>
+            <w:proofErr w:type="spellEnd"/>
+          </w:p>
+        </w:tc>
+        <w:tc>
+          <w:tcPr>
+            <w:tcW w:w="0" w:type="auto"/>
+            <w:vAlign w:val="center"/>
+            <w:hideMark/>
+          </w:tcPr>
+          <w:p>
+            <w:proofErr w:type="spellStart"/>
+            <w:r>
+              <w:t>getFileMetadata</w:t>
+            </w:r>
+            <w:proofErr w:type="spellEnd"/>
+            <w:r>
+              <w:t>()</w:t>
+            </w:r>
+          </w:p>
+        </w:tc>
+      </w:tr>
+      <w:tr>
+        <w:trPr>
+          <w:tblCellSpacing w:w="15" w:type="dxa"/>
+        </w:trPr>
+        <w:tc>
+          <w:tcPr>
+            <w:tcW w:w="0" w:type="auto"/>
+            <w:vAlign w:val="center"/>
+            <w:hideMark/>
+          </w:tcPr>
+          <w:p>
+            <w:proofErr w:type="spellStart"/>
+            <w:r>
+              <w:t>stored_name</w:t>
+            </w:r>
+            <w:proofErr w:type="spellEnd"/>
+          </w:p>
+        </w:tc>
+        <w:tc>
+          <w:tcPr>
+            <w:tcW w:w="0" w:type="auto"/>
+            <w:vAlign w:val="center"/>
+            <w:hideMark/>
+          </w:tcPr>
+          <w:p>
+            <w:proofErr w:type="spellStart"/>
+            <w:r>
+              <w:t>getFileMetadata</w:t>
+            </w:r>
+            <w:proofErr w:type="spellEnd"/>
+            <w:r>
+              <w:t>()</w:t>
+            </w:r>
+          </w:p>
+        </w:tc>
+      </w:tr>
+      <w:tr>
+        <w:trPr>
+          <w:tblCellSpacing w:w="15" w:type="dxa"/>
+        </w:trPr>
+        <w:tc>
+          <w:tcPr>
+            <w:tcW w:w="0" w:type="auto"/>
+            <w:vAlign w:val="center"/>
+            <w:hideMark/>
+          </w:tcPr>
+          <w:p>
+            <w:proofErr w:type="spellStart"/>
+            <w:r>
+              <w:t>mime_type</w:t>
+            </w:r>
+            <w:proofErr w:type="spellEnd"/>
+          </w:p>
+        </w:tc>
+        <w:tc>
+          <w:tcPr>
+            <w:tcW w:w="0" w:type="auto"/>
+            <w:vAlign w:val="center"/>
+            <w:hideMark/>
+          </w:tcPr>
+          <w:p>
+            <w:proofErr w:type="spellStart"/>
+            <w:r>
+              <w:t>getFileMetadata</w:t>
+            </w:r>
+            <w:proofErr w:type="spellEnd"/>
+            <w:r>
+              <w:t>()</w:t>
+            </w:r>
+          </w:p>
+        </w:tc>
+      </w:tr>
+      <w:tr>
+        <w:trPr>
+          <w:tblCellSpacing w:w="15" w:type="dxa"/>
+        </w:trPr>
+        <w:tc>
+          <w:tcPr>
+            <w:tcW w:w="0" w:type="auto"/>
+            <w:vAlign w:val="center"/>
+            <w:hideMark/>
+          </w:tcPr>
+          <w:p>
+            <w:r>
+              <w:t>extension</w:t>
+            </w:r>
+          </w:p>
+        </w:tc>
+        <w:tc>
+          <w:tcPr>
+            <w:tcW w:w="0" w:type="auto"/>
+            <w:vAlign w:val="center"/>
+            <w:hideMark/>
+          </w:tcPr>
+          <w:p>
+            <w:proofErr w:type="spellStart"/>
+            <w:r>
+              <w:t>getFileMetadata</w:t>
+            </w:r>
+            <w:proofErr w:type="spellEnd"/>
+            <w:r>
+              <w:t>()</w:t>
+            </w:r>
+          </w:p>
+        </w:tc>
+      </w:tr>
+      <w:tr>
+        <w:trPr>
+          <w:tblCellSpacing w:w="15" w:type="dxa"/>
+        </w:trPr>
+        <w:tc>
+          <w:tcPr>
+            <w:tcW w:w="0" w:type="auto"/>
+            <w:vAlign w:val="center"/>
+            <w:hideMark/>
+          </w:tcPr>
+          <w:p>
+            <w:proofErr w:type="spellStart"/>
+            <w:r>
+              <w:t>size_bytes</w:t>
+            </w:r>
+            <w:proofErr w:type="spellEnd"/>
+          </w:p>
+        </w:tc>
+        <w:tc>
+          <w:tcPr>
+            <w:tcW w:w="0" w:type="auto"/>
+            <w:vAlign w:val="center"/>
+            <w:hideMark/>
+          </w:tcPr>
+          <w:p>
+            <w:proofErr w:type="spellStart"/>
+            <w:r>
+              <w:t>getFileMetadata</w:t>
+            </w:r>
+            <w:proofErr w:type="spellEnd"/>
+            <w:r>
+              <w:t>()</w:t>
+            </w:r>
+          </w:p>
+        </w:tc>
+      </w:tr>
+      <w:tr>
+        <w:trPr>
+          <w:tblCellSpacing w:w="15" w:type="dxa"/>
+        </w:trPr>
+        <w:tc>
+          <w:tcPr>
+            <w:tcW w:w="0" w:type="auto"/>
+            <w:vAlign w:val="center"/>
+            <w:hideMark/>
+          </w:tcPr>
+          <w:p>
+            <w:proofErr w:type="spellStart"/>
+            <w:r>
+              <w:t>storage_provider</w:t>
+            </w:r>
+            <w:proofErr w:type="spellEnd"/>
+          </w:p>
+        </w:tc>
+        <w:tc>
+          <w:tcPr>
+            <w:tcW w:w="0" w:type="auto"/>
+            <w:vAlign w:val="center"/>
+            <w:hideMark/>
+          </w:tcPr>
+          <w:p>
+            <w:proofErr w:type="spellStart"/>
+            <w:r>
+              <w:t>getFileMetadata</w:t>
+            </w:r>
+            <w:proofErr w:type="spellEnd"/>
+            <w:r>
+              <w:t>()</w:t>
+            </w:r>
+          </w:p>
+        </w:tc>
+      </w:tr>
+      <w:tr>
+        <w:trPr>
+          <w:tblCellSpacing w:w="15" w:type="dxa"/>
+        </w:trPr>
+        <w:tc>
+          <w:tcPr>
+            <w:tcW w:w="0" w:type="auto"/>
+            <w:vAlign w:val="center"/>
+            <w:hideMark/>
+          </w:tcPr>
+          <w:p>
+            <w:proofErr w:type="spellStart"/>
+            <w:r>
+              <w:t>storage_path</w:t>
+            </w:r>
+            <w:proofErr w:type="spellEnd"/>
+          </w:p>
+        </w:tc>
+        <w:tc>
+          <w:tcPr>
+            <w:tcW w:w="0" w:type="auto"/>
+            <w:vAlign w:val="center"/>
+            <w:hideMark/>
+          </w:tcPr>
+          <w:p>
+            <w:proofErr w:type="spellStart"/>
+            <w:r>
+              <w:t>getFileMetadata</w:t>
+            </w:r>
+            <w:proofErr w:type="spellEnd"/>
+            <w:r>
+              <w:t>()</w:t>
+            </w:r>
+          </w:p>
+        </w:tc>
+      </w:tr>
+      <w:tr>
+        <w:trPr>
+          <w:tblCellSpacing w:w="15" w:type="dxa"/>
+        </w:trPr>
+        <w:tc>
+          <w:tcPr>
+            <w:tcW w:w="0" w:type="auto"/>
+            <w:vAlign w:val="center"/>
+            <w:hideMark/>
+          </w:tcPr>
+          <w:p>
+            <w:r>
+              <w:t>width</w:t>
+            </w:r>
+          </w:p>
+        </w:tc>
+        <w:tc>
+          <w:tcPr>
+            <w:tcW w:w="0" w:type="auto"/>
+            <w:vAlign w:val="center"/>
+            <w:hideMark/>
+          </w:tcPr>
+          <w:p>
+            <w:proofErr w:type="spellStart"/>
+            <w:r>
+              <w:t>extractMetadata</w:t>
+            </w:r>
+            <w:proofErr w:type="spellEnd"/>
+            <w:r>
+              <w:t>()</w:t>
+            </w:r>
+          </w:p>
+        </w:tc>
+      </w:tr>
+      <w:tr>
+        <w:trPr>
+          <w:tblCellSpacing w:w="15" w:type="dxa"/>
+        </w:trPr>
+        <w:tc>
+          <w:tcPr>
+            <w:tcW w:w="0" w:type="auto"/>
+            <w:vAlign w:val="center"/>
+            <w:hideMark/>
+          </w:tcPr>
+          <w:p>
+            <w:r>
+              <w:t>height</w:t>
+            </w:r>
+          </w:p>
+        </w:tc>
+        <w:tc>
+          <w:tcPr>
+            <w:tcW w:w="0" w:type="auto"/>
+            <w:vAlign w:val="center"/>
+            <w:hideMark/>
+          </w:tcPr>
+          <w:p>
+            <w:proofErr w:type="spellStart"/>
+            <w:r>
+              <w:t>extractMetadata</w:t>
+            </w:r>
+            <w:proofErr w:type="spellEnd"/>
+            <w:r>
+              <w:t>()</w:t>
+            </w:r>
+          </w:p>
+        </w:tc>
+      </w:tr>
+      <w:tr>
+        <w:trPr>
+          <w:tblCellSpacing w:w="15" w:type="dxa"/>
+        </w:trPr>
+        <w:tc>
+          <w:tcPr>
+            <w:tcW w:w="0" w:type="auto"/>
+            <w:vAlign w:val="center"/>
+            <w:hideMark/>
+          </w:tcPr>
+          <w:p>
+            <w:proofErr w:type="spellStart"/>
+            <w:r>
+              <w:t>duration_seconds</w:t>
+            </w:r>
+            <w:proofErr w:type="spellEnd"/>
+          </w:p>
+        </w:tc>
+        <w:tc>
+          <w:tcPr>
+            <w:tcW w:w="0" w:type="auto"/>
+            <w:vAlign w:val="center"/>
+            <w:hideMark/>
+          </w:tcPr>
+          <w:p>
+            <w:proofErr w:type="spellStart"/>
+            <w:r>
+              <w:t>extractMetadata</w:t>
+            </w:r>
+            <w:proofErr w:type="spellEnd"/>
+            <w:r>
+              <w:t>()</w:t>
+            </w:r>
+          </w:p>
+        </w:tc>
+      </w:tr>
+      <w:tr>
+        <w:trPr>
+          <w:tblCellSpacing w:w="15" w:type="dxa"/>
+        </w:trPr>
+        <w:tc>
+          <w:tcPr>
+            <w:tcW w:w="0" w:type="auto"/>
+            <w:vAlign w:val="center"/>
+            <w:hideMark/>
+          </w:tcPr>
+          <w:p>
+            <w:proofErr w:type="spellStart"/>
+            <w:r>
+              <w:t>folder_id</w:t>
+            </w:r>
+            <w:proofErr w:type="spellEnd"/>
+          </w:p>
+        </w:tc>
+        <w:tc>
+          <w:tcPr>
+            <w:tcW w:w="0" w:type="auto"/>
+            <w:vAlign w:val="center"/>
+            <w:hideMark/>
+          </w:tcPr>
+          <w:p>
+            <w:r>
+              <w:t>Request body</w:t>
+            </w:r>
+          </w:p>
+        </w:tc>
+      </w:tr>
+      <w:tr>
+        <w:trPr>
+          <w:tblCellSpacing w:w="15" w:type="dxa"/>
+        </w:trPr>
+        <w:tc>
+          <w:tcPr>
+            <w:tcW w:w="0" w:type="auto"/>
+            <w:vAlign w:val="center"/>
+            <w:hideMark/>
+          </w:tcPr>
+          <w:p>
+            <w:proofErr w:type="spellStart"/>
+            <w:r>
+              <w:lastRenderedPageBreak/>
+              <w:t>alt_text</w:t>
+            </w:r>
+            <w:proofErr w:type="spellEnd"/>
+          </w:p>
+        </w:tc>
+        <w:tc>
+          <w:tcPr>
+            <w:tcW w:w="0" w:type="auto"/>
+            <w:vAlign w:val="center"/>
+            <w:hideMark/>
+          </w:tcPr>
+          <w:p>
+            <w:r>
+              <w:t>Request body</w:t>
+            </w:r>
+          </w:p>
+        </w:tc>
+      </w:tr>
+      <w:tr>
+        <w:trPr>
+          <w:tblCellSpacing w:w="15" w:type="dxa"/>
+        </w:trPr>
+        <w:tc>
+          <w:tcPr>
+            <w:tcW w:w="0" w:type="auto"/>
+            <w:vAlign w:val="center"/>
+            <w:hideMark/>
+          </w:tcPr>
+          <w:p>
+            <w:r>
+              <w:t>caption</w:t>
+            </w:r>
+          </w:p>
+        </w:tc>
+        <w:tc>
+          <w:tcPr>
+            <w:tcW w:w="0" w:type="auto"/>
+            <w:vAlign w:val="center"/>
+            <w:hideMark/>
+          </w:tcPr>
+          <w:p>
+            <w:r>
+              <w:t>Request body</w:t>
+            </w:r>
+          </w:p>
+        </w:tc>
+      </w:tr>
+      <w:tr>
+        <w:trPr>
+          <w:tblCellSpacing w:w="15" w:type="dxa"/>
+        </w:trPr>
+        <w:tc>
+          <w:tcPr>
+            <w:tcW w:w="0" w:type="auto"/>
+            <w:vAlign w:val="center"/>
+            <w:hideMark/>
+          </w:tcPr>
+          <w:p>
+            <w:proofErr w:type="spellStart"/>
+            <w:r>
+              <w:t>uploaded_by</w:t>
+            </w:r>
+            <w:proofErr w:type="spellEnd"/>
+          </w:p>
+        </w:tc>
+        <w:tc>
+          <w:tcPr>
+            <w:tcW w:w="0" w:type="auto"/>
+            <w:vAlign w:val="center"/>
+            <w:hideMark/>
+          </w:tcPr>
+          <w:p>
+            <w:r>
+              <w:t>Authenticated user</w:t>
+            </w:r>
+          </w:p>
+        </w:tc>
+      </w:tr>
+    </w:tbl>
     <w:p/>
     <w:p/>
     <w:sectPr>

</xml_diff>

<commit_message>
Homepage module complete for public api
</commit_message>
<xml_diff>
--- a/note.docx
+++ b/note.docx
@@ -200,21 +200,33 @@
     <w:p/>
     <w:p>
       <w:r>
-        <w:t xml:space="preserve">                   1:N                            </w:t>
+        <w:t xml:space="preserve">                   </w:t>
+      </w:r>
+      <w:proofErr w:type="gramStart"/>
+      <w:r>
+        <w:t>1:N</w:t>
+      </w:r>
+      <w:proofErr w:type="gramEnd"/>
+      <w:r>
+        <w:t xml:space="preserve">                            </w:t>
       </w:r>
       <w:proofErr w:type="spellStart"/>
+      <w:proofErr w:type="gramStart"/>
       <w:r>
         <w:t>1:N</w:t>
       </w:r>
       <w:proofErr w:type="spellEnd"/>
+      <w:proofErr w:type="gramEnd"/>
       <w:r>
         <w:t xml:space="preserve">                      </w:t>
       </w:r>
       <w:proofErr w:type="spellStart"/>
+      <w:proofErr w:type="gramStart"/>
       <w:r>
         <w:t>1:N</w:t>
       </w:r>
       <w:proofErr w:type="spellEnd"/>
+      <w:proofErr w:type="gramEnd"/>
     </w:p>
     <w:p>
       <w:r>
@@ -355,8 +367,37 @@
     </w:p>
     <w:p>
       <w:r>
-        <w:t xml:space="preserve">      │1:1          │1:N             │1:N             │1:N        │1:N</w:t>
-      </w:r>
+        <w:t xml:space="preserve">      │1:1          │</w:t>
+      </w:r>
+      <w:proofErr w:type="gramStart"/>
+      <w:r>
+        <w:t>1:N</w:t>
+      </w:r>
+      <w:proofErr w:type="gramEnd"/>
+      <w:r>
+        <w:t xml:space="preserve">             │</w:t>
+      </w:r>
+      <w:proofErr w:type="gramStart"/>
+      <w:r>
+        <w:t>1:N</w:t>
+      </w:r>
+      <w:proofErr w:type="gramEnd"/>
+      <w:r>
+        <w:t xml:space="preserve">             │</w:t>
+      </w:r>
+      <w:proofErr w:type="gramStart"/>
+      <w:r>
+        <w:t>1:N</w:t>
+      </w:r>
+      <w:proofErr w:type="gramEnd"/>
+      <w:r>
+        <w:t xml:space="preserve">        │</w:t>
+      </w:r>
+      <w:proofErr w:type="gramStart"/>
+      <w:r>
+        <w:t>1:N</w:t>
+      </w:r>
+      <w:proofErr w:type="gramEnd"/>
     </w:p>
     <w:p>
       <w:r>
@@ -423,8 +464,13 @@
     </w:p>
     <w:p>
       <w:r>
-        <w:t>│LOCATION    │ │SECTIONS      │ │GALLERY      │ │DOCUMENTS     │ │SPECIFICATIONS  │</w:t>
-      </w:r>
+        <w:t>│LOCATION    │ │SECTIONS      │ │GALLERY      │ │DOCUMENTS     │ │</w:t>
+      </w:r>
+      <w:proofErr w:type="gramStart"/>
+      <w:r>
+        <w:t>SPECIFICATIONS  │</w:t>
+      </w:r>
+      <w:proofErr w:type="gramEnd"/>
     </w:p>
     <w:p>
       <w:r>
@@ -1062,8 +1108,13 @@
             <w:hideMark/>
           </w:tcPr>
           <w:p>
-            <w:r>
-              <w:t>1 : N</w:t>
+            <w:proofErr w:type="gramStart"/>
+            <w:r>
+              <w:t>1 :</w:t>
+            </w:r>
+            <w:proofErr w:type="gramEnd"/>
+            <w:r>
+              <w:t xml:space="preserve"> N</w:t>
             </w:r>
           </w:p>
         </w:tc>
@@ -1103,8 +1154,13 @@
             <w:hideMark/>
           </w:tcPr>
           <w:p>
-            <w:r>
-              <w:t>1 : N</w:t>
+            <w:proofErr w:type="gramStart"/>
+            <w:r>
+              <w:t>1 :</w:t>
+            </w:r>
+            <w:proofErr w:type="gramEnd"/>
+            <w:r>
+              <w:t xml:space="preserve"> N</w:t>
             </w:r>
           </w:p>
         </w:tc>
@@ -1144,8 +1200,13 @@
             <w:hideMark/>
           </w:tcPr>
           <w:p>
-            <w:r>
-              <w:t>1 : N</w:t>
+            <w:proofErr w:type="gramStart"/>
+            <w:r>
+              <w:t>1 :</w:t>
+            </w:r>
+            <w:proofErr w:type="gramEnd"/>
+            <w:r>
+              <w:t xml:space="preserve"> N</w:t>
             </w:r>
           </w:p>
         </w:tc>
@@ -1185,8 +1246,13 @@
             <w:hideMark/>
           </w:tcPr>
           <w:p>
-            <w:r>
-              <w:t>1 : 1</w:t>
+            <w:proofErr w:type="gramStart"/>
+            <w:r>
+              <w:t>1 :</w:t>
+            </w:r>
+            <w:proofErr w:type="gramEnd"/>
+            <w:r>
+              <w:t xml:space="preserve"> 1</w:t>
             </w:r>
           </w:p>
         </w:tc>
@@ -1226,8 +1292,13 @@
             <w:hideMark/>
           </w:tcPr>
           <w:p>
-            <w:r>
-              <w:t>1 : N</w:t>
+            <w:proofErr w:type="gramStart"/>
+            <w:r>
+              <w:t>1 :</w:t>
+            </w:r>
+            <w:proofErr w:type="gramEnd"/>
+            <w:r>
+              <w:t xml:space="preserve"> N</w:t>
             </w:r>
           </w:p>
         </w:tc>
@@ -1267,8 +1338,13 @@
             <w:hideMark/>
           </w:tcPr>
           <w:p>
-            <w:r>
-              <w:t>1 : N</w:t>
+            <w:proofErr w:type="gramStart"/>
+            <w:r>
+              <w:t>1 :</w:t>
+            </w:r>
+            <w:proofErr w:type="gramEnd"/>
+            <w:r>
+              <w:t xml:space="preserve"> N</w:t>
             </w:r>
           </w:p>
         </w:tc>
@@ -1308,8 +1384,13 @@
             <w:hideMark/>
           </w:tcPr>
           <w:p>
-            <w:r>
-              <w:t>1 : N</w:t>
+            <w:proofErr w:type="gramStart"/>
+            <w:r>
+              <w:t>1 :</w:t>
+            </w:r>
+            <w:proofErr w:type="gramEnd"/>
+            <w:r>
+              <w:t xml:space="preserve"> N</w:t>
             </w:r>
           </w:p>
         </w:tc>
@@ -1349,8 +1430,13 @@
             <w:hideMark/>
           </w:tcPr>
           <w:p>
-            <w:r>
-              <w:t>1 : N</w:t>
+            <w:proofErr w:type="gramStart"/>
+            <w:r>
+              <w:t>1 :</w:t>
+            </w:r>
+            <w:proofErr w:type="gramEnd"/>
+            <w:r>
+              <w:t xml:space="preserve"> N</w:t>
             </w:r>
           </w:p>
         </w:tc>
@@ -1390,8 +1476,13 @@
             <w:hideMark/>
           </w:tcPr>
           <w:p>
-            <w:r>
-              <w:t>1 : N</w:t>
+            <w:proofErr w:type="gramStart"/>
+            <w:r>
+              <w:t>1 :</w:t>
+            </w:r>
+            <w:proofErr w:type="gramEnd"/>
+            <w:r>
+              <w:t xml:space="preserve"> N</w:t>
             </w:r>
           </w:p>
         </w:tc>
@@ -1431,8 +1522,13 @@
             <w:hideMark/>
           </w:tcPr>
           <w:p>
-            <w:r>
-              <w:t>1 : N (references Projects)</w:t>
+            <w:proofErr w:type="gramStart"/>
+            <w:r>
+              <w:t>1 :</w:t>
+            </w:r>
+            <w:proofErr w:type="gramEnd"/>
+            <w:r>
+              <w:t xml:space="preserve"> N (references Projects)</w:t>
             </w:r>
           </w:p>
         </w:tc>
@@ -1472,8 +1568,13 @@
             <w:hideMark/>
           </w:tcPr>
           <w:p>
-            <w:r>
-              <w:t>1 : N (references News)</w:t>
+            <w:proofErr w:type="gramStart"/>
+            <w:r>
+              <w:t>1 :</w:t>
+            </w:r>
+            <w:proofErr w:type="gramEnd"/>
+            <w:r>
+              <w:t xml:space="preserve"> N (references News)</w:t>
             </w:r>
           </w:p>
         </w:tc>
@@ -1513,8 +1614,13 @@
             <w:hideMark/>
           </w:tcPr>
           <w:p>
-            <w:r>
-              <w:t>1 : N</w:t>
+            <w:proofErr w:type="gramStart"/>
+            <w:r>
+              <w:t>1 :</w:t>
+            </w:r>
+            <w:proofErr w:type="gramEnd"/>
+            <w:r>
+              <w:t xml:space="preserve"> N</w:t>
             </w:r>
           </w:p>
         </w:tc>
@@ -1554,8 +1660,13 @@
             <w:hideMark/>
           </w:tcPr>
           <w:p>
-            <w:r>
-              <w:t>1 : N</w:t>
+            <w:proofErr w:type="gramStart"/>
+            <w:r>
+              <w:t>1 :</w:t>
+            </w:r>
+            <w:proofErr w:type="gramEnd"/>
+            <w:r>
+              <w:t xml:space="preserve"> N</w:t>
             </w:r>
           </w:p>
         </w:tc>
@@ -1595,8 +1706,13 @@
             <w:hideMark/>
           </w:tcPr>
           <w:p>
-            <w:r>
-              <w:t>1 : N</w:t>
+            <w:proofErr w:type="gramStart"/>
+            <w:r>
+              <w:t>1 :</w:t>
+            </w:r>
+            <w:proofErr w:type="gramEnd"/>
+            <w:r>
+              <w:t xml:space="preserve"> N</w:t>
             </w:r>
           </w:p>
         </w:tc>
@@ -3328,27 +3444,67 @@
     </w:p>
     <w:p>
       <w:r>
-        <w:t>-- Project      : NHPC Website</w:t>
-      </w:r>
-    </w:p>
-    <w:p>
-      <w:r>
-        <w:t>-- File         : 04_operational_power_stations.sql</w:t>
-      </w:r>
-    </w:p>
-    <w:p>
-      <w:r>
-        <w:t>-- Module       : Operational Power Stations</w:t>
-      </w:r>
-    </w:p>
-    <w:p>
-      <w:r>
-        <w:t>-- Description  : Operational generating stations of NHPC</w:t>
-      </w:r>
-    </w:p>
-    <w:p>
-      <w:r>
-        <w:t>-- Database     : PostgreSQL 18+</w:t>
+        <w:t xml:space="preserve">-- Project    </w:t>
+      </w:r>
+      <w:proofErr w:type="gramStart"/>
+      <w:r>
+        <w:t xml:space="preserve">  :</w:t>
+      </w:r>
+      <w:proofErr w:type="gramEnd"/>
+      <w:r>
+        <w:t xml:space="preserve"> NHPC Website</w:t>
+      </w:r>
+    </w:p>
+    <w:p>
+      <w:r>
+        <w:t xml:space="preserve">-- File       </w:t>
+      </w:r>
+      <w:proofErr w:type="gramStart"/>
+      <w:r>
+        <w:t xml:space="preserve">  :</w:t>
+      </w:r>
+      <w:proofErr w:type="gramEnd"/>
+      <w:r>
+        <w:t xml:space="preserve"> 04_operational_power_stations.sql</w:t>
+      </w:r>
+    </w:p>
+    <w:p>
+      <w:r>
+        <w:t xml:space="preserve">-- Module     </w:t>
+      </w:r>
+      <w:proofErr w:type="gramStart"/>
+      <w:r>
+        <w:t xml:space="preserve">  :</w:t>
+      </w:r>
+      <w:proofErr w:type="gramEnd"/>
+      <w:r>
+        <w:t xml:space="preserve"> Operational Power Stations</w:t>
+      </w:r>
+    </w:p>
+    <w:p>
+      <w:r>
+        <w:t xml:space="preserve">-- </w:t>
+      </w:r>
+      <w:proofErr w:type="gramStart"/>
+      <w:r>
+        <w:t>Description  :</w:t>
+      </w:r>
+      <w:proofErr w:type="gramEnd"/>
+      <w:r>
+        <w:t xml:space="preserve"> Operational generating stations of NHPC</w:t>
+      </w:r>
+    </w:p>
+    <w:p>
+      <w:r>
+        <w:t xml:space="preserve">-- Database   </w:t>
+      </w:r>
+      <w:proofErr w:type="gramStart"/>
+      <w:r>
+        <w:t xml:space="preserve">  :</w:t>
+      </w:r>
+      <w:proofErr w:type="gramEnd"/>
+      <w:r>
+        <w:t xml:space="preserve"> PostgreSQL 18+</w:t>
       </w:r>
     </w:p>
     <w:p>
@@ -3385,14 +3541,30 @@
     <w:p/>
     <w:p>
       <w:r>
-        <w:t xml:space="preserve">    name VARCHAR(200) NOT NULL,</w:t>
+        <w:t xml:space="preserve">    name </w:t>
+      </w:r>
+      <w:proofErr w:type="gramStart"/>
+      <w:r>
+        <w:t>VARCHAR(</w:t>
+      </w:r>
+      <w:proofErr w:type="gramEnd"/>
+      <w:r>
+        <w:t>200) NOT NULL,</w:t>
       </w:r>
     </w:p>
     <w:p/>
     <w:p>
       <w:r>
         <w:lastRenderedPageBreak/>
-        <w:t xml:space="preserve">    slug VARCHAR(250) NOT NULL,</w:t>
+        <w:t xml:space="preserve">    slug </w:t>
+      </w:r>
+      <w:proofErr w:type="gramStart"/>
+      <w:r>
+        <w:t>VARCHAR(</w:t>
+      </w:r>
+      <w:proofErr w:type="gramEnd"/>
+      <w:r>
+        <w:t>250) NOT NULL,</w:t>
       </w:r>
     </w:p>
     <w:p/>
@@ -3434,7 +3606,15 @@
       </w:r>
       <w:proofErr w:type="spellEnd"/>
       <w:r>
-        <w:t xml:space="preserve"> NUMERIC(10,2) NOT NULL,</w:t>
+        <w:t xml:space="preserve"> </w:t>
+      </w:r>
+      <w:proofErr w:type="gramStart"/>
+      <w:r>
+        <w:t>NUMERIC(</w:t>
+      </w:r>
+      <w:proofErr w:type="gramEnd"/>
+      <w:r>
+        <w:t>10,2) NOT NULL,</w:t>
       </w:r>
     </w:p>
     <w:p/>
@@ -3468,13 +3648,29 @@
     <w:p/>
     <w:p>
       <w:r>
-        <w:t xml:space="preserve">    latitude DECIMAL(10,7),</w:t>
-      </w:r>
-    </w:p>
-    <w:p/>
-    <w:p>
-      <w:r>
-        <w:t xml:space="preserve">    longitude DECIMAL(10,7),</w:t>
+        <w:t xml:space="preserve">    latitude </w:t>
+      </w:r>
+      <w:proofErr w:type="gramStart"/>
+      <w:r>
+        <w:t>DECIMAL(</w:t>
+      </w:r>
+      <w:proofErr w:type="gramEnd"/>
+      <w:r>
+        <w:t>10,7),</w:t>
+      </w:r>
+    </w:p>
+    <w:p/>
+    <w:p>
+      <w:r>
+        <w:t xml:space="preserve">    longitude </w:t>
+      </w:r>
+      <w:proofErr w:type="gramStart"/>
+      <w:r>
+        <w:t>DECIMAL(</w:t>
+      </w:r>
+      <w:proofErr w:type="gramEnd"/>
+      <w:r>
+        <w:t>10,7),</w:t>
       </w:r>
     </w:p>
     <w:p/>
@@ -3903,11 +4099,19 @@
       </w:r>
       <w:proofErr w:type="spellStart"/>
       <w:r>
-        <w:t>fn_update_updated_at</w:t>
+        <w:t>fn_update_updated_</w:t>
+      </w:r>
+      <w:proofErr w:type="gramStart"/>
+      <w:r>
+        <w:t>at</w:t>
       </w:r>
       <w:proofErr w:type="spellEnd"/>
       <w:r>
-        <w:t>();</w:t>
+        <w:t>(</w:t>
+      </w:r>
+      <w:proofErr w:type="gramEnd"/>
+      <w:r>
+        <w:t>);</w:t>
       </w:r>
     </w:p>
     <w:p>
@@ -4306,10 +4510,12 @@
         <w:br/>
       </w:r>
       <w:proofErr w:type="spellStart"/>
+      <w:proofErr w:type="gramStart"/>
       <w:r>
         <w:t>schema.prisma</w:t>
       </w:r>
       <w:proofErr w:type="spellEnd"/>
+      <w:proofErr w:type="gramEnd"/>
       <w:r>
         <w:t xml:space="preserve"> (generated)</w:t>
       </w:r>
@@ -5048,12 +5254,17 @@
           </w:tcPr>
           <w:p>
             <w:proofErr w:type="spellStart"/>
+            <w:proofErr w:type="gramStart"/>
             <w:r>
               <w:t>getFileMetadata</w:t>
             </w:r>
             <w:proofErr w:type="spellEnd"/>
             <w:r>
-              <w:t>()</w:t>
+              <w:t>(</w:t>
+            </w:r>
+            <w:proofErr w:type="gramEnd"/>
+            <w:r>
+              <w:t>)</w:t>
             </w:r>
           </w:p>
         </w:tc>
@@ -5084,12 +5295,17 @@
           </w:tcPr>
           <w:p>
             <w:proofErr w:type="spellStart"/>
+            <w:proofErr w:type="gramStart"/>
             <w:r>
               <w:t>getFileMetadata</w:t>
             </w:r>
             <w:proofErr w:type="spellEnd"/>
             <w:r>
-              <w:t>()</w:t>
+              <w:t>(</w:t>
+            </w:r>
+            <w:proofErr w:type="gramEnd"/>
+            <w:r>
+              <w:t>)</w:t>
             </w:r>
           </w:p>
         </w:tc>
@@ -5120,12 +5336,17 @@
           </w:tcPr>
           <w:p>
             <w:proofErr w:type="spellStart"/>
+            <w:proofErr w:type="gramStart"/>
             <w:r>
               <w:t>getFileMetadata</w:t>
             </w:r>
             <w:proofErr w:type="spellEnd"/>
             <w:r>
-              <w:t>()</w:t>
+              <w:t>(</w:t>
+            </w:r>
+            <w:proofErr w:type="gramEnd"/>
+            <w:r>
+              <w:t>)</w:t>
             </w:r>
           </w:p>
         </w:tc>
@@ -5154,12 +5375,17 @@
           </w:tcPr>
           <w:p>
             <w:proofErr w:type="spellStart"/>
+            <w:proofErr w:type="gramStart"/>
             <w:r>
               <w:t>getFileMetadata</w:t>
             </w:r>
             <w:proofErr w:type="spellEnd"/>
             <w:r>
-              <w:t>()</w:t>
+              <w:t>(</w:t>
+            </w:r>
+            <w:proofErr w:type="gramEnd"/>
+            <w:r>
+              <w:t>)</w:t>
             </w:r>
           </w:p>
         </w:tc>
@@ -5190,12 +5416,17 @@
           </w:tcPr>
           <w:p>
             <w:proofErr w:type="spellStart"/>
+            <w:proofErr w:type="gramStart"/>
             <w:r>
               <w:t>getFileMetadata</w:t>
             </w:r>
             <w:proofErr w:type="spellEnd"/>
             <w:r>
-              <w:t>()</w:t>
+              <w:t>(</w:t>
+            </w:r>
+            <w:proofErr w:type="gramEnd"/>
+            <w:r>
+              <w:t>)</w:t>
             </w:r>
           </w:p>
         </w:tc>
@@ -5226,12 +5457,17 @@
           </w:tcPr>
           <w:p>
             <w:proofErr w:type="spellStart"/>
+            <w:proofErr w:type="gramStart"/>
             <w:r>
               <w:t>getFileMetadata</w:t>
             </w:r>
             <w:proofErr w:type="spellEnd"/>
             <w:r>
-              <w:t>()</w:t>
+              <w:t>(</w:t>
+            </w:r>
+            <w:proofErr w:type="gramEnd"/>
+            <w:r>
+              <w:t>)</w:t>
             </w:r>
           </w:p>
         </w:tc>
@@ -5262,12 +5498,17 @@
           </w:tcPr>
           <w:p>
             <w:proofErr w:type="spellStart"/>
+            <w:proofErr w:type="gramStart"/>
             <w:r>
               <w:t>getFileMetadata</w:t>
             </w:r>
             <w:proofErr w:type="spellEnd"/>
             <w:r>
-              <w:t>()</w:t>
+              <w:t>(</w:t>
+            </w:r>
+            <w:proofErr w:type="gramEnd"/>
+            <w:r>
+              <w:t>)</w:t>
             </w:r>
           </w:p>
         </w:tc>
@@ -5296,12 +5537,17 @@
           </w:tcPr>
           <w:p>
             <w:proofErr w:type="spellStart"/>
+            <w:proofErr w:type="gramStart"/>
             <w:r>
               <w:t>extractMetadata</w:t>
             </w:r>
             <w:proofErr w:type="spellEnd"/>
             <w:r>
-              <w:t>()</w:t>
+              <w:t>(</w:t>
+            </w:r>
+            <w:proofErr w:type="gramEnd"/>
+            <w:r>
+              <w:t>)</w:t>
             </w:r>
           </w:p>
         </w:tc>
@@ -5330,12 +5576,17 @@
           </w:tcPr>
           <w:p>
             <w:proofErr w:type="spellStart"/>
+            <w:proofErr w:type="gramStart"/>
             <w:r>
               <w:t>extractMetadata</w:t>
             </w:r>
             <w:proofErr w:type="spellEnd"/>
             <w:r>
-              <w:t>()</w:t>
+              <w:t>(</w:t>
+            </w:r>
+            <w:proofErr w:type="gramEnd"/>
+            <w:r>
+              <w:t>)</w:t>
             </w:r>
           </w:p>
         </w:tc>
@@ -5366,12 +5617,17 @@
           </w:tcPr>
           <w:p>
             <w:proofErr w:type="spellStart"/>
+            <w:proofErr w:type="gramStart"/>
             <w:r>
               <w:t>extractMetadata</w:t>
             </w:r>
             <w:proofErr w:type="spellEnd"/>
             <w:r>
-              <w:t>()</w:t>
+              <w:t>(</w:t>
+            </w:r>
+            <w:proofErr w:type="gramEnd"/>
+            <w:r>
+              <w:t>)</w:t>
             </w:r>
           </w:p>
         </w:tc>
@@ -5500,6 +5756,340 @@
         </w:tc>
       </w:tr>
     </w:tbl>
+    <w:p/>
+    <w:p>
+      <w:pPr>
+        <w:rPr>
+          <w:b/>
+          <w:bCs/>
+          <w:sz w:val="28"/>
+          <w:szCs w:val="28"/>
+        </w:rPr>
+      </w:pPr>
+      <w:r>
+        <w:rPr>
+          <w:b/>
+          <w:bCs/>
+          <w:sz w:val="28"/>
+          <w:szCs w:val="28"/>
+        </w:rPr>
+        <w:t xml:space="preserve">Home Page </w:t>
+      </w:r>
+      <w:r>
+        <w:rPr>
+          <w:b/>
+          <w:bCs/>
+          <w:sz w:val="28"/>
+          <w:szCs w:val="28"/>
+        </w:rPr>
+        <w:t xml:space="preserve">design </w:t>
+      </w:r>
+      <w:r>
+        <w:rPr>
+          <w:b/>
+          <w:bCs/>
+          <w:sz w:val="28"/>
+          <w:szCs w:val="28"/>
+        </w:rPr>
+        <w:t>flow</w:t>
+      </w:r>
+    </w:p>
+    <w:p>
+      <w:r>
+        <w:t xml:space="preserve">Repository </w:t>
+      </w:r>
+    </w:p>
+    <w:p>
+      <w:r>
+        <w:t>|</w:t>
+      </w:r>
+      <w:r>
+        <w:br/>
+        <w:t>V</w:t>
+      </w:r>
+    </w:p>
+    <w:p>
+      <w:r>
+        <w:t xml:space="preserve">Mapper </w:t>
+      </w:r>
+    </w:p>
+    <w:p>
+      <w:r>
+        <w:t>↓</w:t>
+      </w:r>
+    </w:p>
+    <w:p>
+      <w:r>
+        <w:t>Service</w:t>
+      </w:r>
+    </w:p>
+    <w:p>
+      <w:r>
+        <w:t>↓</w:t>
+      </w:r>
+    </w:p>
+    <w:p>
+      <w:r>
+        <w:t>Controller</w:t>
+      </w:r>
+    </w:p>
+    <w:p>
+      <w:r>
+        <w:t>↓</w:t>
+      </w:r>
+    </w:p>
+    <w:p>
+      <w:r>
+        <w:t>Routes</w:t>
+      </w:r>
+    </w:p>
+    <w:p>
+      <w:r>
+        <w:t>↓</w:t>
+      </w:r>
+    </w:p>
+    <w:p>
+      <w:r>
+        <w:t>Register Route</w:t>
+      </w:r>
+    </w:p>
+    <w:p>
+      <w:r>
+        <w:t>↓</w:t>
+      </w:r>
+    </w:p>
+    <w:p>
+      <w:r>
+        <w:t>Test</w:t>
+      </w:r>
+    </w:p>
+    <w:p/>
+    <w:p>
+      <w:pPr>
+        <w:rPr>
+          <w:b/>
+          <w:bCs/>
+          <w:sz w:val="28"/>
+          <w:szCs w:val="28"/>
+        </w:rPr>
+      </w:pPr>
+      <w:r>
+        <w:rPr>
+          <w:b/>
+          <w:bCs/>
+          <w:sz w:val="28"/>
+          <w:szCs w:val="28"/>
+        </w:rPr>
+        <w:t>The Admin UI</w:t>
+      </w:r>
+    </w:p>
+    <w:p>
+      <w:r>
+        <w:t>----------------------------------------------------</w:t>
+      </w:r>
+    </w:p>
+    <w:p/>
+    <w:p>
+      <w:r>
+        <w:t>Homepage CMS</w:t>
+      </w:r>
+    </w:p>
+    <w:p/>
+    <w:p>
+      <w:r>
+        <w:t>----------------------------------------------------</w:t>
+      </w:r>
+    </w:p>
+    <w:p/>
+    <w:p>
+      <w:r>
+        <w:t>Hero</w:t>
+      </w:r>
+    </w:p>
+    <w:p/>
+    <w:p>
+      <w:r>
+        <w:t>Title</w:t>
+      </w:r>
+    </w:p>
+    <w:p>
+      <w:r>
+        <w:t>[__________________________________]</w:t>
+      </w:r>
+    </w:p>
+    <w:p/>
+    <w:p>
+      <w:r>
+        <w:t>Subtitle</w:t>
+      </w:r>
+    </w:p>
+    <w:p/>
+    <w:p>
+      <w:r>
+        <w:t>[__________________________________]</w:t>
+      </w:r>
+    </w:p>
+    <w:p/>
+    <w:p>
+      <w:r>
+        <w:t>Background Image</w:t>
+      </w:r>
+    </w:p>
+    <w:p/>
+    <w:p>
+      <w:r>
+        <w:t xml:space="preserve">[ </w:t>
+      </w:r>
+      <w:proofErr w:type="gramStart"/>
+      <w:r>
+        <w:t>Upload ]</w:t>
+      </w:r>
+      <w:proofErr w:type="gramEnd"/>
+    </w:p>
+    <w:p/>
+    <w:p>
+      <w:r>
+        <w:t>Background Video</w:t>
+      </w:r>
+    </w:p>
+    <w:p/>
+    <w:p>
+      <w:r>
+        <w:t xml:space="preserve">[ </w:t>
+      </w:r>
+      <w:proofErr w:type="gramStart"/>
+      <w:r>
+        <w:t>Upload ]</w:t>
+      </w:r>
+      <w:proofErr w:type="gramEnd"/>
+    </w:p>
+    <w:p/>
+    <w:p>
+      <w:r>
+        <w:t>Buttons</w:t>
+      </w:r>
+    </w:p>
+    <w:p/>
+    <w:p>
+      <w:r>
+        <w:t>+ Add Button</w:t>
+      </w:r>
+    </w:p>
+    <w:p/>
+    <w:p>
+      <w:r>
+        <w:t>-----------------------------------</w:t>
+      </w:r>
+    </w:p>
+    <w:p/>
+    <w:p>
+      <w:r>
+        <w:t>Statistics</w:t>
+      </w:r>
+    </w:p>
+    <w:p/>
+    <w:p>
+      <w:r>
+        <w:t>Drag to reorder</w:t>
+      </w:r>
+    </w:p>
+    <w:p/>
+    <w:p>
+      <w:r>
+        <w:rPr>
+          <w:rFonts w:ascii="Segoe UI Symbol" w:hAnsi="Segoe UI Symbol" w:cs="Segoe UI Symbol"/>
+        </w:rPr>
+        <w:lastRenderedPageBreak/>
+        <w:t>☰</w:t>
+      </w:r>
+      <w:r>
+        <w:t xml:space="preserve"> 7000 MW</w:t>
+      </w:r>
+    </w:p>
+    <w:p/>
+    <w:p>
+      <w:r>
+        <w:rPr>
+          <w:rFonts w:ascii="Segoe UI Symbol" w:hAnsi="Segoe UI Symbol" w:cs="Segoe UI Symbol"/>
+        </w:rPr>
+        <w:t>☰</w:t>
+      </w:r>
+      <w:r>
+        <w:t xml:space="preserve"> 24 Projects</w:t>
+      </w:r>
+    </w:p>
+    <w:p/>
+    <w:p>
+      <w:r>
+        <w:rPr>
+          <w:rFonts w:ascii="Segoe UI Symbol" w:hAnsi="Segoe UI Symbol" w:cs="Segoe UI Symbol"/>
+        </w:rPr>
+        <w:t>☰</w:t>
+      </w:r>
+      <w:r>
+        <w:t xml:space="preserve"> 50+ Years</w:t>
+      </w:r>
+    </w:p>
+    <w:p/>
+    <w:p>
+      <w:r>
+        <w:t>-----------------------------------</w:t>
+      </w:r>
+    </w:p>
+    <w:p/>
+    <w:p>
+      <w:r>
+        <w:t>Featured Projects</w:t>
+      </w:r>
+    </w:p>
+    <w:p/>
+    <w:p>
+      <w:r>
+        <w:rPr>
+          <w:rFonts w:ascii="Segoe UI Symbol" w:hAnsi="Segoe UI Symbol" w:cs="Segoe UI Symbol"/>
+        </w:rPr>
+        <w:t>☑</w:t>
+      </w:r>
+      <w:r>
+        <w:t xml:space="preserve"> Project A</w:t>
+      </w:r>
+    </w:p>
+    <w:p/>
+    <w:p>
+      <w:r>
+        <w:rPr>
+          <w:rFonts w:ascii="Segoe UI Symbol" w:hAnsi="Segoe UI Symbol" w:cs="Segoe UI Symbol"/>
+        </w:rPr>
+        <w:t>☑</w:t>
+      </w:r>
+      <w:r>
+        <w:t xml:space="preserve"> Project B</w:t>
+      </w:r>
+    </w:p>
+    <w:p/>
+    <w:p>
+      <w:r>
+        <w:rPr>
+          <w:rFonts w:ascii="Segoe UI Symbol" w:hAnsi="Segoe UI Symbol" w:cs="Segoe UI Symbol"/>
+        </w:rPr>
+        <w:t>☐</w:t>
+      </w:r>
+      <w:r>
+        <w:t xml:space="preserve"> Project C</w:t>
+      </w:r>
+    </w:p>
+    <w:p/>
+    <w:p>
+      <w:r>
+        <w:t>-----------------------------------</w:t>
+      </w:r>
+    </w:p>
+    <w:p/>
+    <w:p>
+      <w:r>
+        <w:t>Save Changes</w:t>
+      </w:r>
+    </w:p>
     <w:p/>
     <w:p/>
     <w:sectPr>

</xml_diff>

<commit_message>
feat(projects): implement public Projects API foundation
</commit_message>
<xml_diff>
--- a/note.docx
+++ b/note.docx
@@ -6091,7 +6091,94 @@
       </w:r>
     </w:p>
     <w:p/>
-    <w:p/>
+    <w:p>
+      <w:pPr>
+        <w:rPr>
+          <w:b/>
+          <w:bCs/>
+          <w:sz w:val="32"/>
+          <w:szCs w:val="32"/>
+        </w:rPr>
+      </w:pPr>
+      <w:r>
+        <w:rPr>
+          <w:b/>
+          <w:bCs/>
+          <w:sz w:val="32"/>
+          <w:szCs w:val="32"/>
+        </w:rPr>
+        <w:t>Home page</w:t>
+      </w:r>
+    </w:p>
+    <w:p>
+      <w:r>
+        <w:br/>
+      </w:r>
+      <w:r>
+        <w:t>Database</w:t>
+      </w:r>
+    </w:p>
+    <w:p>
+      <w:r>
+        <w:t xml:space="preserve">      ↓</w:t>
+      </w:r>
+    </w:p>
+    <w:p>
+      <w:r>
+        <w:t>Repository</w:t>
+      </w:r>
+    </w:p>
+    <w:p>
+      <w:r>
+        <w:t xml:space="preserve">      ↓</w:t>
+      </w:r>
+    </w:p>
+    <w:p>
+      <w:r>
+        <w:t>Service</w:t>
+      </w:r>
+    </w:p>
+    <w:p>
+      <w:r>
+        <w:t xml:space="preserve">      ↓</w:t>
+      </w:r>
+    </w:p>
+    <w:p>
+      <w:r>
+        <w:lastRenderedPageBreak/>
+        <w:t>Mapper</w:t>
+      </w:r>
+    </w:p>
+    <w:p>
+      <w:r>
+        <w:t xml:space="preserve">      ↓</w:t>
+      </w:r>
+    </w:p>
+    <w:p>
+      <w:r>
+        <w:t>Controller</w:t>
+      </w:r>
+    </w:p>
+    <w:p>
+      <w:r>
+        <w:t xml:space="preserve">      ↓</w:t>
+      </w:r>
+    </w:p>
+    <w:p>
+      <w:r>
+        <w:t>REST API</w:t>
+      </w:r>
+    </w:p>
+    <w:p>
+      <w:r>
+        <w:t xml:space="preserve">      ↓</w:t>
+      </w:r>
+    </w:p>
+    <w:p>
+      <w:r>
+        <w:t>React Frontend</w:t>
+      </w:r>
+    </w:p>
     <w:sectPr>
       <w:pgSz w:w="11906" w:h="16838"/>
       <w:pgMar w:top="1440" w:right="1440" w:bottom="1440" w:left="1440" w:header="708" w:footer="708" w:gutter="0"/>

</xml_diff>

<commit_message>
(feat): Each Admin module is now fully CRUD-capable except homepage
</commit_message>
<xml_diff>
--- a/note.docx
+++ b/note.docx
@@ -6113,8 +6113,6 @@
     <w:p>
       <w:r>
         <w:br/>
-      </w:r>
-      <w:r>
         <w:t>Database</w:t>
       </w:r>
     </w:p>
@@ -6179,6 +6177,183 @@
         <w:t>React Frontend</w:t>
       </w:r>
     </w:p>
+    <w:p/>
+    <w:p>
+      <w:pPr>
+        <w:rPr>
+          <w:b/>
+          <w:bCs/>
+          <w:sz w:val="28"/>
+          <w:szCs w:val="28"/>
+        </w:rPr>
+      </w:pPr>
+      <w:r>
+        <w:rPr>
+          <w:b/>
+          <w:bCs/>
+          <w:sz w:val="28"/>
+          <w:szCs w:val="28"/>
+        </w:rPr>
+        <w:t>Backend progress 16</w:t>
+      </w:r>
+      <w:r>
+        <w:rPr>
+          <w:b/>
+          <w:bCs/>
+          <w:sz w:val="28"/>
+          <w:szCs w:val="28"/>
+          <w:vertAlign w:val="superscript"/>
+        </w:rPr>
+        <w:t>th</w:t>
+      </w:r>
+      <w:r>
+        <w:rPr>
+          <w:b/>
+          <w:bCs/>
+          <w:sz w:val="28"/>
+          <w:szCs w:val="28"/>
+        </w:rPr>
+        <w:t xml:space="preserve"> </w:t>
+      </w:r>
+      <w:proofErr w:type="spellStart"/>
+      <w:r>
+        <w:rPr>
+          <w:b/>
+          <w:bCs/>
+          <w:sz w:val="28"/>
+          <w:szCs w:val="28"/>
+        </w:rPr>
+        <w:t>jul</w:t>
+      </w:r>
+      <w:proofErr w:type="spellEnd"/>
+    </w:p>
+    <w:p/>
+    <w:p>
+      <w:r>
+        <w:t xml:space="preserve">Authentication              </w:t>
+      </w:r>
+      <w:r>
+        <w:rPr>
+          <w:rFonts w:ascii="Segoe UI Emoji" w:hAnsi="Segoe UI Emoji" w:cs="Segoe UI Emoji"/>
+        </w:rPr>
+        <w:t>✅</w:t>
+      </w:r>
+      <w:r>
+        <w:t xml:space="preserve"> 100%</w:t>
+      </w:r>
+    </w:p>
+    <w:p>
+      <w:r>
+        <w:t xml:space="preserve">Public APIs                 </w:t>
+      </w:r>
+      <w:r>
+        <w:rPr>
+          <w:rFonts w:ascii="Segoe UI Emoji" w:hAnsi="Segoe UI Emoji" w:cs="Segoe UI Emoji"/>
+        </w:rPr>
+        <w:t>✅</w:t>
+      </w:r>
+      <w:r>
+        <w:t xml:space="preserve"> 100%</w:t>
+      </w:r>
+    </w:p>
+    <w:p>
+      <w:r>
+        <w:t xml:space="preserve">Admin CRUD                  </w:t>
+      </w:r>
+      <w:r>
+        <w:rPr>
+          <w:rFonts w:ascii="Segoe UI Emoji" w:hAnsi="Segoe UI Emoji" w:cs="Segoe UI Emoji"/>
+        </w:rPr>
+        <w:t>✅</w:t>
+      </w:r>
+      <w:r>
+        <w:t xml:space="preserve"> 100%</w:t>
+      </w:r>
+    </w:p>
+    <w:p>
+      <w:r>
+        <w:t xml:space="preserve">Validation                  </w:t>
+      </w:r>
+      <w:r>
+        <w:rPr>
+          <w:rFonts w:ascii="Segoe UI Emoji" w:hAnsi="Segoe UI Emoji" w:cs="Segoe UI Emoji"/>
+        </w:rPr>
+        <w:t>✅</w:t>
+      </w:r>
+      <w:r>
+        <w:t xml:space="preserve"> 100%</w:t>
+      </w:r>
+    </w:p>
+    <w:p>
+      <w:r>
+        <w:t xml:space="preserve">Repository Pattern          </w:t>
+      </w:r>
+      <w:r>
+        <w:rPr>
+          <w:rFonts w:ascii="Segoe UI Emoji" w:hAnsi="Segoe UI Emoji" w:cs="Segoe UI Emoji"/>
+        </w:rPr>
+        <w:t>✅</w:t>
+      </w:r>
+      <w:r>
+        <w:t xml:space="preserve"> 100%</w:t>
+      </w:r>
+    </w:p>
+    <w:p>
+      <w:r>
+        <w:t xml:space="preserve">Pagination                  </w:t>
+      </w:r>
+      <w:r>
+        <w:rPr>
+          <w:rFonts w:ascii="Segoe UI Emoji" w:hAnsi="Segoe UI Emoji" w:cs="Segoe UI Emoji"/>
+        </w:rPr>
+        <w:t>✅</w:t>
+      </w:r>
+      <w:r>
+        <w:t xml:space="preserve"> 100%</w:t>
+      </w:r>
+    </w:p>
+    <w:p/>
+    <w:p>
+      <w:r>
+        <w:t xml:space="preserve">Media Upload                </w:t>
+      </w:r>
+      <w:r>
+        <w:rPr>
+          <w:rFonts w:ascii="Segoe UI Emoji" w:hAnsi="Segoe UI Emoji" w:cs="Segoe UI Emoji"/>
+        </w:rPr>
+        <w:t>❌</w:t>
+      </w:r>
+    </w:p>
+    <w:p>
+      <w:r>
+        <w:t xml:space="preserve">Dashboard                   </w:t>
+      </w:r>
+      <w:r>
+        <w:rPr>
+          <w:rFonts w:ascii="Segoe UI Emoji" w:hAnsi="Segoe UI Emoji" w:cs="Segoe UI Emoji"/>
+        </w:rPr>
+        <w:t>❌</w:t>
+      </w:r>
+    </w:p>
+    <w:p>
+      <w:r>
+        <w:t xml:space="preserve">Lookup APIs                 </w:t>
+      </w:r>
+      <w:r>
+        <w:rPr>
+          <w:rFonts w:ascii="Segoe UI Emoji" w:hAnsi="Segoe UI Emoji" w:cs="Segoe UI Emoji"/>
+        </w:rPr>
+        <w:t>❌</w:t>
+      </w:r>
+    </w:p>
+    <w:p/>
+    <w:p>
+      <w:r>
+        <w:t>Overall Backend:            ~95%</w:t>
+      </w:r>
+    </w:p>
+    <w:p/>
+    <w:p/>
     <w:sectPr>
       <w:pgSz w:w="11906" w:h="16838"/>
       <w:pgMar w:top="1440" w:right="1440" w:bottom="1440" w:left="1440" w:header="708" w:footer="708" w:gutter="0"/>
@@ -6949,6 +7124,7 @@
   <w:style w:type="character" w:default="1" w:styleId="DefaultParagraphFont">
     <w:name w:val="Default Paragraph Font"/>
     <w:uiPriority w:val="1"/>
+    <w:semiHidden/>
     <w:unhideWhenUsed/>
   </w:style>
   <w:style w:type="table" w:default="1" w:styleId="TableNormal">

</xml_diff>

<commit_message>
(feat): Admin Dashboard API created and tested
</commit_message>
<xml_diff>
--- a/note.docx
+++ b/note.docx
@@ -137,15 +137,7 @@
     </w:p>
     <w:p>
       <w:r>
-        <w:t xml:space="preserve">                                        │ </w:t>
-      </w:r>
-      <w:proofErr w:type="spellStart"/>
-      <w:r>
-        <w:t>password_hash</w:t>
-      </w:r>
-      <w:proofErr w:type="spellEnd"/>
-      <w:r>
-        <w:t xml:space="preserve">       │</w:t>
+        <w:t xml:space="preserve">                                        │ password_hash       │</w:t>
       </w:r>
     </w:p>
     <w:p>
@@ -200,33 +192,8 @@
     <w:p/>
     <w:p>
       <w:r>
-        <w:t xml:space="preserve">                   </w:t>
-      </w:r>
-      <w:proofErr w:type="gramStart"/>
-      <w:r>
-        <w:t>1:N</w:t>
-      </w:r>
-      <w:proofErr w:type="gramEnd"/>
-      <w:r>
-        <w:t xml:space="preserve">                            </w:t>
-      </w:r>
-      <w:proofErr w:type="spellStart"/>
-      <w:proofErr w:type="gramStart"/>
-      <w:r>
-        <w:t>1:N</w:t>
-      </w:r>
-      <w:proofErr w:type="spellEnd"/>
-      <w:proofErr w:type="gramEnd"/>
-      <w:r>
-        <w:t xml:space="preserve">                      </w:t>
-      </w:r>
-      <w:proofErr w:type="spellStart"/>
-      <w:proofErr w:type="gramStart"/>
-      <w:r>
-        <w:t>1:N</w:t>
-      </w:r>
-      <w:proofErr w:type="spellEnd"/>
-      <w:proofErr w:type="gramEnd"/>
+        <w:t xml:space="preserve">                   1:N                            1:N                      1:N</w:t>
+      </w:r>
     </w:p>
     <w:p>
       <w:r>
@@ -367,37 +334,8 @@
     </w:p>
     <w:p>
       <w:r>
-        <w:t xml:space="preserve">      │1:1          │</w:t>
-      </w:r>
-      <w:proofErr w:type="gramStart"/>
-      <w:r>
-        <w:t>1:N</w:t>
-      </w:r>
-      <w:proofErr w:type="gramEnd"/>
-      <w:r>
-        <w:t xml:space="preserve">             │</w:t>
-      </w:r>
-      <w:proofErr w:type="gramStart"/>
-      <w:r>
-        <w:t>1:N</w:t>
-      </w:r>
-      <w:proofErr w:type="gramEnd"/>
-      <w:r>
-        <w:t xml:space="preserve">             │</w:t>
-      </w:r>
-      <w:proofErr w:type="gramStart"/>
-      <w:r>
-        <w:t>1:N</w:t>
-      </w:r>
-      <w:proofErr w:type="gramEnd"/>
-      <w:r>
-        <w:t xml:space="preserve">        │</w:t>
-      </w:r>
-      <w:proofErr w:type="gramStart"/>
-      <w:r>
-        <w:t>1:N</w:t>
-      </w:r>
-      <w:proofErr w:type="gramEnd"/>
+        <w:t xml:space="preserve">      │1:1          │1:N             │1:N             │1:N        │1:N</w:t>
+      </w:r>
     </w:p>
     <w:p>
       <w:r>
@@ -464,13 +402,8 @@
     </w:p>
     <w:p>
       <w:r>
-        <w:t>│LOCATION    │ │SECTIONS      │ │GALLERY      │ │DOCUMENTS     │ │</w:t>
-      </w:r>
-      <w:proofErr w:type="gramStart"/>
-      <w:r>
-        <w:t>SPECIFICATIONS  │</w:t>
-      </w:r>
-      <w:proofErr w:type="gramEnd"/>
+        <w:t>│LOCATION    │ │SECTIONS      │ │GALLERY      │ │DOCUMENTS     │ │SPECIFICATIONS  │</w:t>
+      </w:r>
     </w:p>
     <w:p>
       <w:r>
@@ -1108,13 +1041,8 @@
             <w:hideMark/>
           </w:tcPr>
           <w:p>
-            <w:proofErr w:type="gramStart"/>
-            <w:r>
-              <w:t>1 :</w:t>
-            </w:r>
-            <w:proofErr w:type="gramEnd"/>
-            <w:r>
-              <w:t xml:space="preserve"> N</w:t>
+            <w:r>
+              <w:t>1 : N</w:t>
             </w:r>
           </w:p>
         </w:tc>
@@ -1154,13 +1082,8 @@
             <w:hideMark/>
           </w:tcPr>
           <w:p>
-            <w:proofErr w:type="gramStart"/>
-            <w:r>
-              <w:t>1 :</w:t>
-            </w:r>
-            <w:proofErr w:type="gramEnd"/>
-            <w:r>
-              <w:t xml:space="preserve"> N</w:t>
+            <w:r>
+              <w:t>1 : N</w:t>
             </w:r>
           </w:p>
         </w:tc>
@@ -1200,13 +1123,8 @@
             <w:hideMark/>
           </w:tcPr>
           <w:p>
-            <w:proofErr w:type="gramStart"/>
-            <w:r>
-              <w:t>1 :</w:t>
-            </w:r>
-            <w:proofErr w:type="gramEnd"/>
-            <w:r>
-              <w:t xml:space="preserve"> N</w:t>
+            <w:r>
+              <w:t>1 : N</w:t>
             </w:r>
           </w:p>
         </w:tc>
@@ -1246,13 +1164,8 @@
             <w:hideMark/>
           </w:tcPr>
           <w:p>
-            <w:proofErr w:type="gramStart"/>
-            <w:r>
-              <w:t>1 :</w:t>
-            </w:r>
-            <w:proofErr w:type="gramEnd"/>
-            <w:r>
-              <w:t xml:space="preserve"> 1</w:t>
+            <w:r>
+              <w:t>1 : 1</w:t>
             </w:r>
           </w:p>
         </w:tc>
@@ -1292,13 +1205,8 @@
             <w:hideMark/>
           </w:tcPr>
           <w:p>
-            <w:proofErr w:type="gramStart"/>
-            <w:r>
-              <w:t>1 :</w:t>
-            </w:r>
-            <w:proofErr w:type="gramEnd"/>
-            <w:r>
-              <w:t xml:space="preserve"> N</w:t>
+            <w:r>
+              <w:t>1 : N</w:t>
             </w:r>
           </w:p>
         </w:tc>
@@ -1338,13 +1246,8 @@
             <w:hideMark/>
           </w:tcPr>
           <w:p>
-            <w:proofErr w:type="gramStart"/>
-            <w:r>
-              <w:t>1 :</w:t>
-            </w:r>
-            <w:proofErr w:type="gramEnd"/>
-            <w:r>
-              <w:t xml:space="preserve"> N</w:t>
+            <w:r>
+              <w:t>1 : N</w:t>
             </w:r>
           </w:p>
         </w:tc>
@@ -1384,13 +1287,8 @@
             <w:hideMark/>
           </w:tcPr>
           <w:p>
-            <w:proofErr w:type="gramStart"/>
-            <w:r>
-              <w:t>1 :</w:t>
-            </w:r>
-            <w:proofErr w:type="gramEnd"/>
-            <w:r>
-              <w:t xml:space="preserve"> N</w:t>
+            <w:r>
+              <w:t>1 : N</w:t>
             </w:r>
           </w:p>
         </w:tc>
@@ -1430,13 +1328,8 @@
             <w:hideMark/>
           </w:tcPr>
           <w:p>
-            <w:proofErr w:type="gramStart"/>
-            <w:r>
-              <w:t>1 :</w:t>
-            </w:r>
-            <w:proofErr w:type="gramEnd"/>
-            <w:r>
-              <w:t xml:space="preserve"> N</w:t>
+            <w:r>
+              <w:t>1 : N</w:t>
             </w:r>
           </w:p>
         </w:tc>
@@ -1476,13 +1369,8 @@
             <w:hideMark/>
           </w:tcPr>
           <w:p>
-            <w:proofErr w:type="gramStart"/>
-            <w:r>
-              <w:t>1 :</w:t>
-            </w:r>
-            <w:proofErr w:type="gramEnd"/>
-            <w:r>
-              <w:t xml:space="preserve"> N</w:t>
+            <w:r>
+              <w:t>1 : N</w:t>
             </w:r>
           </w:p>
         </w:tc>
@@ -1522,13 +1410,8 @@
             <w:hideMark/>
           </w:tcPr>
           <w:p>
-            <w:proofErr w:type="gramStart"/>
-            <w:r>
-              <w:t>1 :</w:t>
-            </w:r>
-            <w:proofErr w:type="gramEnd"/>
-            <w:r>
-              <w:t xml:space="preserve"> N (references Projects)</w:t>
+            <w:r>
+              <w:t>1 : N (references Projects)</w:t>
             </w:r>
           </w:p>
         </w:tc>
@@ -1568,13 +1451,8 @@
             <w:hideMark/>
           </w:tcPr>
           <w:p>
-            <w:proofErr w:type="gramStart"/>
-            <w:r>
-              <w:t>1 :</w:t>
-            </w:r>
-            <w:proofErr w:type="gramEnd"/>
-            <w:r>
-              <w:t xml:space="preserve"> N (references News)</w:t>
+            <w:r>
+              <w:t>1 : N (references News)</w:t>
             </w:r>
           </w:p>
         </w:tc>
@@ -1614,13 +1492,8 @@
             <w:hideMark/>
           </w:tcPr>
           <w:p>
-            <w:proofErr w:type="gramStart"/>
-            <w:r>
-              <w:t>1 :</w:t>
-            </w:r>
-            <w:proofErr w:type="gramEnd"/>
-            <w:r>
-              <w:t xml:space="preserve"> N</w:t>
+            <w:r>
+              <w:t>1 : N</w:t>
             </w:r>
           </w:p>
         </w:tc>
@@ -1660,13 +1533,8 @@
             <w:hideMark/>
           </w:tcPr>
           <w:p>
-            <w:proofErr w:type="gramStart"/>
-            <w:r>
-              <w:t>1 :</w:t>
-            </w:r>
-            <w:proofErr w:type="gramEnd"/>
-            <w:r>
-              <w:t xml:space="preserve"> N</w:t>
+            <w:r>
+              <w:t>1 : N</w:t>
             </w:r>
           </w:p>
         </w:tc>
@@ -1706,13 +1574,8 @@
             <w:hideMark/>
           </w:tcPr>
           <w:p>
-            <w:proofErr w:type="gramStart"/>
-            <w:r>
-              <w:t>1 :</w:t>
-            </w:r>
-            <w:proofErr w:type="gramEnd"/>
-            <w:r>
-              <w:t xml:space="preserve"> N</w:t>
+            <w:r>
+              <w:t>1 : N</w:t>
             </w:r>
           </w:p>
         </w:tc>
@@ -1802,11 +1665,9 @@
       </w:r>
     </w:p>
     <w:p>
-      <w:proofErr w:type="spellStart"/>
       <w:r>
         <w:t>media_folders</w:t>
       </w:r>
-      <w:proofErr w:type="spellEnd"/>
       <w:r>
         <w:br/>
         <w:t xml:space="preserve">        │</w:t>
@@ -1823,12 +1684,8 @@
       </w:r>
       <w:r>
         <w:br/>
-      </w:r>
-      <w:proofErr w:type="spellStart"/>
-      <w:r>
         <w:t>media_files</w:t>
       </w:r>
-      <w:proofErr w:type="spellEnd"/>
       <w:r>
         <w:br/>
         <w:t xml:space="preserve">        </w:t>
@@ -1851,12 +1708,8 @@
       </w:r>
       <w:r>
         <w:br/>
-      </w:r>
-      <w:proofErr w:type="spellStart"/>
-      <w:r>
         <w:t>media_file_links</w:t>
       </w:r>
-      <w:proofErr w:type="spellEnd"/>
       <w:r>
         <w:br/>
         <w:t xml:space="preserve">        </w:t>
@@ -1929,15 +1782,7 @@
         <w:t>❌</w:t>
       </w:r>
       <w:r>
-        <w:t xml:space="preserve"> </w:t>
-      </w:r>
-      <w:proofErr w:type="spellStart"/>
-      <w:r>
-        <w:t>project_gallery</w:t>
-      </w:r>
-      <w:proofErr w:type="spellEnd"/>
-      <w:r>
-        <w:t xml:space="preserve"> </w:t>
+        <w:t xml:space="preserve"> project_gallery </w:t>
       </w:r>
     </w:p>
     <w:p>
@@ -1954,15 +1799,7 @@
         <w:t>❌</w:t>
       </w:r>
       <w:r>
-        <w:t xml:space="preserve"> </w:t>
-      </w:r>
-      <w:proofErr w:type="spellStart"/>
-      <w:r>
-        <w:t>project_documents</w:t>
-      </w:r>
-      <w:proofErr w:type="spellEnd"/>
-      <w:r>
-        <w:t xml:space="preserve"> </w:t>
+        <w:t xml:space="preserve"> project_documents </w:t>
       </w:r>
     </w:p>
     <w:p>
@@ -1979,15 +1816,7 @@
         <w:t>❌</w:t>
       </w:r>
       <w:r>
-        <w:t xml:space="preserve"> </w:t>
-      </w:r>
-      <w:proofErr w:type="spellStart"/>
-      <w:r>
-        <w:t>news_images</w:t>
-      </w:r>
-      <w:proofErr w:type="spellEnd"/>
-      <w:r>
-        <w:t xml:space="preserve"> </w:t>
+        <w:t xml:space="preserve"> news_images </w:t>
       </w:r>
     </w:p>
     <w:p>
@@ -2004,15 +1833,7 @@
         <w:t>❌</w:t>
       </w:r>
       <w:r>
-        <w:t xml:space="preserve"> </w:t>
-      </w:r>
-      <w:proofErr w:type="spellStart"/>
-      <w:r>
-        <w:t>tender_documents</w:t>
-      </w:r>
-      <w:proofErr w:type="spellEnd"/>
-      <w:r>
-        <w:t xml:space="preserve"> (as media tables) </w:t>
+        <w:t xml:space="preserve"> tender_documents (as media tables) </w:t>
       </w:r>
     </w:p>
     <w:p>
@@ -2037,12 +1858,10 @@
       <w:r>
         <w:br/>
       </w:r>
-      <w:proofErr w:type="spellStart"/>
       <w:r>
         <w:lastRenderedPageBreak/>
         <w:t>media_file_links</w:t>
       </w:r>
-      <w:proofErr w:type="spellEnd"/>
       <w:r>
         <w:br/>
       </w:r>
@@ -2114,11 +1933,9 @@
       </w:r>
     </w:p>
     <w:p>
-      <w:proofErr w:type="spellStart"/>
       <w:r>
         <w:t>homepage_sections</w:t>
       </w:r>
-      <w:proofErr w:type="spellEnd"/>
       <w:r>
         <w:br/>
       </w:r>
@@ -2131,12 +1948,8 @@
       </w:r>
       <w:r>
         <w:br/>
-      </w:r>
-      <w:proofErr w:type="spellStart"/>
-      <w:r>
         <w:t>homepage_featured_items</w:t>
       </w:r>
-      <w:proofErr w:type="spellEnd"/>
       <w:r>
         <w:br/>
       </w:r>
@@ -2306,11 +2119,9 @@
     </w:p>
     <w:p/>
     <w:p>
-      <w:proofErr w:type="spellStart"/>
       <w:r>
         <w:t>homepage_sections</w:t>
       </w:r>
-      <w:proofErr w:type="spellEnd"/>
     </w:p>
     <w:p/>
     <w:p>
@@ -3029,11 +2840,9 @@
             <w:hideMark/>
           </w:tcPr>
           <w:p>
-            <w:proofErr w:type="spellStart"/>
             <w:r>
               <w:t>prisma</w:t>
             </w:r>
-            <w:proofErr w:type="spellEnd"/>
           </w:p>
         </w:tc>
         <w:tc>
@@ -3060,11 +2869,9 @@
             <w:hideMark/>
           </w:tcPr>
           <w:p>
-            <w:proofErr w:type="spellStart"/>
             <w:r>
               <w:t>zod</w:t>
             </w:r>
-            <w:proofErr w:type="spellEnd"/>
           </w:p>
         </w:tc>
         <w:tc>
@@ -3091,11 +2898,9 @@
             <w:hideMark/>
           </w:tcPr>
           <w:p>
-            <w:proofErr w:type="spellStart"/>
             <w:r>
               <w:t>bcrypt</w:t>
             </w:r>
-            <w:proofErr w:type="spellEnd"/>
           </w:p>
         </w:tc>
         <w:tc>
@@ -3122,11 +2927,9 @@
             <w:hideMark/>
           </w:tcPr>
           <w:p>
-            <w:proofErr w:type="spellStart"/>
             <w:r>
               <w:t>jsonwebtoken</w:t>
             </w:r>
-            <w:proofErr w:type="spellEnd"/>
           </w:p>
         </w:tc>
         <w:tc>
@@ -3153,11 +2956,9 @@
             <w:hideMark/>
           </w:tcPr>
           <w:p>
-            <w:proofErr w:type="spellStart"/>
             <w:r>
               <w:t>dotenv</w:t>
             </w:r>
-            <w:proofErr w:type="spellEnd"/>
           </w:p>
         </w:tc>
         <w:tc>
@@ -3184,11 +2985,9 @@
             <w:hideMark/>
           </w:tcPr>
           <w:p>
-            <w:proofErr w:type="spellStart"/>
             <w:r>
               <w:t>cors</w:t>
             </w:r>
-            <w:proofErr w:type="spellEnd"/>
           </w:p>
         </w:tc>
         <w:tc>
@@ -3257,13 +3056,8 @@
             <w:hideMark/>
           </w:tcPr>
           <w:p>
-            <w:proofErr w:type="spellStart"/>
-            <w:r>
-              <w:t>Gzip</w:t>
-            </w:r>
-            <w:proofErr w:type="spellEnd"/>
-            <w:r>
-              <w:t xml:space="preserve"> responses</w:t>
+            <w:r>
+              <w:t>Gzip responses</w:t>
             </w:r>
           </w:p>
         </w:tc>
@@ -3337,11 +3131,9 @@
             <w:hideMark/>
           </w:tcPr>
           <w:p>
-            <w:proofErr w:type="spellStart"/>
             <w:r>
               <w:t>multer</w:t>
             </w:r>
-            <w:proofErr w:type="spellEnd"/>
           </w:p>
         </w:tc>
         <w:tc>
@@ -3368,11 +3160,9 @@
             <w:hideMark/>
           </w:tcPr>
           <w:p>
-            <w:proofErr w:type="spellStart"/>
             <w:r>
               <w:t>slugify</w:t>
             </w:r>
-            <w:proofErr w:type="spellEnd"/>
           </w:p>
         </w:tc>
         <w:tc>
@@ -3399,11 +3189,9 @@
             <w:hideMark/>
           </w:tcPr>
           <w:p>
-            <w:proofErr w:type="spellStart"/>
             <w:r>
               <w:t>dayjs</w:t>
             </w:r>
-            <w:proofErr w:type="spellEnd"/>
           </w:p>
         </w:tc>
         <w:tc>
@@ -3444,67 +3232,27 @@
     </w:p>
     <w:p>
       <w:r>
-        <w:t xml:space="preserve">-- Project    </w:t>
-      </w:r>
-      <w:proofErr w:type="gramStart"/>
-      <w:r>
-        <w:t xml:space="preserve">  :</w:t>
-      </w:r>
-      <w:proofErr w:type="gramEnd"/>
-      <w:r>
-        <w:t xml:space="preserve"> NHPC Website</w:t>
-      </w:r>
-    </w:p>
-    <w:p>
-      <w:r>
-        <w:t xml:space="preserve">-- File       </w:t>
-      </w:r>
-      <w:proofErr w:type="gramStart"/>
-      <w:r>
-        <w:t xml:space="preserve">  :</w:t>
-      </w:r>
-      <w:proofErr w:type="gramEnd"/>
-      <w:r>
-        <w:t xml:space="preserve"> 04_operational_power_stations.sql</w:t>
-      </w:r>
-    </w:p>
-    <w:p>
-      <w:r>
-        <w:t xml:space="preserve">-- Module     </w:t>
-      </w:r>
-      <w:proofErr w:type="gramStart"/>
-      <w:r>
-        <w:t xml:space="preserve">  :</w:t>
-      </w:r>
-      <w:proofErr w:type="gramEnd"/>
-      <w:r>
-        <w:t xml:space="preserve"> Operational Power Stations</w:t>
-      </w:r>
-    </w:p>
-    <w:p>
-      <w:r>
-        <w:t xml:space="preserve">-- </w:t>
-      </w:r>
-      <w:proofErr w:type="gramStart"/>
-      <w:r>
-        <w:t>Description  :</w:t>
-      </w:r>
-      <w:proofErr w:type="gramEnd"/>
-      <w:r>
-        <w:t xml:space="preserve"> Operational generating stations of NHPC</w:t>
-      </w:r>
-    </w:p>
-    <w:p>
-      <w:r>
-        <w:t xml:space="preserve">-- Database   </w:t>
-      </w:r>
-      <w:proofErr w:type="gramStart"/>
-      <w:r>
-        <w:t xml:space="preserve">  :</w:t>
-      </w:r>
-      <w:proofErr w:type="gramEnd"/>
-      <w:r>
-        <w:t xml:space="preserve"> PostgreSQL 18+</w:t>
+        <w:t>-- Project      : NHPC Website</w:t>
+      </w:r>
+    </w:p>
+    <w:p>
+      <w:r>
+        <w:t>-- File         : 04_operational_power_stations.sql</w:t>
+      </w:r>
+    </w:p>
+    <w:p>
+      <w:r>
+        <w:t>-- Module       : Operational Power Stations</w:t>
+      </w:r>
+    </w:p>
+    <w:p>
+      <w:r>
+        <w:t>-- Description  : Operational generating stations of NHPC</w:t>
+      </w:r>
+    </w:p>
+    <w:p>
+      <w:r>
+        <w:t>-- Database     : PostgreSQL 18+</w:t>
       </w:r>
     </w:p>
     <w:p>
@@ -3521,15 +3269,7 @@
     <w:p/>
     <w:p>
       <w:r>
-        <w:t xml:space="preserve">CREATE TABLE </w:t>
-      </w:r>
-      <w:proofErr w:type="spellStart"/>
-      <w:r>
-        <w:t>operational_power_stations</w:t>
-      </w:r>
-      <w:proofErr w:type="spellEnd"/>
-      <w:r>
-        <w:t xml:space="preserve"> (</w:t>
+        <w:t>CREATE TABLE operational_power_stations (</w:t>
       </w:r>
     </w:p>
     <w:p/>
@@ -3541,136 +3281,56 @@
     <w:p/>
     <w:p>
       <w:r>
-        <w:t xml:space="preserve">    name </w:t>
-      </w:r>
-      <w:proofErr w:type="gramStart"/>
-      <w:r>
-        <w:t>VARCHAR(</w:t>
-      </w:r>
-      <w:proofErr w:type="gramEnd"/>
-      <w:r>
-        <w:t>200) NOT NULL,</w:t>
+        <w:t xml:space="preserve">    name VARCHAR(200) NOT NULL,</w:t>
       </w:r>
     </w:p>
     <w:p/>
     <w:p>
       <w:r>
         <w:lastRenderedPageBreak/>
-        <w:t xml:space="preserve">    slug </w:t>
-      </w:r>
-      <w:proofErr w:type="gramStart"/>
-      <w:r>
-        <w:t>VARCHAR(</w:t>
-      </w:r>
-      <w:proofErr w:type="gramEnd"/>
-      <w:r>
-        <w:t>250) NOT NULL,</w:t>
-      </w:r>
-    </w:p>
-    <w:p/>
-    <w:p>
-      <w:r>
-        <w:t xml:space="preserve">    </w:t>
-      </w:r>
-      <w:proofErr w:type="spellStart"/>
-      <w:r>
-        <w:t>state_id</w:t>
-      </w:r>
-      <w:proofErr w:type="spellEnd"/>
-      <w:r>
-        <w:t xml:space="preserve"> BIGINT NOT NULL,</w:t>
-      </w:r>
-    </w:p>
-    <w:p/>
-    <w:p>
-      <w:r>
-        <w:t xml:space="preserve">    </w:t>
-      </w:r>
-      <w:proofErr w:type="spellStart"/>
-      <w:r>
-        <w:t>project_type_id</w:t>
-      </w:r>
-      <w:proofErr w:type="spellEnd"/>
-      <w:r>
-        <w:t xml:space="preserve"> BIGINT NOT NULL,</w:t>
-      </w:r>
-    </w:p>
-    <w:p/>
-    <w:p>
-      <w:r>
-        <w:t xml:space="preserve">    </w:t>
-      </w:r>
-      <w:proofErr w:type="spellStart"/>
-      <w:r>
-        <w:t>installed_capacity</w:t>
-      </w:r>
-      <w:proofErr w:type="spellEnd"/>
-      <w:r>
-        <w:t xml:space="preserve"> </w:t>
-      </w:r>
-      <w:proofErr w:type="gramStart"/>
-      <w:r>
-        <w:t>NUMERIC(</w:t>
-      </w:r>
-      <w:proofErr w:type="gramEnd"/>
-      <w:r>
-        <w:t>10,2) NOT NULL,</w:t>
-      </w:r>
-    </w:p>
-    <w:p/>
-    <w:p>
-      <w:r>
-        <w:t xml:space="preserve">    </w:t>
-      </w:r>
-      <w:proofErr w:type="spellStart"/>
-      <w:r>
-        <w:t>capacity_unit_id</w:t>
-      </w:r>
-      <w:proofErr w:type="spellEnd"/>
-      <w:r>
-        <w:t xml:space="preserve"> BIGINT NOT NULL,</w:t>
-      </w:r>
-    </w:p>
-    <w:p/>
-    <w:p>
-      <w:r>
-        <w:t xml:space="preserve">    </w:t>
-      </w:r>
-      <w:proofErr w:type="spellStart"/>
-      <w:r>
-        <w:t>commissioned_on</w:t>
-      </w:r>
-      <w:proofErr w:type="spellEnd"/>
-      <w:r>
-        <w:t xml:space="preserve"> DATE,</w:t>
-      </w:r>
-    </w:p>
-    <w:p/>
-    <w:p>
-      <w:r>
-        <w:t xml:space="preserve">    latitude </w:t>
-      </w:r>
-      <w:proofErr w:type="gramStart"/>
-      <w:r>
-        <w:t>DECIMAL(</w:t>
-      </w:r>
-      <w:proofErr w:type="gramEnd"/>
-      <w:r>
-        <w:t>10,7),</w:t>
-      </w:r>
-    </w:p>
-    <w:p/>
-    <w:p>
-      <w:r>
-        <w:t xml:space="preserve">    longitude </w:t>
-      </w:r>
-      <w:proofErr w:type="gramStart"/>
-      <w:r>
-        <w:t>DECIMAL(</w:t>
-      </w:r>
-      <w:proofErr w:type="gramEnd"/>
-      <w:r>
-        <w:t>10,7),</w:t>
+        <w:t xml:space="preserve">    slug VARCHAR(250) NOT NULL,</w:t>
+      </w:r>
+    </w:p>
+    <w:p/>
+    <w:p>
+      <w:r>
+        <w:t xml:space="preserve">    state_id BIGINT NOT NULL,</w:t>
+      </w:r>
+    </w:p>
+    <w:p/>
+    <w:p>
+      <w:r>
+        <w:t xml:space="preserve">    project_type_id BIGINT NOT NULL,</w:t>
+      </w:r>
+    </w:p>
+    <w:p/>
+    <w:p>
+      <w:r>
+        <w:t xml:space="preserve">    installed_capacity NUMERIC(10,2) NOT NULL,</w:t>
+      </w:r>
+    </w:p>
+    <w:p/>
+    <w:p>
+      <w:r>
+        <w:t xml:space="preserve">    capacity_unit_id BIGINT NOT NULL,</w:t>
+      </w:r>
+    </w:p>
+    <w:p/>
+    <w:p>
+      <w:r>
+        <w:t xml:space="preserve">    commissioned_on DATE,</w:t>
+      </w:r>
+    </w:p>
+    <w:p/>
+    <w:p>
+      <w:r>
+        <w:t xml:space="preserve">    latitude DECIMAL(10,7),</w:t>
+      </w:r>
+    </w:p>
+    <w:p/>
+    <w:p>
+      <w:r>
+        <w:t xml:space="preserve">    longitude DECIMAL(10,7),</w:t>
       </w:r>
     </w:p>
     <w:p/>
@@ -3682,84 +3342,39 @@
     <w:p/>
     <w:p>
       <w:r>
-        <w:t xml:space="preserve">    </w:t>
-      </w:r>
-      <w:proofErr w:type="spellStart"/>
-      <w:r>
-        <w:t>is_featured</w:t>
-      </w:r>
-      <w:proofErr w:type="spellEnd"/>
-      <w:r>
-        <w:t xml:space="preserve"> BOOLEAN NOT NULL DEFAULT FALSE,</w:t>
-      </w:r>
-    </w:p>
-    <w:p/>
-    <w:p>
-      <w:r>
-        <w:t xml:space="preserve">    </w:t>
-      </w:r>
-      <w:proofErr w:type="spellStart"/>
-      <w:r>
-        <w:t>display_order</w:t>
-      </w:r>
-      <w:proofErr w:type="spellEnd"/>
-      <w:r>
-        <w:t xml:space="preserve"> INTEGER NOT NULL DEFAULT 1,</w:t>
-      </w:r>
-    </w:p>
-    <w:p/>
-    <w:p>
-      <w:r>
-        <w:t xml:space="preserve">    </w:t>
-      </w:r>
-      <w:proofErr w:type="spellStart"/>
-      <w:r>
-        <w:t>is_active</w:t>
-      </w:r>
-      <w:proofErr w:type="spellEnd"/>
-      <w:r>
-        <w:t xml:space="preserve"> BOOLEAN NOT NULL DEFAULT TRUE,</w:t>
-      </w:r>
-    </w:p>
-    <w:p/>
-    <w:p>
-      <w:r>
-        <w:t xml:space="preserve">    </w:t>
-      </w:r>
-      <w:proofErr w:type="spellStart"/>
-      <w:r>
-        <w:t>created_at</w:t>
-      </w:r>
-      <w:proofErr w:type="spellEnd"/>
-      <w:r>
-        <w:t xml:space="preserve"> TIMESTAMPTZ NOT NULL DEFAULT CURRENT_TIMESTAMP,</w:t>
-      </w:r>
-    </w:p>
-    <w:p/>
-    <w:p>
-      <w:r>
-        <w:t xml:space="preserve">    </w:t>
-      </w:r>
-      <w:proofErr w:type="spellStart"/>
-      <w:r>
-        <w:t>updated_at</w:t>
-      </w:r>
-      <w:proofErr w:type="spellEnd"/>
-      <w:r>
-        <w:t xml:space="preserve"> TIMESTAMPTZ NOT NULL DEFAULT CURRENT_TIMESTAMP,</w:t>
+        <w:t xml:space="preserve">    is_featured BOOLEAN NOT NULL DEFAULT FALSE,</w:t>
+      </w:r>
+    </w:p>
+    <w:p/>
+    <w:p>
+      <w:r>
+        <w:t xml:space="preserve">    display_order INTEGER NOT NULL DEFAULT 1,</w:t>
+      </w:r>
+    </w:p>
+    <w:p/>
+    <w:p>
+      <w:r>
+        <w:t xml:space="preserve">    is_active BOOLEAN NOT NULL DEFAULT TRUE,</w:t>
+      </w:r>
+    </w:p>
+    <w:p/>
+    <w:p>
+      <w:r>
+        <w:t xml:space="preserve">    created_at TIMESTAMPTZ NOT NULL DEFAULT CURRENT_TIMESTAMP,</w:t>
+      </w:r>
+    </w:p>
+    <w:p/>
+    <w:p>
+      <w:r>
+        <w:t xml:space="preserve">    updated_at TIMESTAMPTZ NOT NULL DEFAULT CURRENT_TIMESTAMP,</w:t>
       </w:r>
     </w:p>
     <w:p/>
     <w:p>
       <w:r>
         <w:lastRenderedPageBreak/>
-        <w:t xml:space="preserve">    CONSTRAINT </w:t>
-      </w:r>
-      <w:proofErr w:type="spellStart"/>
-      <w:r>
-        <w:t>pk_operational_power_stations</w:t>
-      </w:r>
-      <w:proofErr w:type="spellEnd"/>
+        <w:t xml:space="preserve">    CONSTRAINT pk_operational_power_stations</w:t>
+      </w:r>
     </w:p>
     <w:p>
       <w:r>
@@ -3769,13 +3384,8 @@
     <w:p/>
     <w:p>
       <w:r>
-        <w:t xml:space="preserve">    CONSTRAINT </w:t>
-      </w:r>
-      <w:proofErr w:type="spellStart"/>
-      <w:r>
-        <w:t>uq_operational_power_stations_slug</w:t>
-      </w:r>
-      <w:proofErr w:type="spellEnd"/>
+        <w:t xml:space="preserve">    CONSTRAINT uq_operational_power_stations_slug</w:t>
+      </w:r>
     </w:p>
     <w:p>
       <w:r>
@@ -3785,25 +3395,12 @@
     <w:p/>
     <w:p>
       <w:r>
-        <w:t xml:space="preserve">    CONSTRAINT </w:t>
-      </w:r>
-      <w:proofErr w:type="spellStart"/>
-      <w:r>
-        <w:t>fk_ops_state</w:t>
-      </w:r>
-      <w:proofErr w:type="spellEnd"/>
-    </w:p>
-    <w:p>
-      <w:r>
-        <w:t xml:space="preserve">        FOREIGN KEY (</w:t>
-      </w:r>
-      <w:proofErr w:type="spellStart"/>
-      <w:r>
-        <w:t>state_id</w:t>
-      </w:r>
-      <w:proofErr w:type="spellEnd"/>
-      <w:r>
-        <w:t>)</w:t>
+        <w:t xml:space="preserve">    CONSTRAINT fk_ops_state</w:t>
+      </w:r>
+    </w:p>
+    <w:p>
+      <w:r>
+        <w:t xml:space="preserve">        FOREIGN KEY (state_id)</w:t>
       </w:r>
     </w:p>
     <w:p>
@@ -3814,99 +3411,44 @@
     <w:p/>
     <w:p>
       <w:r>
-        <w:t xml:space="preserve">    CONSTRAINT </w:t>
-      </w:r>
-      <w:proofErr w:type="spellStart"/>
-      <w:r>
-        <w:t>fk_ops_project_type</w:t>
-      </w:r>
-      <w:proofErr w:type="spellEnd"/>
-    </w:p>
-    <w:p>
-      <w:r>
-        <w:t xml:space="preserve">        FOREIGN KEY (</w:t>
-      </w:r>
-      <w:proofErr w:type="spellStart"/>
-      <w:r>
-        <w:t>project_type_id</w:t>
-      </w:r>
-      <w:proofErr w:type="spellEnd"/>
-      <w:r>
-        <w:t>)</w:t>
-      </w:r>
-    </w:p>
-    <w:p>
-      <w:r>
-        <w:t xml:space="preserve">        REFERENCES </w:t>
-      </w:r>
-      <w:proofErr w:type="spellStart"/>
-      <w:r>
-        <w:t>project_types</w:t>
-      </w:r>
-      <w:proofErr w:type="spellEnd"/>
-      <w:r>
-        <w:t>(id),</w:t>
-      </w:r>
-    </w:p>
-    <w:p/>
-    <w:p>
-      <w:r>
-        <w:t xml:space="preserve">    CONSTRAINT </w:t>
-      </w:r>
-      <w:proofErr w:type="spellStart"/>
-      <w:r>
-        <w:t>fk_ops_capacity_unit</w:t>
-      </w:r>
-      <w:proofErr w:type="spellEnd"/>
-    </w:p>
-    <w:p>
-      <w:r>
-        <w:t xml:space="preserve">        FOREIGN KEY (</w:t>
-      </w:r>
-      <w:proofErr w:type="spellStart"/>
-      <w:r>
-        <w:t>capacity_unit_id</w:t>
-      </w:r>
-      <w:proofErr w:type="spellEnd"/>
-      <w:r>
-        <w:t>)</w:t>
-      </w:r>
-    </w:p>
-    <w:p>
-      <w:r>
-        <w:t xml:space="preserve">        REFERENCES </w:t>
-      </w:r>
-      <w:proofErr w:type="spellStart"/>
-      <w:r>
-        <w:t>capacity_units</w:t>
-      </w:r>
-      <w:proofErr w:type="spellEnd"/>
-      <w:r>
-        <w:t>(id),</w:t>
-      </w:r>
-    </w:p>
-    <w:p/>
-    <w:p>
-      <w:r>
-        <w:t xml:space="preserve">    CONSTRAINT </w:t>
-      </w:r>
-      <w:proofErr w:type="spellStart"/>
-      <w:r>
-        <w:t>chk_ops_display_order</w:t>
-      </w:r>
-      <w:proofErr w:type="spellEnd"/>
-    </w:p>
-    <w:p>
-      <w:r>
-        <w:t xml:space="preserve">        CHECK (</w:t>
-      </w:r>
-      <w:proofErr w:type="spellStart"/>
-      <w:r>
-        <w:t>display_order</w:t>
-      </w:r>
-      <w:proofErr w:type="spellEnd"/>
-      <w:r>
-        <w:t xml:space="preserve"> &gt; 0)</w:t>
+        <w:t xml:space="preserve">    CONSTRAINT fk_ops_project_type</w:t>
+      </w:r>
+    </w:p>
+    <w:p>
+      <w:r>
+        <w:t xml:space="preserve">        FOREIGN KEY (project_type_id)</w:t>
+      </w:r>
+    </w:p>
+    <w:p>
+      <w:r>
+        <w:t xml:space="preserve">        REFERENCES project_types(id),</w:t>
+      </w:r>
+    </w:p>
+    <w:p/>
+    <w:p>
+      <w:r>
+        <w:t xml:space="preserve">    CONSTRAINT fk_ops_capacity_unit</w:t>
+      </w:r>
+    </w:p>
+    <w:p>
+      <w:r>
+        <w:t xml:space="preserve">        FOREIGN KEY (capacity_unit_id)</w:t>
+      </w:r>
+    </w:p>
+    <w:p>
+      <w:r>
+        <w:t xml:space="preserve">        REFERENCES capacity_units(id),</w:t>
+      </w:r>
+    </w:p>
+    <w:p/>
+    <w:p>
+      <w:r>
+        <w:t xml:space="preserve">    CONSTRAINT chk_ops_display_order</w:t>
+      </w:r>
+    </w:p>
+    <w:p>
+      <w:r>
+        <w:t xml:space="preserve">        CHECK (display_order &gt; 0)</w:t>
       </w:r>
     </w:p>
     <w:p/>
@@ -3918,175 +3460,68 @@
     <w:p/>
     <w:p>
       <w:r>
-        <w:t xml:space="preserve">CREATE INDEX </w:t>
-      </w:r>
-      <w:proofErr w:type="spellStart"/>
-      <w:r>
-        <w:t>idx_ops_slug</w:t>
-      </w:r>
-      <w:proofErr w:type="spellEnd"/>
-    </w:p>
-    <w:p>
-      <w:r>
-        <w:t xml:space="preserve">ON </w:t>
-      </w:r>
-      <w:proofErr w:type="spellStart"/>
-      <w:r>
-        <w:t>operational_power_stations</w:t>
-      </w:r>
-      <w:proofErr w:type="spellEnd"/>
-      <w:r>
-        <w:t>(slug);</w:t>
-      </w:r>
-    </w:p>
-    <w:p/>
-    <w:p>
-      <w:r>
-        <w:t xml:space="preserve">CREATE INDEX </w:t>
-      </w:r>
-      <w:proofErr w:type="spellStart"/>
-      <w:r>
-        <w:t>idx_ops_state</w:t>
-      </w:r>
-      <w:proofErr w:type="spellEnd"/>
-    </w:p>
-    <w:p>
-      <w:r>
-        <w:t xml:space="preserve">ON </w:t>
-      </w:r>
-      <w:proofErr w:type="spellStart"/>
-      <w:r>
-        <w:t>operational_power_stations</w:t>
-      </w:r>
-      <w:proofErr w:type="spellEnd"/>
-      <w:r>
-        <w:t>(</w:t>
-      </w:r>
-      <w:proofErr w:type="spellStart"/>
-      <w:r>
-        <w:t>state_id</w:t>
-      </w:r>
-      <w:proofErr w:type="spellEnd"/>
-      <w:r>
-        <w:t>);</w:t>
-      </w:r>
-    </w:p>
-    <w:p/>
-    <w:p>
-      <w:r>
-        <w:t xml:space="preserve">CREATE INDEX </w:t>
-      </w:r>
-      <w:proofErr w:type="spellStart"/>
-      <w:r>
-        <w:t>idx_ops_featured</w:t>
-      </w:r>
-      <w:proofErr w:type="spellEnd"/>
-    </w:p>
-    <w:p>
-      <w:r>
-        <w:t xml:space="preserve">ON </w:t>
-      </w:r>
-      <w:proofErr w:type="spellStart"/>
-      <w:r>
-        <w:t>operational_power_stations</w:t>
-      </w:r>
-      <w:proofErr w:type="spellEnd"/>
-      <w:r>
-        <w:t>(</w:t>
-      </w:r>
-      <w:proofErr w:type="spellStart"/>
-      <w:r>
-        <w:t>is_featured</w:t>
-      </w:r>
-      <w:proofErr w:type="spellEnd"/>
-      <w:r>
-        <w:t>);</w:t>
-      </w:r>
-    </w:p>
-    <w:p/>
-    <w:p>
-      <w:r>
-        <w:t xml:space="preserve">CREATE INDEX </w:t>
-      </w:r>
-      <w:proofErr w:type="spellStart"/>
-      <w:r>
-        <w:t>idx_ops_active</w:t>
-      </w:r>
-      <w:proofErr w:type="spellEnd"/>
-    </w:p>
-    <w:p>
-      <w:r>
-        <w:t xml:space="preserve">ON </w:t>
-      </w:r>
-      <w:proofErr w:type="spellStart"/>
-      <w:r>
-        <w:t>operational_power_stations</w:t>
-      </w:r>
-      <w:proofErr w:type="spellEnd"/>
-      <w:r>
-        <w:t>(</w:t>
-      </w:r>
-      <w:proofErr w:type="spellStart"/>
-      <w:r>
-        <w:t>is_active</w:t>
-      </w:r>
-      <w:proofErr w:type="spellEnd"/>
-      <w:r>
-        <w:t>);</w:t>
-      </w:r>
-    </w:p>
-    <w:p/>
-    <w:p>
-      <w:r>
-        <w:t xml:space="preserve">CREATE INDEX </w:t>
-      </w:r>
-      <w:proofErr w:type="spellStart"/>
-      <w:r>
-        <w:t>idx_ops_display_order</w:t>
-      </w:r>
-      <w:proofErr w:type="spellEnd"/>
-    </w:p>
-    <w:p>
-      <w:r>
-        <w:t xml:space="preserve">ON </w:t>
-      </w:r>
-      <w:proofErr w:type="spellStart"/>
-      <w:r>
-        <w:t>operational_power_stations</w:t>
-      </w:r>
-      <w:proofErr w:type="spellEnd"/>
-      <w:r>
-        <w:t>(</w:t>
-      </w:r>
-      <w:proofErr w:type="spellStart"/>
-      <w:r>
-        <w:t>display_order</w:t>
-      </w:r>
-      <w:proofErr w:type="spellEnd"/>
-      <w:r>
-        <w:t>);</w:t>
-      </w:r>
-    </w:p>
-    <w:p/>
-    <w:p>
-      <w:r>
-        <w:t xml:space="preserve">CREATE TRIGGER </w:t>
-      </w:r>
-      <w:proofErr w:type="spellStart"/>
-      <w:r>
-        <w:t>trg_operational_power_stations_updated_at</w:t>
-      </w:r>
-      <w:proofErr w:type="spellEnd"/>
-    </w:p>
-    <w:p>
-      <w:r>
-        <w:t xml:space="preserve">BEFORE UPDATE ON </w:t>
-      </w:r>
-      <w:proofErr w:type="spellStart"/>
-      <w:r>
-        <w:t>operational_power_stations</w:t>
-      </w:r>
-      <w:proofErr w:type="spellEnd"/>
+        <w:t>CREATE INDEX idx_ops_slug</w:t>
+      </w:r>
+    </w:p>
+    <w:p>
+      <w:r>
+        <w:t>ON operational_power_stations(slug);</w:t>
+      </w:r>
+    </w:p>
+    <w:p/>
+    <w:p>
+      <w:r>
+        <w:t>CREATE INDEX idx_ops_state</w:t>
+      </w:r>
+    </w:p>
+    <w:p>
+      <w:r>
+        <w:t>ON operational_power_stations(state_id);</w:t>
+      </w:r>
+    </w:p>
+    <w:p/>
+    <w:p>
+      <w:r>
+        <w:t>CREATE INDEX idx_ops_featured</w:t>
+      </w:r>
+    </w:p>
+    <w:p>
+      <w:r>
+        <w:t>ON operational_power_stations(is_featured);</w:t>
+      </w:r>
+    </w:p>
+    <w:p/>
+    <w:p>
+      <w:r>
+        <w:t>CREATE INDEX idx_ops_active</w:t>
+      </w:r>
+    </w:p>
+    <w:p>
+      <w:r>
+        <w:t>ON operational_power_stations(is_active);</w:t>
+      </w:r>
+    </w:p>
+    <w:p/>
+    <w:p>
+      <w:r>
+        <w:t>CREATE INDEX idx_ops_display_order</w:t>
+      </w:r>
+    </w:p>
+    <w:p>
+      <w:r>
+        <w:t>ON operational_power_stations(display_order);</w:t>
+      </w:r>
+    </w:p>
+    <w:p/>
+    <w:p>
+      <w:r>
+        <w:t>CREATE TRIGGER trg_operational_power_stations_updated_at</w:t>
+      </w:r>
+    </w:p>
+    <w:p>
+      <w:r>
+        <w:t>BEFORE UPDATE ON operational_power_stations</w:t>
+      </w:r>
     </w:p>
     <w:p>
       <w:r>
@@ -4095,23 +3530,7 @@
     </w:p>
     <w:p>
       <w:r>
-        <w:t xml:space="preserve">EXECUTE FUNCTION </w:t>
-      </w:r>
-      <w:proofErr w:type="spellStart"/>
-      <w:r>
-        <w:t>fn_update_updated_</w:t>
-      </w:r>
-      <w:proofErr w:type="gramStart"/>
-      <w:r>
-        <w:t>at</w:t>
-      </w:r>
-      <w:proofErr w:type="spellEnd"/>
-      <w:r>
-        <w:t>(</w:t>
-      </w:r>
-      <w:proofErr w:type="gramEnd"/>
-      <w:r>
-        <w:t>);</w:t>
+        <w:t>EXECUTE FUNCTION fn_update_updated_at();</w:t>
       </w:r>
     </w:p>
     <w:p>
@@ -4297,15 +3716,7 @@
           </w:tcPr>
           <w:p>
             <w:r>
-              <w:t xml:space="preserve">2 (settings, </w:t>
-            </w:r>
-            <w:proofErr w:type="spellStart"/>
-            <w:r>
-              <w:t>audit_logs</w:t>
-            </w:r>
-            <w:proofErr w:type="spellEnd"/>
-            <w:r>
-              <w:t>)</w:t>
+              <w:t>2 (settings, audit_logs)</w:t>
             </w:r>
           </w:p>
         </w:tc>
@@ -4493,14 +3904,7 @@
       </w:r>
       <w:r>
         <w:br/>
-      </w:r>
-      <w:proofErr w:type="spellStart"/>
-      <w:r>
-        <w:t>db</w:t>
-      </w:r>
-      <w:proofErr w:type="spellEnd"/>
-      <w:r>
-        <w:t xml:space="preserve"> pull</w:t>
+        <w:t>db pull</w:t>
       </w:r>
       <w:r>
         <w:br/>
@@ -4508,16 +3912,7 @@
       </w:r>
       <w:r>
         <w:br/>
-      </w:r>
-      <w:proofErr w:type="spellStart"/>
-      <w:proofErr w:type="gramStart"/>
-      <w:r>
-        <w:t>schema.prisma</w:t>
-      </w:r>
-      <w:proofErr w:type="spellEnd"/>
-      <w:proofErr w:type="gramEnd"/>
-      <w:r>
-        <w:t xml:space="preserve"> (generated)</w:t>
+        <w:t>schema.prisma (generated)</w:t>
       </w:r>
       <w:r>
         <w:br/>
@@ -4525,14 +3920,7 @@
       </w:r>
       <w:r>
         <w:br/>
-      </w:r>
-      <w:proofErr w:type="spellStart"/>
-      <w:r>
-        <w:t>prisma</w:t>
-      </w:r>
-      <w:proofErr w:type="spellEnd"/>
-      <w:r>
-        <w:t xml:space="preserve"> generate</w:t>
+        <w:t>prisma generate</w:t>
       </w:r>
       <w:r>
         <w:br/>
@@ -4820,7 +4208,6 @@
             <w:hideMark/>
           </w:tcPr>
           <w:p>
-            <w:proofErr w:type="spellStart"/>
             <w:r>
               <w:rPr>
                 <w:b/>
@@ -4828,7 +4215,6 @@
               </w:rPr>
               <w:t>bcrypt</w:t>
             </w:r>
-            <w:proofErr w:type="spellEnd"/>
             <w:r>
               <w:t xml:space="preserve"> (already installed)</w:t>
             </w:r>
@@ -5239,114 +4625,78 @@
             <w:hideMark/>
           </w:tcPr>
           <w:p>
-            <w:proofErr w:type="spellStart"/>
             <w:r>
               <w:t>original_name</w:t>
             </w:r>
-            <w:proofErr w:type="spellEnd"/>
-          </w:p>
-        </w:tc>
-        <w:tc>
-          <w:tcPr>
-            <w:tcW w:w="0" w:type="auto"/>
-            <w:vAlign w:val="center"/>
-            <w:hideMark/>
-          </w:tcPr>
-          <w:p>
-            <w:proofErr w:type="spellStart"/>
-            <w:proofErr w:type="gramStart"/>
-            <w:r>
-              <w:t>getFileMetadata</w:t>
-            </w:r>
-            <w:proofErr w:type="spellEnd"/>
-            <w:r>
-              <w:t>(</w:t>
-            </w:r>
-            <w:proofErr w:type="gramEnd"/>
-            <w:r>
-              <w:t>)</w:t>
-            </w:r>
-          </w:p>
-        </w:tc>
-      </w:tr>
-      <w:tr>
-        <w:trPr>
-          <w:tblCellSpacing w:w="15" w:type="dxa"/>
-        </w:trPr>
-        <w:tc>
-          <w:tcPr>
-            <w:tcW w:w="0" w:type="auto"/>
-            <w:vAlign w:val="center"/>
-            <w:hideMark/>
-          </w:tcPr>
-          <w:p>
-            <w:proofErr w:type="spellStart"/>
+          </w:p>
+        </w:tc>
+        <w:tc>
+          <w:tcPr>
+            <w:tcW w:w="0" w:type="auto"/>
+            <w:vAlign w:val="center"/>
+            <w:hideMark/>
+          </w:tcPr>
+          <w:p>
+            <w:r>
+              <w:t>getFileMetadata()</w:t>
+            </w:r>
+          </w:p>
+        </w:tc>
+      </w:tr>
+      <w:tr>
+        <w:trPr>
+          <w:tblCellSpacing w:w="15" w:type="dxa"/>
+        </w:trPr>
+        <w:tc>
+          <w:tcPr>
+            <w:tcW w:w="0" w:type="auto"/>
+            <w:vAlign w:val="center"/>
+            <w:hideMark/>
+          </w:tcPr>
+          <w:p>
             <w:r>
               <w:t>stored_name</w:t>
             </w:r>
-            <w:proofErr w:type="spellEnd"/>
-          </w:p>
-        </w:tc>
-        <w:tc>
-          <w:tcPr>
-            <w:tcW w:w="0" w:type="auto"/>
-            <w:vAlign w:val="center"/>
-            <w:hideMark/>
-          </w:tcPr>
-          <w:p>
-            <w:proofErr w:type="spellStart"/>
-            <w:proofErr w:type="gramStart"/>
-            <w:r>
-              <w:t>getFileMetadata</w:t>
-            </w:r>
-            <w:proofErr w:type="spellEnd"/>
-            <w:r>
-              <w:t>(</w:t>
-            </w:r>
-            <w:proofErr w:type="gramEnd"/>
-            <w:r>
-              <w:t>)</w:t>
-            </w:r>
-          </w:p>
-        </w:tc>
-      </w:tr>
-      <w:tr>
-        <w:trPr>
-          <w:tblCellSpacing w:w="15" w:type="dxa"/>
-        </w:trPr>
-        <w:tc>
-          <w:tcPr>
-            <w:tcW w:w="0" w:type="auto"/>
-            <w:vAlign w:val="center"/>
-            <w:hideMark/>
-          </w:tcPr>
-          <w:p>
-            <w:proofErr w:type="spellStart"/>
+          </w:p>
+        </w:tc>
+        <w:tc>
+          <w:tcPr>
+            <w:tcW w:w="0" w:type="auto"/>
+            <w:vAlign w:val="center"/>
+            <w:hideMark/>
+          </w:tcPr>
+          <w:p>
+            <w:r>
+              <w:t>getFileMetadata()</w:t>
+            </w:r>
+          </w:p>
+        </w:tc>
+      </w:tr>
+      <w:tr>
+        <w:trPr>
+          <w:tblCellSpacing w:w="15" w:type="dxa"/>
+        </w:trPr>
+        <w:tc>
+          <w:tcPr>
+            <w:tcW w:w="0" w:type="auto"/>
+            <w:vAlign w:val="center"/>
+            <w:hideMark/>
+          </w:tcPr>
+          <w:p>
             <w:r>
               <w:t>mime_type</w:t>
             </w:r>
-            <w:proofErr w:type="spellEnd"/>
-          </w:p>
-        </w:tc>
-        <w:tc>
-          <w:tcPr>
-            <w:tcW w:w="0" w:type="auto"/>
-            <w:vAlign w:val="center"/>
-            <w:hideMark/>
-          </w:tcPr>
-          <w:p>
-            <w:proofErr w:type="spellStart"/>
-            <w:proofErr w:type="gramStart"/>
-            <w:r>
-              <w:t>getFileMetadata</w:t>
-            </w:r>
-            <w:proofErr w:type="spellEnd"/>
-            <w:r>
-              <w:t>(</w:t>
-            </w:r>
-            <w:proofErr w:type="gramEnd"/>
-            <w:r>
-              <w:t>)</w:t>
+          </w:p>
+        </w:tc>
+        <w:tc>
+          <w:tcPr>
+            <w:tcW w:w="0" w:type="auto"/>
+            <w:vAlign w:val="center"/>
+            <w:hideMark/>
+          </w:tcPr>
+          <w:p>
+            <w:r>
+              <w:t>getFileMetadata()</w:t>
             </w:r>
           </w:p>
         </w:tc>
@@ -5374,141 +4724,95 @@
             <w:hideMark/>
           </w:tcPr>
           <w:p>
-            <w:proofErr w:type="spellStart"/>
-            <w:proofErr w:type="gramStart"/>
-            <w:r>
-              <w:t>getFileMetadata</w:t>
-            </w:r>
-            <w:proofErr w:type="spellEnd"/>
-            <w:r>
-              <w:t>(</w:t>
-            </w:r>
-            <w:proofErr w:type="gramEnd"/>
-            <w:r>
-              <w:t>)</w:t>
-            </w:r>
-          </w:p>
-        </w:tc>
-      </w:tr>
-      <w:tr>
-        <w:trPr>
-          <w:tblCellSpacing w:w="15" w:type="dxa"/>
-        </w:trPr>
-        <w:tc>
-          <w:tcPr>
-            <w:tcW w:w="0" w:type="auto"/>
-            <w:vAlign w:val="center"/>
-            <w:hideMark/>
-          </w:tcPr>
-          <w:p>
-            <w:proofErr w:type="spellStart"/>
+            <w:r>
+              <w:t>getFileMetadata()</w:t>
+            </w:r>
+          </w:p>
+        </w:tc>
+      </w:tr>
+      <w:tr>
+        <w:trPr>
+          <w:tblCellSpacing w:w="15" w:type="dxa"/>
+        </w:trPr>
+        <w:tc>
+          <w:tcPr>
+            <w:tcW w:w="0" w:type="auto"/>
+            <w:vAlign w:val="center"/>
+            <w:hideMark/>
+          </w:tcPr>
+          <w:p>
             <w:r>
               <w:t>size_bytes</w:t>
             </w:r>
-            <w:proofErr w:type="spellEnd"/>
-          </w:p>
-        </w:tc>
-        <w:tc>
-          <w:tcPr>
-            <w:tcW w:w="0" w:type="auto"/>
-            <w:vAlign w:val="center"/>
-            <w:hideMark/>
-          </w:tcPr>
-          <w:p>
-            <w:proofErr w:type="spellStart"/>
-            <w:proofErr w:type="gramStart"/>
-            <w:r>
-              <w:t>getFileMetadata</w:t>
-            </w:r>
-            <w:proofErr w:type="spellEnd"/>
-            <w:r>
-              <w:t>(</w:t>
-            </w:r>
-            <w:proofErr w:type="gramEnd"/>
-            <w:r>
-              <w:t>)</w:t>
-            </w:r>
-          </w:p>
-        </w:tc>
-      </w:tr>
-      <w:tr>
-        <w:trPr>
-          <w:tblCellSpacing w:w="15" w:type="dxa"/>
-        </w:trPr>
-        <w:tc>
-          <w:tcPr>
-            <w:tcW w:w="0" w:type="auto"/>
-            <w:vAlign w:val="center"/>
-            <w:hideMark/>
-          </w:tcPr>
-          <w:p>
-            <w:proofErr w:type="spellStart"/>
+          </w:p>
+        </w:tc>
+        <w:tc>
+          <w:tcPr>
+            <w:tcW w:w="0" w:type="auto"/>
+            <w:vAlign w:val="center"/>
+            <w:hideMark/>
+          </w:tcPr>
+          <w:p>
+            <w:r>
+              <w:t>getFileMetadata()</w:t>
+            </w:r>
+          </w:p>
+        </w:tc>
+      </w:tr>
+      <w:tr>
+        <w:trPr>
+          <w:tblCellSpacing w:w="15" w:type="dxa"/>
+        </w:trPr>
+        <w:tc>
+          <w:tcPr>
+            <w:tcW w:w="0" w:type="auto"/>
+            <w:vAlign w:val="center"/>
+            <w:hideMark/>
+          </w:tcPr>
+          <w:p>
             <w:r>
               <w:t>storage_provider</w:t>
             </w:r>
-            <w:proofErr w:type="spellEnd"/>
-          </w:p>
-        </w:tc>
-        <w:tc>
-          <w:tcPr>
-            <w:tcW w:w="0" w:type="auto"/>
-            <w:vAlign w:val="center"/>
-            <w:hideMark/>
-          </w:tcPr>
-          <w:p>
-            <w:proofErr w:type="spellStart"/>
-            <w:proofErr w:type="gramStart"/>
-            <w:r>
-              <w:t>getFileMetadata</w:t>
-            </w:r>
-            <w:proofErr w:type="spellEnd"/>
-            <w:r>
-              <w:t>(</w:t>
-            </w:r>
-            <w:proofErr w:type="gramEnd"/>
-            <w:r>
-              <w:t>)</w:t>
-            </w:r>
-          </w:p>
-        </w:tc>
-      </w:tr>
-      <w:tr>
-        <w:trPr>
-          <w:tblCellSpacing w:w="15" w:type="dxa"/>
-        </w:trPr>
-        <w:tc>
-          <w:tcPr>
-            <w:tcW w:w="0" w:type="auto"/>
-            <w:vAlign w:val="center"/>
-            <w:hideMark/>
-          </w:tcPr>
-          <w:p>
-            <w:proofErr w:type="spellStart"/>
+          </w:p>
+        </w:tc>
+        <w:tc>
+          <w:tcPr>
+            <w:tcW w:w="0" w:type="auto"/>
+            <w:vAlign w:val="center"/>
+            <w:hideMark/>
+          </w:tcPr>
+          <w:p>
+            <w:r>
+              <w:t>getFileMetadata()</w:t>
+            </w:r>
+          </w:p>
+        </w:tc>
+      </w:tr>
+      <w:tr>
+        <w:trPr>
+          <w:tblCellSpacing w:w="15" w:type="dxa"/>
+        </w:trPr>
+        <w:tc>
+          <w:tcPr>
+            <w:tcW w:w="0" w:type="auto"/>
+            <w:vAlign w:val="center"/>
+            <w:hideMark/>
+          </w:tcPr>
+          <w:p>
             <w:r>
               <w:t>storage_path</w:t>
             </w:r>
-            <w:proofErr w:type="spellEnd"/>
-          </w:p>
-        </w:tc>
-        <w:tc>
-          <w:tcPr>
-            <w:tcW w:w="0" w:type="auto"/>
-            <w:vAlign w:val="center"/>
-            <w:hideMark/>
-          </w:tcPr>
-          <w:p>
-            <w:proofErr w:type="spellStart"/>
-            <w:proofErr w:type="gramStart"/>
-            <w:r>
-              <w:t>getFileMetadata</w:t>
-            </w:r>
-            <w:proofErr w:type="spellEnd"/>
-            <w:r>
-              <w:t>(</w:t>
-            </w:r>
-            <w:proofErr w:type="gramEnd"/>
-            <w:r>
-              <w:t>)</w:t>
+          </w:p>
+        </w:tc>
+        <w:tc>
+          <w:tcPr>
+            <w:tcW w:w="0" w:type="auto"/>
+            <w:vAlign w:val="center"/>
+            <w:hideMark/>
+          </w:tcPr>
+          <w:p>
+            <w:r>
+              <w:t>getFileMetadata()</w:t>
             </w:r>
           </w:p>
         </w:tc>
@@ -5536,18 +4840,8 @@
             <w:hideMark/>
           </w:tcPr>
           <w:p>
-            <w:proofErr w:type="spellStart"/>
-            <w:proofErr w:type="gramStart"/>
-            <w:r>
-              <w:t>extractMetadata</w:t>
-            </w:r>
-            <w:proofErr w:type="spellEnd"/>
-            <w:r>
-              <w:t>(</w:t>
-            </w:r>
-            <w:proofErr w:type="gramEnd"/>
-            <w:r>
-              <w:t>)</w:t>
+            <w:r>
+              <w:t>extractMetadata()</w:t>
             </w:r>
           </w:p>
         </w:tc>
@@ -5575,79 +4869,55 @@
             <w:hideMark/>
           </w:tcPr>
           <w:p>
-            <w:proofErr w:type="spellStart"/>
-            <w:proofErr w:type="gramStart"/>
-            <w:r>
-              <w:t>extractMetadata</w:t>
-            </w:r>
-            <w:proofErr w:type="spellEnd"/>
-            <w:r>
-              <w:t>(</w:t>
-            </w:r>
-            <w:proofErr w:type="gramEnd"/>
-            <w:r>
-              <w:t>)</w:t>
-            </w:r>
-          </w:p>
-        </w:tc>
-      </w:tr>
-      <w:tr>
-        <w:trPr>
-          <w:tblCellSpacing w:w="15" w:type="dxa"/>
-        </w:trPr>
-        <w:tc>
-          <w:tcPr>
-            <w:tcW w:w="0" w:type="auto"/>
-            <w:vAlign w:val="center"/>
-            <w:hideMark/>
-          </w:tcPr>
-          <w:p>
-            <w:proofErr w:type="spellStart"/>
+            <w:r>
+              <w:t>extractMetadata()</w:t>
+            </w:r>
+          </w:p>
+        </w:tc>
+      </w:tr>
+      <w:tr>
+        <w:trPr>
+          <w:tblCellSpacing w:w="15" w:type="dxa"/>
+        </w:trPr>
+        <w:tc>
+          <w:tcPr>
+            <w:tcW w:w="0" w:type="auto"/>
+            <w:vAlign w:val="center"/>
+            <w:hideMark/>
+          </w:tcPr>
+          <w:p>
             <w:r>
               <w:t>duration_seconds</w:t>
             </w:r>
-            <w:proofErr w:type="spellEnd"/>
-          </w:p>
-        </w:tc>
-        <w:tc>
-          <w:tcPr>
-            <w:tcW w:w="0" w:type="auto"/>
-            <w:vAlign w:val="center"/>
-            <w:hideMark/>
-          </w:tcPr>
-          <w:p>
-            <w:proofErr w:type="spellStart"/>
-            <w:proofErr w:type="gramStart"/>
-            <w:r>
-              <w:t>extractMetadata</w:t>
-            </w:r>
-            <w:proofErr w:type="spellEnd"/>
-            <w:r>
-              <w:t>(</w:t>
-            </w:r>
-            <w:proofErr w:type="gramEnd"/>
-            <w:r>
-              <w:t>)</w:t>
-            </w:r>
-          </w:p>
-        </w:tc>
-      </w:tr>
-      <w:tr>
-        <w:trPr>
-          <w:tblCellSpacing w:w="15" w:type="dxa"/>
-        </w:trPr>
-        <w:tc>
-          <w:tcPr>
-            <w:tcW w:w="0" w:type="auto"/>
-            <w:vAlign w:val="center"/>
-            <w:hideMark/>
-          </w:tcPr>
-          <w:p>
-            <w:proofErr w:type="spellStart"/>
+          </w:p>
+        </w:tc>
+        <w:tc>
+          <w:tcPr>
+            <w:tcW w:w="0" w:type="auto"/>
+            <w:vAlign w:val="center"/>
+            <w:hideMark/>
+          </w:tcPr>
+          <w:p>
+            <w:r>
+              <w:t>extractMetadata()</w:t>
+            </w:r>
+          </w:p>
+        </w:tc>
+      </w:tr>
+      <w:tr>
+        <w:trPr>
+          <w:tblCellSpacing w:w="15" w:type="dxa"/>
+        </w:trPr>
+        <w:tc>
+          <w:tcPr>
+            <w:tcW w:w="0" w:type="auto"/>
+            <w:vAlign w:val="center"/>
+            <w:hideMark/>
+          </w:tcPr>
+          <w:p>
             <w:r>
               <w:t>folder_id</w:t>
             </w:r>
-            <w:proofErr w:type="spellEnd"/>
           </w:p>
         </w:tc>
         <w:tc>
@@ -5674,12 +4944,10 @@
             <w:hideMark/>
           </w:tcPr>
           <w:p>
-            <w:proofErr w:type="spellStart"/>
             <w:r>
               <w:lastRenderedPageBreak/>
               <w:t>alt_text</w:t>
             </w:r>
-            <w:proofErr w:type="spellEnd"/>
           </w:p>
         </w:tc>
         <w:tc>
@@ -5735,11 +5003,9 @@
             <w:hideMark/>
           </w:tcPr>
           <w:p>
-            <w:proofErr w:type="spellStart"/>
             <w:r>
               <w:t>uploaded_by</w:t>
             </w:r>
-            <w:proofErr w:type="spellEnd"/>
           </w:p>
         </w:tc>
         <w:tc>
@@ -5938,13 +5204,8 @@
     <w:p/>
     <w:p>
       <w:r>
-        <w:t xml:space="preserve">[ </w:t>
-      </w:r>
-      <w:proofErr w:type="gramStart"/>
-      <w:r>
-        <w:t>Upload ]</w:t>
-      </w:r>
-      <w:proofErr w:type="gramEnd"/>
+        <w:t>[ Upload ]</w:t>
+      </w:r>
     </w:p>
     <w:p/>
     <w:p>
@@ -5955,13 +5216,8 @@
     <w:p/>
     <w:p>
       <w:r>
-        <w:t xml:space="preserve">[ </w:t>
-      </w:r>
-      <w:proofErr w:type="gramStart"/>
-      <w:r>
-        <w:t>Upload ]</w:t>
-      </w:r>
-      <w:proofErr w:type="gramEnd"/>
+        <w:t>[ Upload ]</w:t>
+      </w:r>
     </w:p>
     <w:p/>
     <w:p>
@@ -6213,145 +5469,819 @@
           <w:sz w:val="28"/>
           <w:szCs w:val="28"/>
         </w:rPr>
-        <w:t xml:space="preserve"> </w:t>
-      </w:r>
-      <w:proofErr w:type="spellStart"/>
-      <w:r>
+        <w:t xml:space="preserve"> jul</w:t>
+      </w:r>
+    </w:p>
+    <w:p/>
+    <w:p>
+      <w:r>
+        <w:t xml:space="preserve">Authentication              </w:t>
+      </w:r>
+      <w:r>
+        <w:rPr>
+          <w:rFonts w:ascii="Segoe UI Emoji" w:hAnsi="Segoe UI Emoji" w:cs="Segoe UI Emoji"/>
+        </w:rPr>
+        <w:t>✅</w:t>
+      </w:r>
+      <w:r>
+        <w:t xml:space="preserve"> 100%</w:t>
+      </w:r>
+    </w:p>
+    <w:p>
+      <w:r>
+        <w:t xml:space="preserve">Public APIs                 </w:t>
+      </w:r>
+      <w:r>
+        <w:rPr>
+          <w:rFonts w:ascii="Segoe UI Emoji" w:hAnsi="Segoe UI Emoji" w:cs="Segoe UI Emoji"/>
+        </w:rPr>
+        <w:t>✅</w:t>
+      </w:r>
+      <w:r>
+        <w:t xml:space="preserve"> 100%</w:t>
+      </w:r>
+    </w:p>
+    <w:p>
+      <w:r>
+        <w:t xml:space="preserve">Admin CRUD                  </w:t>
+      </w:r>
+      <w:r>
+        <w:rPr>
+          <w:rFonts w:ascii="Segoe UI Emoji" w:hAnsi="Segoe UI Emoji" w:cs="Segoe UI Emoji"/>
+        </w:rPr>
+        <w:t>✅</w:t>
+      </w:r>
+      <w:r>
+        <w:t xml:space="preserve"> 100%</w:t>
+      </w:r>
+    </w:p>
+    <w:p>
+      <w:r>
+        <w:t xml:space="preserve">Validation                  </w:t>
+      </w:r>
+      <w:r>
+        <w:rPr>
+          <w:rFonts w:ascii="Segoe UI Emoji" w:hAnsi="Segoe UI Emoji" w:cs="Segoe UI Emoji"/>
+        </w:rPr>
+        <w:t>✅</w:t>
+      </w:r>
+      <w:r>
+        <w:t xml:space="preserve"> 100%</w:t>
+      </w:r>
+    </w:p>
+    <w:p>
+      <w:r>
+        <w:t xml:space="preserve">Repository Pattern          </w:t>
+      </w:r>
+      <w:r>
+        <w:rPr>
+          <w:rFonts w:ascii="Segoe UI Emoji" w:hAnsi="Segoe UI Emoji" w:cs="Segoe UI Emoji"/>
+        </w:rPr>
+        <w:t>✅</w:t>
+      </w:r>
+      <w:r>
+        <w:t xml:space="preserve"> 100%</w:t>
+      </w:r>
+    </w:p>
+    <w:p>
+      <w:r>
+        <w:t xml:space="preserve">Pagination                  </w:t>
+      </w:r>
+      <w:r>
+        <w:rPr>
+          <w:rFonts w:ascii="Segoe UI Emoji" w:hAnsi="Segoe UI Emoji" w:cs="Segoe UI Emoji"/>
+        </w:rPr>
+        <w:t>✅</w:t>
+      </w:r>
+      <w:r>
+        <w:t xml:space="preserve"> 100%</w:t>
+      </w:r>
+    </w:p>
+    <w:p/>
+    <w:p>
+      <w:r>
+        <w:t xml:space="preserve">Media Upload                </w:t>
+      </w:r>
+      <w:r>
+        <w:rPr>
+          <w:rFonts w:ascii="Segoe UI Emoji" w:hAnsi="Segoe UI Emoji" w:cs="Segoe UI Emoji"/>
+        </w:rPr>
+        <w:t>❌</w:t>
+      </w:r>
+    </w:p>
+    <w:p>
+      <w:r>
+        <w:t xml:space="preserve">Dashboard                   </w:t>
+      </w:r>
+      <w:r>
+        <w:rPr>
+          <w:rFonts w:ascii="Segoe UI Emoji" w:hAnsi="Segoe UI Emoji" w:cs="Segoe UI Emoji"/>
+        </w:rPr>
+        <w:t>❌</w:t>
+      </w:r>
+    </w:p>
+    <w:p>
+      <w:r>
+        <w:t xml:space="preserve">Lookup APIs                 </w:t>
+      </w:r>
+      <w:r>
+        <w:rPr>
+          <w:rFonts w:ascii="Segoe UI Emoji" w:hAnsi="Segoe UI Emoji" w:cs="Segoe UI Emoji"/>
+        </w:rPr>
+        <w:t>❌</w:t>
+      </w:r>
+    </w:p>
+    <w:p/>
+    <w:p>
+      <w:r>
+        <w:t>Overall Backend:            ~95%</w:t>
+      </w:r>
+    </w:p>
+    <w:p>
+      <w:pPr>
+        <w:pBdr>
+          <w:bottom w:val="double" w:sz="6" w:space="1" w:color="auto"/>
+        </w:pBdr>
+      </w:pPr>
+    </w:p>
+    <w:p/>
+    <w:p>
+      <w:pPr>
         <w:rPr>
           <w:b/>
           <w:bCs/>
-          <w:sz w:val="28"/>
-          <w:szCs w:val="28"/>
-        </w:rPr>
-        <w:t>jul</w:t>
-      </w:r>
-      <w:proofErr w:type="spellEnd"/>
-    </w:p>
-    <w:p/>
-    <w:p>
-      <w:r>
-        <w:t xml:space="preserve">Authentication              </w:t>
+        </w:rPr>
+      </w:pPr>
+      <w:r>
+        <w:rPr>
+          <w:b/>
+          <w:bCs/>
+        </w:rPr>
+        <w:t>Priority 1 — Media Module (Most Important)</w:t>
+      </w:r>
+    </w:p>
+    <w:p>
+      <w:r>
+        <w:t>Right now every module expects something like</w:t>
+      </w:r>
+    </w:p>
+    <w:p>
+      <w:r>
+        <w:t>{</w:t>
+      </w:r>
+    </w:p>
+    <w:p>
+      <w:r>
+        <w:lastRenderedPageBreak/>
+        <w:t xml:space="preserve">    "media_file_id": 5</w:t>
+      </w:r>
+    </w:p>
+    <w:p>
+      <w:r>
+        <w:t>}</w:t>
+      </w:r>
+    </w:p>
+    <w:p>
+      <w:r>
+        <w:t xml:space="preserve">But there is </w:t>
+      </w:r>
+      <w:r>
+        <w:rPr>
+          <w:b/>
+          <w:bCs/>
+        </w:rPr>
+        <w:t>no way for an admin to upload a file</w:t>
+      </w:r>
+      <w:r>
+        <w:t>.</w:t>
+      </w:r>
+    </w:p>
+    <w:p>
+      <w:r>
+        <w:t>This should be the next module.</w:t>
+      </w:r>
+    </w:p>
+    <w:p>
+      <w:r>
+        <w:t>Example:</w:t>
+      </w:r>
+    </w:p>
+    <w:p>
+      <w:r>
+        <w:t>POST /admin/media/upload</w:t>
+      </w:r>
+    </w:p>
+    <w:p>
+      <w:r>
+        <w:t>Accepts</w:t>
+      </w:r>
+    </w:p>
+    <w:p>
+      <w:r>
+        <w:t>multipart/form-data</w:t>
+      </w:r>
+    </w:p>
+    <w:p>
+      <w:r>
+        <w:t>Returns</w:t>
+      </w:r>
+    </w:p>
+    <w:p>
+      <w:r>
+        <w:t>{</w:t>
+      </w:r>
+    </w:p>
+    <w:p>
+      <w:r>
+        <w:t xml:space="preserve">    "id": 17,</w:t>
+      </w:r>
+    </w:p>
+    <w:p>
+      <w:r>
+        <w:t xml:space="preserve">    "url": "...",</w:t>
+      </w:r>
+    </w:p>
+    <w:p>
+      <w:r>
+        <w:t xml:space="preserve">    "originalName": "...",</w:t>
+      </w:r>
+    </w:p>
+    <w:p>
+      <w:r>
+        <w:t xml:space="preserve">    "mimeType": "...",</w:t>
+      </w:r>
+    </w:p>
+    <w:p>
+      <w:r>
+        <w:t xml:space="preserve">    "size": ...</w:t>
+      </w:r>
+    </w:p>
+    <w:p>
+      <w:r>
+        <w:t>}</w:t>
+      </w:r>
+    </w:p>
+    <w:p>
+      <w:r>
+        <w:t>Then the frontend simply sends</w:t>
+      </w:r>
+    </w:p>
+    <w:p>
+      <w:r>
+        <w:t>"media_file_id":17</w:t>
+      </w:r>
+    </w:p>
+    <w:p>
+      <w:r>
+        <w:t>This is probably the single biggest missing piece of the CMS.</w:t>
+      </w:r>
+    </w:p>
+    <w:p>
+      <w:r>
+        <w:pict w14:anchorId="5D81343D">
+          <v:rect id="_x0000_i1076" style="width:0;height:1.5pt" o:hralign="center" o:hrstd="t" o:hr="t" fillcolor="#a0a0a0" stroked="f"/>
+        </w:pict>
+      </w:r>
+    </w:p>
+    <w:p>
+      <w:pPr>
+        <w:rPr>
+          <w:b/>
+          <w:bCs/>
+        </w:rPr>
+      </w:pPr>
+      <w:r>
+        <w:rPr>
+          <w:b/>
+          <w:bCs/>
+        </w:rPr>
+        <w:t>Priority 2 — Admin Dashboard</w:t>
+      </w:r>
+    </w:p>
+    <w:p>
+      <w:r>
+        <w:t>Instead of</w:t>
+      </w:r>
+    </w:p>
+    <w:p>
+      <w:r>
+        <w:t>GET /admin/dashboard</w:t>
+      </w:r>
+    </w:p>
+    <w:p>
+      <w:r>
+        <w:t>return</w:t>
+      </w:r>
+    </w:p>
+    <w:p>
+      <w:r>
+        <w:t>{</w:t>
+      </w:r>
+    </w:p>
+    <w:p>
+      <w:r>
+        <w:t xml:space="preserve">    "projects": 14,</w:t>
+      </w:r>
+    </w:p>
+    <w:p>
+      <w:r>
+        <w:t xml:space="preserve">    "news": 36,</w:t>
+      </w:r>
+    </w:p>
+    <w:p>
+      <w:r>
+        <w:t xml:space="preserve">    "careers": 7,</w:t>
+      </w:r>
+    </w:p>
+    <w:p>
+      <w:r>
+        <w:lastRenderedPageBreak/>
+        <w:t xml:space="preserve">    "tenders": 12,</w:t>
+      </w:r>
+    </w:p>
+    <w:p>
+      <w:r>
+        <w:t xml:space="preserve">    "leadership": 18,</w:t>
+      </w:r>
+    </w:p>
+    <w:p>
+      <w:r>
+        <w:t xml:space="preserve">    "investors": 53,</w:t>
+      </w:r>
+    </w:p>
+    <w:p>
+      <w:r>
+        <w:t xml:space="preserve">    "sustainability": 15,</w:t>
+      </w:r>
+    </w:p>
+    <w:p>
+      <w:r>
+        <w:t xml:space="preserve">    "recentNews":[...],</w:t>
+      </w:r>
+    </w:p>
+    <w:p>
+      <w:r>
+        <w:t xml:space="preserve">    "recentProjects":[...]</w:t>
+      </w:r>
+    </w:p>
+    <w:p>
+      <w:r>
+        <w:t>}</w:t>
+      </w:r>
+    </w:p>
+    <w:p>
+      <w:r>
+        <w:t>Very little code.</w:t>
+      </w:r>
+    </w:p>
+    <w:p>
+      <w:r>
+        <w:t>Looks impressive.</w:t>
+      </w:r>
+    </w:p>
+    <w:p>
+      <w:r>
+        <w:pict w14:anchorId="40BDDE07">
+          <v:rect id="_x0000_i1077" style="width:0;height:1.5pt" o:hralign="center" o:hrstd="t" o:hr="t" fillcolor="#a0a0a0" stroked="f"/>
+        </w:pict>
+      </w:r>
+    </w:p>
+    <w:p>
+      <w:pPr>
+        <w:rPr>
+          <w:b/>
+          <w:bCs/>
+        </w:rPr>
+      </w:pPr>
+      <w:r>
+        <w:rPr>
+          <w:b/>
+          <w:bCs/>
+        </w:rPr>
+        <w:t>Priority 3 — Homepage Admin</w:t>
+      </w:r>
+    </w:p>
+    <w:p>
+      <w:r>
+        <w:t>Currently homepage data is seeded.</w:t>
+      </w:r>
+    </w:p>
+    <w:p>
+      <w:r>
+        <w:t>An admin should be able to update</w:t>
+      </w:r>
+    </w:p>
+    <w:p>
+      <w:r>
+        <w:t>Hero</w:t>
+      </w:r>
+    </w:p>
+    <w:p/>
+    <w:p>
+      <w:r>
+        <w:t>Statistics</w:t>
+      </w:r>
+    </w:p>
+    <w:p/>
+    <w:p>
+      <w:r>
+        <w:t>Featured Projects</w:t>
+      </w:r>
+    </w:p>
+    <w:p/>
+    <w:p>
+      <w:r>
+        <w:t>SEO</w:t>
+      </w:r>
+    </w:p>
+    <w:p/>
+    <w:p>
+      <w:r>
+        <w:t>About</w:t>
+      </w:r>
+    </w:p>
+    <w:p/>
+    <w:p>
+      <w:r>
+        <w:t>CTA</w:t>
+      </w:r>
+    </w:p>
+    <w:p>
+      <w:r>
+        <w:t>instead of editing SQL.</w:t>
+      </w:r>
+    </w:p>
+    <w:p>
+      <w:r>
+        <w:pict w14:anchorId="4EFB9287">
+          <v:rect id="_x0000_i1078" style="width:0;height:1.5pt" o:hralign="center" o:hrstd="t" o:hr="t" fillcolor="#a0a0a0" stroked="f"/>
+        </w:pict>
+      </w:r>
+    </w:p>
+    <w:p>
+      <w:pPr>
+        <w:rPr>
+          <w:b/>
+          <w:bCs/>
+        </w:rPr>
+      </w:pPr>
+      <w:r>
+        <w:rPr>
+          <w:b/>
+          <w:bCs/>
+        </w:rPr>
+        <w:t>Priority 4 — Generic Lookup APIs</w:t>
+      </w:r>
+    </w:p>
+    <w:p>
+      <w:r>
+        <w:t>These are needed by the frontend.</w:t>
+      </w:r>
+    </w:p>
+    <w:p>
+      <w:r>
+        <w:lastRenderedPageBreak/>
+        <w:t>Example</w:t>
+      </w:r>
+    </w:p>
+    <w:p>
+      <w:r>
+        <w:t>GET /admin/lookups/project-types</w:t>
+      </w:r>
+    </w:p>
+    <w:p/>
+    <w:p>
+      <w:r>
+        <w:t>GET /admin/lookups/states</w:t>
+      </w:r>
+    </w:p>
+    <w:p/>
+    <w:p>
+      <w:r>
+        <w:t>GET /admin/lookups/news-categories</w:t>
+      </w:r>
+    </w:p>
+    <w:p/>
+    <w:p>
+      <w:r>
+        <w:t>GET /admin/lookups/tender-statuses</w:t>
+      </w:r>
+    </w:p>
+    <w:p/>
+    <w:p>
+      <w:r>
+        <w:t>GET /admin/lookups/tender-categories</w:t>
+      </w:r>
+    </w:p>
+    <w:p/>
+    <w:p>
+      <w:r>
+        <w:t>GET /admin/lookups/employment-types</w:t>
+      </w:r>
+    </w:p>
+    <w:p/>
+    <w:p>
+      <w:r>
+        <w:t>GET /admin/lookups/leadership-levels</w:t>
+      </w:r>
+    </w:p>
+    <w:p/>
+    <w:p>
+      <w:r>
+        <w:t>GET /admin/lookups/sustainability-types</w:t>
+      </w:r>
+    </w:p>
+    <w:p/>
+    <w:p>
+      <w:r>
+        <w:t>GET /admin/lookups/document-types</w:t>
+      </w:r>
+    </w:p>
+    <w:p/>
+    <w:p>
+      <w:r>
+        <w:t>GET /admin/lookups/financial-years</w:t>
+      </w:r>
+    </w:p>
+    <w:p>
+      <w:r>
+        <w:t>Then every dropdown in React loads dynamically.</w:t>
+      </w:r>
+    </w:p>
+    <w:p>
+      <w:r>
+        <w:pict w14:anchorId="243112AC">
+          <v:rect id="_x0000_i1079" style="width:0;height:1.5pt" o:hralign="center" o:hrstd="t" o:hr="t" fillcolor="#a0a0a0" stroked="f"/>
+        </w:pict>
+      </w:r>
+    </w:p>
+    <w:p>
+      <w:pPr>
+        <w:rPr>
+          <w:b/>
+          <w:bCs/>
+        </w:rPr>
+      </w:pPr>
+      <w:r>
+        <w:rPr>
+          <w:b/>
+          <w:bCs/>
+        </w:rPr>
+        <w:t>Priority 5 — File Download</w:t>
+      </w:r>
+    </w:p>
+    <w:p>
+      <w:r>
+        <w:t>GET /media/:id/download</w:t>
+      </w:r>
+    </w:p>
+    <w:p>
+      <w:r>
+        <w:t>or</w:t>
+      </w:r>
+    </w:p>
+    <w:p>
+      <w:r>
+        <w:t>GET /admin/media/:id</w:t>
+      </w:r>
+    </w:p>
+    <w:p>
+      <w:r>
+        <w:pict w14:anchorId="09A60ADB">
+          <v:rect id="_x0000_i1080" style="width:0;height:1.5pt" o:hralign="center" o:hrstd="t" o:hr="t" fillcolor="#a0a0a0" stroked="f"/>
+        </w:pict>
+      </w:r>
+    </w:p>
+    <w:p>
+      <w:pPr>
+        <w:rPr>
+          <w:b/>
+          <w:bCs/>
+        </w:rPr>
+      </w:pPr>
+      <w:r>
+        <w:rPr>
+          <w:b/>
+          <w:bCs/>
+        </w:rPr>
+        <w:t>Priority 6 — Search</w:t>
+      </w:r>
+    </w:p>
+    <w:p>
+      <w:r>
+        <w:lastRenderedPageBreak/>
+        <w:t>For admin tables</w:t>
+      </w:r>
+    </w:p>
+    <w:p>
+      <w:r>
+        <w:t>GET /admin/projects?search=subansiri</w:t>
+      </w:r>
+    </w:p>
+    <w:p/>
+    <w:p>
+      <w:r>
+        <w:t>GET /admin/news?search=solar</w:t>
+      </w:r>
+    </w:p>
+    <w:p/>
+    <w:p>
+      <w:r>
+        <w:t>GET /admin/tenders?status=OPEN</w:t>
+      </w:r>
+    </w:p>
+    <w:p/>
+    <w:p>
+      <w:r>
+        <w:t>GET /admin/careers?employmentType=REGULAR</w:t>
+      </w:r>
+    </w:p>
+    <w:p>
+      <w:r>
+        <w:t>This will make the CMS much more usable.</w:t>
+      </w:r>
+    </w:p>
+    <w:p>
+      <w:r>
+        <w:pict w14:anchorId="41FB3A24">
+          <v:rect id="_x0000_i1081" style="width:0;height:1.5pt" o:hralign="center" o:hrstd="t" o:hr="t" fillcolor="#a0a0a0" stroked="f"/>
+        </w:pict>
+      </w:r>
+    </w:p>
+    <w:p>
+      <w:pPr>
+        <w:rPr>
+          <w:b/>
+          <w:bCs/>
+        </w:rPr>
+      </w:pPr>
+      <w:r>
+        <w:rPr>
+          <w:b/>
+          <w:bCs/>
+        </w:rPr>
+        <w:t>Priority 7 — Bulk Delete</w:t>
+      </w:r>
+    </w:p>
+    <w:p>
+      <w:r>
+        <w:t>Optional</w:t>
+      </w:r>
+    </w:p>
+    <w:p>
+      <w:r>
+        <w:t>DELETE /admin/news</w:t>
+      </w:r>
+    </w:p>
+    <w:p/>
+    <w:p>
+      <w:r>
+        <w:t>body</w:t>
+      </w:r>
+    </w:p>
+    <w:p/>
+    <w:p>
+      <w:r>
+        <w:t>{</w:t>
+      </w:r>
+    </w:p>
+    <w:p>
+      <w:r>
+        <w:t xml:space="preserve">   ids:[4,7,10]</w:t>
+      </w:r>
+    </w:p>
+    <w:p>
+      <w:r>
+        <w:t>}</w:t>
+      </w:r>
+    </w:p>
+    <w:p>
+      <w:r>
+        <w:pict w14:anchorId="5DF254F6">
+          <v:rect id="_x0000_i1082" style="width:0;height:1.5pt" o:hralign="center" o:hrstd="t" o:hr="t" fillcolor="#a0a0a0" stroked="f"/>
+        </w:pict>
+      </w:r>
+    </w:p>
+    <w:p>
+      <w:pPr>
+        <w:rPr>
+          <w:b/>
+          <w:bCs/>
+        </w:rPr>
+      </w:pPr>
+      <w:r>
+        <w:rPr>
+          <w:b/>
+          <w:bCs/>
+        </w:rPr>
+        <w:t>Priority 8 — Audit Logs</w:t>
+      </w:r>
+    </w:p>
+    <w:p>
+      <w:r>
+        <w:t>Probably unnecessary for your deadline.</w:t>
+      </w:r>
+    </w:p>
+    <w:p>
+      <w:r>
+        <w:pict w14:anchorId="34B2520F">
+          <v:rect id="_x0000_i1083" style="width:0;height:1.5pt" o:hralign="center" o:hrstd="t" o:hr="t" fillcolor="#a0a0a0" stroked="f"/>
+        </w:pict>
+      </w:r>
+    </w:p>
+    <w:p>
+      <w:r>
+        <w:t>Instead, finish these three features:</w:t>
+      </w:r>
+    </w:p>
+    <w:p>
+      <w:pPr>
+        <w:numPr>
+          <w:ilvl w:val="0"/>
+          <w:numId w:val="2"/>
+        </w:numPr>
+      </w:pPr>
+      <w:r>
+        <w:rPr>
+          <w:b/>
+          <w:bCs/>
+        </w:rPr>
+        <w:t>Media Upload API</w:t>
+      </w:r>
+      <w:r>
+        <w:t xml:space="preserve"> </w:t>
       </w:r>
       <w:r>
         <w:rPr>
           <w:rFonts w:ascii="Segoe UI Emoji" w:hAnsi="Segoe UI Emoji" w:cs="Segoe UI Emoji"/>
         </w:rPr>
-        <w:t>✅</w:t>
-      </w:r>
-      <w:r>
-        <w:t xml:space="preserve"> 100%</w:t>
-      </w:r>
-    </w:p>
-    <w:p>
-      <w:r>
-        <w:t xml:space="preserve">Public APIs                 </w:t>
+        <w:t>⭐⭐⭐⭐⭐</w:t>
+      </w:r>
+      <w:r>
+        <w:t xml:space="preserve"> </w:t>
+      </w:r>
+    </w:p>
+    <w:p>
+      <w:pPr>
+        <w:numPr>
+          <w:ilvl w:val="0"/>
+          <w:numId w:val="2"/>
+        </w:numPr>
+      </w:pPr>
+      <w:r>
+        <w:rPr>
+          <w:b/>
+          <w:bCs/>
+        </w:rPr>
+        <w:t>Admin Dashboard API</w:t>
+      </w:r>
+      <w:r>
+        <w:t xml:space="preserve"> </w:t>
       </w:r>
       <w:r>
         <w:rPr>
           <w:rFonts w:ascii="Segoe UI Emoji" w:hAnsi="Segoe UI Emoji" w:cs="Segoe UI Emoji"/>
         </w:rPr>
-        <w:t>✅</w:t>
-      </w:r>
-      <w:r>
-        <w:t xml:space="preserve"> 100%</w:t>
-      </w:r>
-    </w:p>
-    <w:p>
-      <w:r>
-        <w:t xml:space="preserve">Admin CRUD                  </w:t>
+        <w:t>⭐⭐⭐⭐</w:t>
+      </w:r>
+      <w:r>
+        <w:t xml:space="preserve"> </w:t>
+      </w:r>
+    </w:p>
+    <w:p>
+      <w:pPr>
+        <w:numPr>
+          <w:ilvl w:val="0"/>
+          <w:numId w:val="2"/>
+        </w:numPr>
+      </w:pPr>
+      <w:r>
+        <w:rPr>
+          <w:b/>
+          <w:bCs/>
+        </w:rPr>
+        <w:t>Lookup APIs for dropdowns</w:t>
+      </w:r>
+      <w:r>
+        <w:t xml:space="preserve"> </w:t>
       </w:r>
       <w:r>
         <w:rPr>
           <w:rFonts w:ascii="Segoe UI Emoji" w:hAnsi="Segoe UI Emoji" w:cs="Segoe UI Emoji"/>
         </w:rPr>
-        <w:t>✅</w:t>
-      </w:r>
-      <w:r>
-        <w:t xml:space="preserve"> 100%</w:t>
-      </w:r>
-    </w:p>
-    <w:p>
-      <w:r>
-        <w:t xml:space="preserve">Validation                  </w:t>
-      </w:r>
-      <w:r>
-        <w:rPr>
-          <w:rFonts w:ascii="Segoe UI Emoji" w:hAnsi="Segoe UI Emoji" w:cs="Segoe UI Emoji"/>
-        </w:rPr>
-        <w:t>✅</w:t>
-      </w:r>
-      <w:r>
-        <w:t xml:space="preserve"> 100%</w:t>
-      </w:r>
-    </w:p>
-    <w:p>
-      <w:r>
-        <w:t xml:space="preserve">Repository Pattern          </w:t>
-      </w:r>
-      <w:r>
-        <w:rPr>
-          <w:rFonts w:ascii="Segoe UI Emoji" w:hAnsi="Segoe UI Emoji" w:cs="Segoe UI Emoji"/>
-        </w:rPr>
-        <w:t>✅</w:t>
-      </w:r>
-      <w:r>
-        <w:t xml:space="preserve"> 100%</w:t>
-      </w:r>
-    </w:p>
-    <w:p>
-      <w:r>
-        <w:t xml:space="preserve">Pagination                  </w:t>
-      </w:r>
-      <w:r>
-        <w:rPr>
-          <w:rFonts w:ascii="Segoe UI Emoji" w:hAnsi="Segoe UI Emoji" w:cs="Segoe UI Emoji"/>
-        </w:rPr>
-        <w:t>✅</w:t>
-      </w:r>
-      <w:r>
-        <w:t xml:space="preserve"> 100%</w:t>
-      </w:r>
-    </w:p>
-    <w:p/>
-    <w:p>
-      <w:r>
-        <w:t xml:space="preserve">Media Upload                </w:t>
-      </w:r>
-      <w:r>
-        <w:rPr>
-          <w:rFonts w:ascii="Segoe UI Emoji" w:hAnsi="Segoe UI Emoji" w:cs="Segoe UI Emoji"/>
-        </w:rPr>
-        <w:t>❌</w:t>
-      </w:r>
-    </w:p>
-    <w:p>
-      <w:r>
-        <w:t xml:space="preserve">Dashboard                   </w:t>
-      </w:r>
-      <w:r>
-        <w:rPr>
-          <w:rFonts w:ascii="Segoe UI Emoji" w:hAnsi="Segoe UI Emoji" w:cs="Segoe UI Emoji"/>
-        </w:rPr>
-        <w:t>❌</w:t>
-      </w:r>
-    </w:p>
-    <w:p>
-      <w:r>
-        <w:t xml:space="preserve">Lookup APIs                 </w:t>
-      </w:r>
-      <w:r>
-        <w:rPr>
-          <w:rFonts w:ascii="Segoe UI Emoji" w:hAnsi="Segoe UI Emoji" w:cs="Segoe UI Emoji"/>
-        </w:rPr>
-        <w:t>❌</w:t>
-      </w:r>
-    </w:p>
-    <w:p/>
-    <w:p>
-      <w:r>
-        <w:t>Overall Backend:            ~95%</w:t>
-      </w:r>
-    </w:p>
+        <w:t>⭐⭐⭐⭐⭐</w:t>
+      </w:r>
+      <w:r>
+        <w:t xml:space="preserve"> </w:t>
+      </w:r>
+    </w:p>
+    <w:p>
+      <w:r>
+        <w:lastRenderedPageBreak/>
+        <w:t>Once these are in place, your backend will be essentially production-ready for the admin frontend.</w:t>
+      </w:r>
+    </w:p>
+    <w:p/>
     <w:p/>
     <w:p/>
     <w:sectPr>
@@ -6367,6 +6297,119 @@
 <file path=word/numbering.xml><?xml version="1.0" encoding="utf-8"?>
 <w:numbering xmlns:wpc="http://schemas.microsoft.com/office/word/2010/wordprocessingCanvas" xmlns:cx="http://schemas.microsoft.com/office/drawing/2014/chartex" xmlns:cx1="http://schemas.microsoft.com/office/drawing/2015/9/8/chartex" xmlns:cx2="http://schemas.microsoft.com/office/drawing/2015/10/21/chartex" xmlns:cx3="http://schemas.microsoft.com/office/drawing/2016/5/9/chartex" xmlns:cx4="http://schemas.microsoft.com/office/drawing/2016/5/10/chartex" xmlns:cx5="http://schemas.microsoft.com/office/drawing/2016/5/11/chartex" xmlns:cx6="http://schemas.microsoft.com/office/drawing/2016/5/12/chartex" xmlns:cx7="http://schemas.microsoft.com/office/drawing/2016/5/13/chartex" xmlns:cx8="http://schemas.microsoft.com/office/drawing/2016/5/14/chartex" xmlns:mc="http://schemas.openxmlformats.org/markup-compatibility/2006" xmlns:aink="http://schemas.microsoft.com/office/drawing/2016/ink" xmlns:am3d="http://schemas.microsoft.com/office/drawing/2017/model3d" xmlns:o="urn:schemas-microsoft-com:office:office" xmlns:oel="http://schemas.microsoft.com/office/2019/extlst" xmlns:r="http://schemas.openxmlformats.org/officeDocument/2006/relationships" xmlns:m="http://schemas.openxmlformats.org/officeDocument/2006/math" xmlns:v="urn:schemas-microsoft-com:vml" xmlns:wp14="http://schemas.microsoft.com/office/word/2010/wordprocessingDrawing" xmlns:wp="http://schemas.openxmlformats.org/drawingml/2006/wordprocessingDrawing" xmlns:w10="urn:schemas-microsoft-com:office:word" xmlns:w="http://schemas.openxmlformats.org/wordprocessingml/2006/main" xmlns:w14="http://schemas.microsoft.com/office/word/2010/wordml" xmlns:w15="http://schemas.microsoft.com/office/word/2012/wordml" xmlns:w16cex="http://schemas.microsoft.com/office/word/2018/wordml/cex" xmlns:w16cid="http://schemas.microsoft.com/office/word/2016/wordml/cid" xmlns:w16="http://schemas.microsoft.com/office/word/2018/wordml" xmlns:w16du="http://schemas.microsoft.com/office/word/2023/wordml/word16du" xmlns:w16sdtdh="http://schemas.microsoft.com/office/word/2020/wordml/sdtdatahash" xmlns:w16sdtfl="http://schemas.microsoft.com/office/word/2024/wordml/sdtformatlock" xmlns:w16se="http://schemas.microsoft.com/office/word/2015/wordml/symex" xmlns:wpg="http://schemas.microsoft.com/office/word/2010/wordprocessingGroup" xmlns:wpi="http://schemas.microsoft.com/office/word/2010/wordprocessingInk" xmlns:wne="http://schemas.microsoft.com/office/word/2006/wordml" xmlns:wps="http://schemas.microsoft.com/office/word/2010/wordprocessingShape" mc:Ignorable="w14 w15 w16se w16cid w16 w16cex w16sdtdh w16sdtfl w16du wp14">
   <w:abstractNum w:abstractNumId="0" w15:restartNumberingAfterBreak="0">
+    <w:nsid w:val="506F6DE6"/>
+    <w:multiLevelType w:val="multilevel"/>
+    <w:tmpl w:val="AE126D08"/>
+    <w:lvl w:ilvl="0">
+      <w:start w:val="1"/>
+      <w:numFmt w:val="decimal"/>
+      <w:lvlText w:val="%1."/>
+      <w:lvlJc w:val="left"/>
+      <w:pPr>
+        <w:tabs>
+          <w:tab w:val="num" w:pos="720"/>
+        </w:tabs>
+        <w:ind w:left="720" w:hanging="360"/>
+      </w:pPr>
+    </w:lvl>
+    <w:lvl w:ilvl="1" w:tentative="1">
+      <w:start w:val="1"/>
+      <w:numFmt w:val="decimal"/>
+      <w:lvlText w:val="%2."/>
+      <w:lvlJc w:val="left"/>
+      <w:pPr>
+        <w:tabs>
+          <w:tab w:val="num" w:pos="1440"/>
+        </w:tabs>
+        <w:ind w:left="1440" w:hanging="360"/>
+      </w:pPr>
+    </w:lvl>
+    <w:lvl w:ilvl="2" w:tentative="1">
+      <w:start w:val="1"/>
+      <w:numFmt w:val="decimal"/>
+      <w:lvlText w:val="%3."/>
+      <w:lvlJc w:val="left"/>
+      <w:pPr>
+        <w:tabs>
+          <w:tab w:val="num" w:pos="2160"/>
+        </w:tabs>
+        <w:ind w:left="2160" w:hanging="360"/>
+      </w:pPr>
+    </w:lvl>
+    <w:lvl w:ilvl="3" w:tentative="1">
+      <w:start w:val="1"/>
+      <w:numFmt w:val="decimal"/>
+      <w:lvlText w:val="%4."/>
+      <w:lvlJc w:val="left"/>
+      <w:pPr>
+        <w:tabs>
+          <w:tab w:val="num" w:pos="2880"/>
+        </w:tabs>
+        <w:ind w:left="2880" w:hanging="360"/>
+      </w:pPr>
+    </w:lvl>
+    <w:lvl w:ilvl="4" w:tentative="1">
+      <w:start w:val="1"/>
+      <w:numFmt w:val="decimal"/>
+      <w:lvlText w:val="%5."/>
+      <w:lvlJc w:val="left"/>
+      <w:pPr>
+        <w:tabs>
+          <w:tab w:val="num" w:pos="3600"/>
+        </w:tabs>
+        <w:ind w:left="3600" w:hanging="360"/>
+      </w:pPr>
+    </w:lvl>
+    <w:lvl w:ilvl="5" w:tentative="1">
+      <w:start w:val="1"/>
+      <w:numFmt w:val="decimal"/>
+      <w:lvlText w:val="%6."/>
+      <w:lvlJc w:val="left"/>
+      <w:pPr>
+        <w:tabs>
+          <w:tab w:val="num" w:pos="4320"/>
+        </w:tabs>
+        <w:ind w:left="4320" w:hanging="360"/>
+      </w:pPr>
+    </w:lvl>
+    <w:lvl w:ilvl="6" w:tentative="1">
+      <w:start w:val="1"/>
+      <w:numFmt w:val="decimal"/>
+      <w:lvlText w:val="%7."/>
+      <w:lvlJc w:val="left"/>
+      <w:pPr>
+        <w:tabs>
+          <w:tab w:val="num" w:pos="5040"/>
+        </w:tabs>
+        <w:ind w:left="5040" w:hanging="360"/>
+      </w:pPr>
+    </w:lvl>
+    <w:lvl w:ilvl="7" w:tentative="1">
+      <w:start w:val="1"/>
+      <w:numFmt w:val="decimal"/>
+      <w:lvlText w:val="%8."/>
+      <w:lvlJc w:val="left"/>
+      <w:pPr>
+        <w:tabs>
+          <w:tab w:val="num" w:pos="5760"/>
+        </w:tabs>
+        <w:ind w:left="5760" w:hanging="360"/>
+      </w:pPr>
+    </w:lvl>
+    <w:lvl w:ilvl="8" w:tentative="1">
+      <w:start w:val="1"/>
+      <w:numFmt w:val="decimal"/>
+      <w:lvlText w:val="%9."/>
+      <w:lvlJc w:val="left"/>
+      <w:pPr>
+        <w:tabs>
+          <w:tab w:val="num" w:pos="6480"/>
+        </w:tabs>
+        <w:ind w:left="6480" w:hanging="360"/>
+      </w:pPr>
+    </w:lvl>
+  </w:abstractNum>
+  <w:abstractNum w:abstractNumId="1" w15:restartNumberingAfterBreak="0">
     <w:nsid w:val="65BD624F"/>
     <w:multiLevelType w:val="multilevel"/>
     <w:tmpl w:val="7966B26A"/>
@@ -6516,6 +6559,9 @@
     </w:lvl>
   </w:abstractNum>
   <w:num w:numId="1" w16cid:durableId="218636641">
+    <w:abstractNumId w:val="1"/>
+  </w:num>
+  <w:num w:numId="2" w16cid:durableId="569659083">
     <w:abstractNumId w:val="0"/>
   </w:num>
 </w:numbering>
@@ -7124,7 +7170,6 @@
   <w:style w:type="character" w:default="1" w:styleId="DefaultParagraphFont">
     <w:name w:val="Default Paragraph Font"/>
     <w:uiPriority w:val="1"/>
-    <w:semiHidden/>
     <w:unhideWhenUsed/>
   </w:style>
   <w:style w:type="table" w:default="1" w:styleId="TableNormal">

</xml_diff>

<commit_message>
(feat): Worked on Public Homepage, featured projects, news ..
</commit_message>
<xml_diff>
--- a/note.docx
+++ b/note.docx
@@ -137,7 +137,15 @@
     </w:p>
     <w:p>
       <w:r>
-        <w:t xml:space="preserve">                                        │ password_hash       │</w:t>
+        <w:t xml:space="preserve">                                        │ </w:t>
+      </w:r>
+      <w:proofErr w:type="spellStart"/>
+      <w:r>
+        <w:t>password_hash</w:t>
+      </w:r>
+      <w:proofErr w:type="spellEnd"/>
+      <w:r>
+        <w:t xml:space="preserve">       │</w:t>
       </w:r>
     </w:p>
     <w:p>
@@ -192,8 +200,21 @@
     <w:p/>
     <w:p>
       <w:r>
-        <w:t xml:space="preserve">                   1:N                            1:N                      1:N</w:t>
-      </w:r>
+        <w:t xml:space="preserve">                   1:N                            </w:t>
+      </w:r>
+      <w:proofErr w:type="spellStart"/>
+      <w:r>
+        <w:t>1:N</w:t>
+      </w:r>
+      <w:proofErr w:type="spellEnd"/>
+      <w:r>
+        <w:t xml:space="preserve">                      </w:t>
+      </w:r>
+      <w:proofErr w:type="spellStart"/>
+      <w:r>
+        <w:t>1:N</w:t>
+      </w:r>
+      <w:proofErr w:type="spellEnd"/>
     </w:p>
     <w:p>
       <w:r>
@@ -1665,9 +1686,11 @@
       </w:r>
     </w:p>
     <w:p>
+      <w:proofErr w:type="spellStart"/>
       <w:r>
         <w:t>media_folders</w:t>
       </w:r>
+      <w:proofErr w:type="spellEnd"/>
       <w:r>
         <w:br/>
         <w:t xml:space="preserve">        │</w:t>
@@ -1684,8 +1707,12 @@
       </w:r>
       <w:r>
         <w:br/>
+      </w:r>
+      <w:proofErr w:type="spellStart"/>
+      <w:r>
         <w:t>media_files</w:t>
       </w:r>
+      <w:proofErr w:type="spellEnd"/>
       <w:r>
         <w:br/>
         <w:t xml:space="preserve">        </w:t>
@@ -1708,8 +1735,12 @@
       </w:r>
       <w:r>
         <w:br/>
+      </w:r>
+      <w:proofErr w:type="spellStart"/>
+      <w:r>
         <w:t>media_file_links</w:t>
       </w:r>
+      <w:proofErr w:type="spellEnd"/>
       <w:r>
         <w:br/>
         <w:t xml:space="preserve">        </w:t>
@@ -1782,7 +1813,15 @@
         <w:t>❌</w:t>
       </w:r>
       <w:r>
-        <w:t xml:space="preserve"> project_gallery </w:t>
+        <w:t xml:space="preserve"> </w:t>
+      </w:r>
+      <w:proofErr w:type="spellStart"/>
+      <w:r>
+        <w:t>project_gallery</w:t>
+      </w:r>
+      <w:proofErr w:type="spellEnd"/>
+      <w:r>
+        <w:t xml:space="preserve"> </w:t>
       </w:r>
     </w:p>
     <w:p>
@@ -1799,7 +1838,15 @@
         <w:t>❌</w:t>
       </w:r>
       <w:r>
-        <w:t xml:space="preserve"> project_documents </w:t>
+        <w:t xml:space="preserve"> </w:t>
+      </w:r>
+      <w:proofErr w:type="spellStart"/>
+      <w:r>
+        <w:t>project_documents</w:t>
+      </w:r>
+      <w:proofErr w:type="spellEnd"/>
+      <w:r>
+        <w:t xml:space="preserve"> </w:t>
       </w:r>
     </w:p>
     <w:p>
@@ -1816,7 +1863,15 @@
         <w:t>❌</w:t>
       </w:r>
       <w:r>
-        <w:t xml:space="preserve"> news_images </w:t>
+        <w:t xml:space="preserve"> </w:t>
+      </w:r>
+      <w:proofErr w:type="spellStart"/>
+      <w:r>
+        <w:t>news_images</w:t>
+      </w:r>
+      <w:proofErr w:type="spellEnd"/>
+      <w:r>
+        <w:t xml:space="preserve"> </w:t>
       </w:r>
     </w:p>
     <w:p>
@@ -1833,7 +1888,15 @@
         <w:t>❌</w:t>
       </w:r>
       <w:r>
-        <w:t xml:space="preserve"> tender_documents (as media tables) </w:t>
+        <w:t xml:space="preserve"> </w:t>
+      </w:r>
+      <w:proofErr w:type="spellStart"/>
+      <w:r>
+        <w:t>tender_documents</w:t>
+      </w:r>
+      <w:proofErr w:type="spellEnd"/>
+      <w:r>
+        <w:t xml:space="preserve"> (as media tables) </w:t>
       </w:r>
     </w:p>
     <w:p>
@@ -1858,10 +1921,12 @@
       <w:r>
         <w:br/>
       </w:r>
+      <w:proofErr w:type="spellStart"/>
       <w:r>
         <w:lastRenderedPageBreak/>
         <w:t>media_file_links</w:t>
       </w:r>
+      <w:proofErr w:type="spellEnd"/>
       <w:r>
         <w:br/>
       </w:r>
@@ -1933,9 +1998,11 @@
       </w:r>
     </w:p>
     <w:p>
+      <w:proofErr w:type="spellStart"/>
       <w:r>
         <w:t>homepage_sections</w:t>
       </w:r>
+      <w:proofErr w:type="spellEnd"/>
       <w:r>
         <w:br/>
       </w:r>
@@ -1948,8 +2015,12 @@
       </w:r>
       <w:r>
         <w:br/>
+      </w:r>
+      <w:proofErr w:type="spellStart"/>
+      <w:r>
         <w:t>homepage_featured_items</w:t>
       </w:r>
+      <w:proofErr w:type="spellEnd"/>
       <w:r>
         <w:br/>
       </w:r>
@@ -2119,9 +2190,11 @@
     </w:p>
     <w:p/>
     <w:p>
+      <w:proofErr w:type="spellStart"/>
       <w:r>
         <w:t>homepage_sections</w:t>
       </w:r>
+      <w:proofErr w:type="spellEnd"/>
     </w:p>
     <w:p/>
     <w:p>
@@ -2840,9 +2913,11 @@
             <w:hideMark/>
           </w:tcPr>
           <w:p>
+            <w:proofErr w:type="spellStart"/>
             <w:r>
               <w:t>prisma</w:t>
             </w:r>
+            <w:proofErr w:type="spellEnd"/>
           </w:p>
         </w:tc>
         <w:tc>
@@ -2869,9 +2944,11 @@
             <w:hideMark/>
           </w:tcPr>
           <w:p>
+            <w:proofErr w:type="spellStart"/>
             <w:r>
               <w:t>zod</w:t>
             </w:r>
+            <w:proofErr w:type="spellEnd"/>
           </w:p>
         </w:tc>
         <w:tc>
@@ -2898,9 +2975,11 @@
             <w:hideMark/>
           </w:tcPr>
           <w:p>
+            <w:proofErr w:type="spellStart"/>
             <w:r>
               <w:t>bcrypt</w:t>
             </w:r>
+            <w:proofErr w:type="spellEnd"/>
           </w:p>
         </w:tc>
         <w:tc>
@@ -2927,9 +3006,11 @@
             <w:hideMark/>
           </w:tcPr>
           <w:p>
+            <w:proofErr w:type="spellStart"/>
             <w:r>
               <w:t>jsonwebtoken</w:t>
             </w:r>
+            <w:proofErr w:type="spellEnd"/>
           </w:p>
         </w:tc>
         <w:tc>
@@ -2956,9 +3037,11 @@
             <w:hideMark/>
           </w:tcPr>
           <w:p>
+            <w:proofErr w:type="spellStart"/>
             <w:r>
               <w:t>dotenv</w:t>
             </w:r>
+            <w:proofErr w:type="spellEnd"/>
           </w:p>
         </w:tc>
         <w:tc>
@@ -2985,9 +3068,11 @@
             <w:hideMark/>
           </w:tcPr>
           <w:p>
+            <w:proofErr w:type="spellStart"/>
             <w:r>
               <w:t>cors</w:t>
             </w:r>
+            <w:proofErr w:type="spellEnd"/>
           </w:p>
         </w:tc>
         <w:tc>
@@ -3056,8 +3141,13 @@
             <w:hideMark/>
           </w:tcPr>
           <w:p>
-            <w:r>
-              <w:t>Gzip responses</w:t>
+            <w:proofErr w:type="spellStart"/>
+            <w:r>
+              <w:t>Gzip</w:t>
+            </w:r>
+            <w:proofErr w:type="spellEnd"/>
+            <w:r>
+              <w:t xml:space="preserve"> responses</w:t>
             </w:r>
           </w:p>
         </w:tc>
@@ -3131,9 +3221,11 @@
             <w:hideMark/>
           </w:tcPr>
           <w:p>
+            <w:proofErr w:type="spellStart"/>
             <w:r>
               <w:t>multer</w:t>
             </w:r>
+            <w:proofErr w:type="spellEnd"/>
           </w:p>
         </w:tc>
         <w:tc>
@@ -3160,9 +3252,11 @@
             <w:hideMark/>
           </w:tcPr>
           <w:p>
+            <w:proofErr w:type="spellStart"/>
             <w:r>
               <w:t>slugify</w:t>
             </w:r>
+            <w:proofErr w:type="spellEnd"/>
           </w:p>
         </w:tc>
         <w:tc>
@@ -3189,9 +3283,11 @@
             <w:hideMark/>
           </w:tcPr>
           <w:p>
+            <w:proofErr w:type="spellStart"/>
             <w:r>
               <w:t>dayjs</w:t>
             </w:r>
+            <w:proofErr w:type="spellEnd"/>
           </w:p>
         </w:tc>
         <w:tc>
@@ -3269,7 +3365,15 @@
     <w:p/>
     <w:p>
       <w:r>
-        <w:t>CREATE TABLE operational_power_stations (</w:t>
+        <w:t xml:space="preserve">CREATE TABLE </w:t>
+      </w:r>
+      <w:proofErr w:type="spellStart"/>
+      <w:r>
+        <w:t>operational_power_stations</w:t>
+      </w:r>
+      <w:proofErr w:type="spellEnd"/>
+      <w:r>
+        <w:t xml:space="preserve"> (</w:t>
       </w:r>
     </w:p>
     <w:p/>
@@ -3294,31 +3398,71 @@
     <w:p/>
     <w:p>
       <w:r>
-        <w:t xml:space="preserve">    state_id BIGINT NOT NULL,</w:t>
-      </w:r>
-    </w:p>
-    <w:p/>
-    <w:p>
-      <w:r>
-        <w:t xml:space="preserve">    project_type_id BIGINT NOT NULL,</w:t>
-      </w:r>
-    </w:p>
-    <w:p/>
-    <w:p>
-      <w:r>
-        <w:t xml:space="preserve">    installed_capacity NUMERIC(10,2) NOT NULL,</w:t>
-      </w:r>
-    </w:p>
-    <w:p/>
-    <w:p>
-      <w:r>
-        <w:t xml:space="preserve">    capacity_unit_id BIGINT NOT NULL,</w:t>
-      </w:r>
-    </w:p>
-    <w:p/>
-    <w:p>
-      <w:r>
-        <w:t xml:space="preserve">    commissioned_on DATE,</w:t>
+        <w:t xml:space="preserve">    </w:t>
+      </w:r>
+      <w:proofErr w:type="spellStart"/>
+      <w:r>
+        <w:t>state_id</w:t>
+      </w:r>
+      <w:proofErr w:type="spellEnd"/>
+      <w:r>
+        <w:t xml:space="preserve"> BIGINT NOT NULL,</w:t>
+      </w:r>
+    </w:p>
+    <w:p/>
+    <w:p>
+      <w:r>
+        <w:t xml:space="preserve">    </w:t>
+      </w:r>
+      <w:proofErr w:type="spellStart"/>
+      <w:r>
+        <w:t>project_type_id</w:t>
+      </w:r>
+      <w:proofErr w:type="spellEnd"/>
+      <w:r>
+        <w:t xml:space="preserve"> BIGINT NOT NULL,</w:t>
+      </w:r>
+    </w:p>
+    <w:p/>
+    <w:p>
+      <w:r>
+        <w:t xml:space="preserve">    </w:t>
+      </w:r>
+      <w:proofErr w:type="spellStart"/>
+      <w:r>
+        <w:t>installed_capacity</w:t>
+      </w:r>
+      <w:proofErr w:type="spellEnd"/>
+      <w:r>
+        <w:t xml:space="preserve"> NUMERIC(10,2) NOT NULL,</w:t>
+      </w:r>
+    </w:p>
+    <w:p/>
+    <w:p>
+      <w:r>
+        <w:t xml:space="preserve">    </w:t>
+      </w:r>
+      <w:proofErr w:type="spellStart"/>
+      <w:r>
+        <w:t>capacity_unit_id</w:t>
+      </w:r>
+      <w:proofErr w:type="spellEnd"/>
+      <w:r>
+        <w:t xml:space="preserve"> BIGINT NOT NULL,</w:t>
+      </w:r>
+    </w:p>
+    <w:p/>
+    <w:p>
+      <w:r>
+        <w:t xml:space="preserve">    </w:t>
+      </w:r>
+      <w:proofErr w:type="spellStart"/>
+      <w:r>
+        <w:t>commissioned_on</w:t>
+      </w:r>
+      <w:proofErr w:type="spellEnd"/>
+      <w:r>
+        <w:t xml:space="preserve"> DATE,</w:t>
       </w:r>
     </w:p>
     <w:p/>
@@ -3342,39 +3486,84 @@
     <w:p/>
     <w:p>
       <w:r>
-        <w:t xml:space="preserve">    is_featured BOOLEAN NOT NULL DEFAULT FALSE,</w:t>
-      </w:r>
-    </w:p>
-    <w:p/>
-    <w:p>
-      <w:r>
-        <w:t xml:space="preserve">    display_order INTEGER NOT NULL DEFAULT 1,</w:t>
-      </w:r>
-    </w:p>
-    <w:p/>
-    <w:p>
-      <w:r>
-        <w:t xml:space="preserve">    is_active BOOLEAN NOT NULL DEFAULT TRUE,</w:t>
-      </w:r>
-    </w:p>
-    <w:p/>
-    <w:p>
-      <w:r>
-        <w:t xml:space="preserve">    created_at TIMESTAMPTZ NOT NULL DEFAULT CURRENT_TIMESTAMP,</w:t>
-      </w:r>
-    </w:p>
-    <w:p/>
-    <w:p>
-      <w:r>
-        <w:t xml:space="preserve">    updated_at TIMESTAMPTZ NOT NULL DEFAULT CURRENT_TIMESTAMP,</w:t>
+        <w:t xml:space="preserve">    </w:t>
+      </w:r>
+      <w:proofErr w:type="spellStart"/>
+      <w:r>
+        <w:t>is_featured</w:t>
+      </w:r>
+      <w:proofErr w:type="spellEnd"/>
+      <w:r>
+        <w:t xml:space="preserve"> BOOLEAN NOT NULL DEFAULT FALSE,</w:t>
+      </w:r>
+    </w:p>
+    <w:p/>
+    <w:p>
+      <w:r>
+        <w:t xml:space="preserve">    </w:t>
+      </w:r>
+      <w:proofErr w:type="spellStart"/>
+      <w:r>
+        <w:t>display_order</w:t>
+      </w:r>
+      <w:proofErr w:type="spellEnd"/>
+      <w:r>
+        <w:t xml:space="preserve"> INTEGER NOT NULL DEFAULT 1,</w:t>
+      </w:r>
+    </w:p>
+    <w:p/>
+    <w:p>
+      <w:r>
+        <w:t xml:space="preserve">    </w:t>
+      </w:r>
+      <w:proofErr w:type="spellStart"/>
+      <w:r>
+        <w:t>is_active</w:t>
+      </w:r>
+      <w:proofErr w:type="spellEnd"/>
+      <w:r>
+        <w:t xml:space="preserve"> BOOLEAN NOT NULL DEFAULT TRUE,</w:t>
+      </w:r>
+    </w:p>
+    <w:p/>
+    <w:p>
+      <w:r>
+        <w:t xml:space="preserve">    </w:t>
+      </w:r>
+      <w:proofErr w:type="spellStart"/>
+      <w:r>
+        <w:t>created_at</w:t>
+      </w:r>
+      <w:proofErr w:type="spellEnd"/>
+      <w:r>
+        <w:t xml:space="preserve"> TIMESTAMPTZ NOT NULL DEFAULT CURRENT_TIMESTAMP,</w:t>
+      </w:r>
+    </w:p>
+    <w:p/>
+    <w:p>
+      <w:r>
+        <w:t xml:space="preserve">    </w:t>
+      </w:r>
+      <w:proofErr w:type="spellStart"/>
+      <w:r>
+        <w:t>updated_at</w:t>
+      </w:r>
+      <w:proofErr w:type="spellEnd"/>
+      <w:r>
+        <w:t xml:space="preserve"> TIMESTAMPTZ NOT NULL DEFAULT CURRENT_TIMESTAMP,</w:t>
       </w:r>
     </w:p>
     <w:p/>
     <w:p>
       <w:r>
         <w:lastRenderedPageBreak/>
-        <w:t xml:space="preserve">    CONSTRAINT pk_operational_power_stations</w:t>
-      </w:r>
+        <w:t xml:space="preserve">    CONSTRAINT </w:t>
+      </w:r>
+      <w:proofErr w:type="spellStart"/>
+      <w:r>
+        <w:t>pk_operational_power_stations</w:t>
+      </w:r>
+      <w:proofErr w:type="spellEnd"/>
     </w:p>
     <w:p>
       <w:r>
@@ -3384,8 +3573,13 @@
     <w:p/>
     <w:p>
       <w:r>
-        <w:t xml:space="preserve">    CONSTRAINT uq_operational_power_stations_slug</w:t>
-      </w:r>
+        <w:t xml:space="preserve">    CONSTRAINT </w:t>
+      </w:r>
+      <w:proofErr w:type="spellStart"/>
+      <w:r>
+        <w:t>uq_operational_power_stations_slug</w:t>
+      </w:r>
+      <w:proofErr w:type="spellEnd"/>
     </w:p>
     <w:p>
       <w:r>
@@ -3395,12 +3589,25 @@
     <w:p/>
     <w:p>
       <w:r>
-        <w:t xml:space="preserve">    CONSTRAINT fk_ops_state</w:t>
-      </w:r>
-    </w:p>
-    <w:p>
-      <w:r>
-        <w:t xml:space="preserve">        FOREIGN KEY (state_id)</w:t>
+        <w:t xml:space="preserve">    CONSTRAINT </w:t>
+      </w:r>
+      <w:proofErr w:type="spellStart"/>
+      <w:r>
+        <w:t>fk_ops_state</w:t>
+      </w:r>
+      <w:proofErr w:type="spellEnd"/>
+    </w:p>
+    <w:p>
+      <w:r>
+        <w:t xml:space="preserve">        FOREIGN KEY (</w:t>
+      </w:r>
+      <w:proofErr w:type="spellStart"/>
+      <w:r>
+        <w:t>state_id</w:t>
+      </w:r>
+      <w:proofErr w:type="spellEnd"/>
+      <w:r>
+        <w:t>)</w:t>
       </w:r>
     </w:p>
     <w:p>
@@ -3411,44 +3618,99 @@
     <w:p/>
     <w:p>
       <w:r>
-        <w:t xml:space="preserve">    CONSTRAINT fk_ops_project_type</w:t>
-      </w:r>
-    </w:p>
-    <w:p>
-      <w:r>
-        <w:t xml:space="preserve">        FOREIGN KEY (project_type_id)</w:t>
-      </w:r>
-    </w:p>
-    <w:p>
-      <w:r>
-        <w:t xml:space="preserve">        REFERENCES project_types(id),</w:t>
-      </w:r>
-    </w:p>
-    <w:p/>
-    <w:p>
-      <w:r>
-        <w:t xml:space="preserve">    CONSTRAINT fk_ops_capacity_unit</w:t>
-      </w:r>
-    </w:p>
-    <w:p>
-      <w:r>
-        <w:t xml:space="preserve">        FOREIGN KEY (capacity_unit_id)</w:t>
-      </w:r>
-    </w:p>
-    <w:p>
-      <w:r>
-        <w:t xml:space="preserve">        REFERENCES capacity_units(id),</w:t>
-      </w:r>
-    </w:p>
-    <w:p/>
-    <w:p>
-      <w:r>
-        <w:t xml:space="preserve">    CONSTRAINT chk_ops_display_order</w:t>
-      </w:r>
-    </w:p>
-    <w:p>
-      <w:r>
-        <w:t xml:space="preserve">        CHECK (display_order &gt; 0)</w:t>
+        <w:t xml:space="preserve">    CONSTRAINT </w:t>
+      </w:r>
+      <w:proofErr w:type="spellStart"/>
+      <w:r>
+        <w:t>fk_ops_project_type</w:t>
+      </w:r>
+      <w:proofErr w:type="spellEnd"/>
+    </w:p>
+    <w:p>
+      <w:r>
+        <w:t xml:space="preserve">        FOREIGN KEY (</w:t>
+      </w:r>
+      <w:proofErr w:type="spellStart"/>
+      <w:r>
+        <w:t>project_type_id</w:t>
+      </w:r>
+      <w:proofErr w:type="spellEnd"/>
+      <w:r>
+        <w:t>)</w:t>
+      </w:r>
+    </w:p>
+    <w:p>
+      <w:r>
+        <w:t xml:space="preserve">        REFERENCES </w:t>
+      </w:r>
+      <w:proofErr w:type="spellStart"/>
+      <w:r>
+        <w:t>project_types</w:t>
+      </w:r>
+      <w:proofErr w:type="spellEnd"/>
+      <w:r>
+        <w:t>(id),</w:t>
+      </w:r>
+    </w:p>
+    <w:p/>
+    <w:p>
+      <w:r>
+        <w:t xml:space="preserve">    CONSTRAINT </w:t>
+      </w:r>
+      <w:proofErr w:type="spellStart"/>
+      <w:r>
+        <w:t>fk_ops_capacity_unit</w:t>
+      </w:r>
+      <w:proofErr w:type="spellEnd"/>
+    </w:p>
+    <w:p>
+      <w:r>
+        <w:t xml:space="preserve">        FOREIGN KEY (</w:t>
+      </w:r>
+      <w:proofErr w:type="spellStart"/>
+      <w:r>
+        <w:t>capacity_unit_id</w:t>
+      </w:r>
+      <w:proofErr w:type="spellEnd"/>
+      <w:r>
+        <w:t>)</w:t>
+      </w:r>
+    </w:p>
+    <w:p>
+      <w:r>
+        <w:t xml:space="preserve">        REFERENCES </w:t>
+      </w:r>
+      <w:proofErr w:type="spellStart"/>
+      <w:r>
+        <w:t>capacity_units</w:t>
+      </w:r>
+      <w:proofErr w:type="spellEnd"/>
+      <w:r>
+        <w:t>(id),</w:t>
+      </w:r>
+    </w:p>
+    <w:p/>
+    <w:p>
+      <w:r>
+        <w:t xml:space="preserve">    CONSTRAINT </w:t>
+      </w:r>
+      <w:proofErr w:type="spellStart"/>
+      <w:r>
+        <w:t>chk_ops_display_order</w:t>
+      </w:r>
+      <w:proofErr w:type="spellEnd"/>
+    </w:p>
+    <w:p>
+      <w:r>
+        <w:t xml:space="preserve">        CHECK (</w:t>
+      </w:r>
+      <w:proofErr w:type="spellStart"/>
+      <w:r>
+        <w:t>display_order</w:t>
+      </w:r>
+      <w:proofErr w:type="spellEnd"/>
+      <w:r>
+        <w:t xml:space="preserve"> &gt; 0)</w:t>
       </w:r>
     </w:p>
     <w:p/>
@@ -3460,68 +3722,175 @@
     <w:p/>
     <w:p>
       <w:r>
-        <w:t>CREATE INDEX idx_ops_slug</w:t>
-      </w:r>
-    </w:p>
-    <w:p>
-      <w:r>
-        <w:t>ON operational_power_stations(slug);</w:t>
-      </w:r>
-    </w:p>
-    <w:p/>
-    <w:p>
-      <w:r>
-        <w:t>CREATE INDEX idx_ops_state</w:t>
-      </w:r>
-    </w:p>
-    <w:p>
-      <w:r>
-        <w:t>ON operational_power_stations(state_id);</w:t>
-      </w:r>
-    </w:p>
-    <w:p/>
-    <w:p>
-      <w:r>
-        <w:t>CREATE INDEX idx_ops_featured</w:t>
-      </w:r>
-    </w:p>
-    <w:p>
-      <w:r>
-        <w:t>ON operational_power_stations(is_featured);</w:t>
-      </w:r>
-    </w:p>
-    <w:p/>
-    <w:p>
-      <w:r>
-        <w:t>CREATE INDEX idx_ops_active</w:t>
-      </w:r>
-    </w:p>
-    <w:p>
-      <w:r>
-        <w:t>ON operational_power_stations(is_active);</w:t>
-      </w:r>
-    </w:p>
-    <w:p/>
-    <w:p>
-      <w:r>
-        <w:t>CREATE INDEX idx_ops_display_order</w:t>
-      </w:r>
-    </w:p>
-    <w:p>
-      <w:r>
-        <w:t>ON operational_power_stations(display_order);</w:t>
-      </w:r>
-    </w:p>
-    <w:p/>
-    <w:p>
-      <w:r>
-        <w:t>CREATE TRIGGER trg_operational_power_stations_updated_at</w:t>
-      </w:r>
-    </w:p>
-    <w:p>
-      <w:r>
-        <w:t>BEFORE UPDATE ON operational_power_stations</w:t>
-      </w:r>
+        <w:t xml:space="preserve">CREATE INDEX </w:t>
+      </w:r>
+      <w:proofErr w:type="spellStart"/>
+      <w:r>
+        <w:t>idx_ops_slug</w:t>
+      </w:r>
+      <w:proofErr w:type="spellEnd"/>
+    </w:p>
+    <w:p>
+      <w:r>
+        <w:t xml:space="preserve">ON </w:t>
+      </w:r>
+      <w:proofErr w:type="spellStart"/>
+      <w:r>
+        <w:t>operational_power_stations</w:t>
+      </w:r>
+      <w:proofErr w:type="spellEnd"/>
+      <w:r>
+        <w:t>(slug);</w:t>
+      </w:r>
+    </w:p>
+    <w:p/>
+    <w:p>
+      <w:r>
+        <w:t xml:space="preserve">CREATE INDEX </w:t>
+      </w:r>
+      <w:proofErr w:type="spellStart"/>
+      <w:r>
+        <w:t>idx_ops_state</w:t>
+      </w:r>
+      <w:proofErr w:type="spellEnd"/>
+    </w:p>
+    <w:p>
+      <w:r>
+        <w:t xml:space="preserve">ON </w:t>
+      </w:r>
+      <w:proofErr w:type="spellStart"/>
+      <w:r>
+        <w:t>operational_power_stations</w:t>
+      </w:r>
+      <w:proofErr w:type="spellEnd"/>
+      <w:r>
+        <w:t>(</w:t>
+      </w:r>
+      <w:proofErr w:type="spellStart"/>
+      <w:r>
+        <w:t>state_id</w:t>
+      </w:r>
+      <w:proofErr w:type="spellEnd"/>
+      <w:r>
+        <w:t>);</w:t>
+      </w:r>
+    </w:p>
+    <w:p/>
+    <w:p>
+      <w:r>
+        <w:t xml:space="preserve">CREATE INDEX </w:t>
+      </w:r>
+      <w:proofErr w:type="spellStart"/>
+      <w:r>
+        <w:t>idx_ops_featured</w:t>
+      </w:r>
+      <w:proofErr w:type="spellEnd"/>
+    </w:p>
+    <w:p>
+      <w:r>
+        <w:t xml:space="preserve">ON </w:t>
+      </w:r>
+      <w:proofErr w:type="spellStart"/>
+      <w:r>
+        <w:t>operational_power_stations</w:t>
+      </w:r>
+      <w:proofErr w:type="spellEnd"/>
+      <w:r>
+        <w:t>(</w:t>
+      </w:r>
+      <w:proofErr w:type="spellStart"/>
+      <w:r>
+        <w:t>is_featured</w:t>
+      </w:r>
+      <w:proofErr w:type="spellEnd"/>
+      <w:r>
+        <w:t>);</w:t>
+      </w:r>
+    </w:p>
+    <w:p/>
+    <w:p>
+      <w:r>
+        <w:t xml:space="preserve">CREATE INDEX </w:t>
+      </w:r>
+      <w:proofErr w:type="spellStart"/>
+      <w:r>
+        <w:t>idx_ops_active</w:t>
+      </w:r>
+      <w:proofErr w:type="spellEnd"/>
+    </w:p>
+    <w:p>
+      <w:r>
+        <w:t xml:space="preserve">ON </w:t>
+      </w:r>
+      <w:proofErr w:type="spellStart"/>
+      <w:r>
+        <w:t>operational_power_stations</w:t>
+      </w:r>
+      <w:proofErr w:type="spellEnd"/>
+      <w:r>
+        <w:t>(</w:t>
+      </w:r>
+      <w:proofErr w:type="spellStart"/>
+      <w:r>
+        <w:t>is_active</w:t>
+      </w:r>
+      <w:proofErr w:type="spellEnd"/>
+      <w:r>
+        <w:t>);</w:t>
+      </w:r>
+    </w:p>
+    <w:p/>
+    <w:p>
+      <w:r>
+        <w:t xml:space="preserve">CREATE INDEX </w:t>
+      </w:r>
+      <w:proofErr w:type="spellStart"/>
+      <w:r>
+        <w:t>idx_ops_display_order</w:t>
+      </w:r>
+      <w:proofErr w:type="spellEnd"/>
+    </w:p>
+    <w:p>
+      <w:r>
+        <w:t xml:space="preserve">ON </w:t>
+      </w:r>
+      <w:proofErr w:type="spellStart"/>
+      <w:r>
+        <w:t>operational_power_stations</w:t>
+      </w:r>
+      <w:proofErr w:type="spellEnd"/>
+      <w:r>
+        <w:t>(</w:t>
+      </w:r>
+      <w:proofErr w:type="spellStart"/>
+      <w:r>
+        <w:t>display_order</w:t>
+      </w:r>
+      <w:proofErr w:type="spellEnd"/>
+      <w:r>
+        <w:t>);</w:t>
+      </w:r>
+    </w:p>
+    <w:p/>
+    <w:p>
+      <w:r>
+        <w:t xml:space="preserve">CREATE TRIGGER </w:t>
+      </w:r>
+      <w:proofErr w:type="spellStart"/>
+      <w:r>
+        <w:t>trg_operational_power_stations_updated_at</w:t>
+      </w:r>
+      <w:proofErr w:type="spellEnd"/>
+    </w:p>
+    <w:p>
+      <w:r>
+        <w:t xml:space="preserve">BEFORE UPDATE ON </w:t>
+      </w:r>
+      <w:proofErr w:type="spellStart"/>
+      <w:r>
+        <w:t>operational_power_stations</w:t>
+      </w:r>
+      <w:proofErr w:type="spellEnd"/>
     </w:p>
     <w:p>
       <w:r>
@@ -3530,7 +3899,15 @@
     </w:p>
     <w:p>
       <w:r>
-        <w:t>EXECUTE FUNCTION fn_update_updated_at();</w:t>
+        <w:t xml:space="preserve">EXECUTE FUNCTION </w:t>
+      </w:r>
+      <w:proofErr w:type="spellStart"/>
+      <w:r>
+        <w:t>fn_update_updated_at</w:t>
+      </w:r>
+      <w:proofErr w:type="spellEnd"/>
+      <w:r>
+        <w:t>();</w:t>
       </w:r>
     </w:p>
     <w:p>
@@ -3716,7 +4093,15 @@
           </w:tcPr>
           <w:p>
             <w:r>
-              <w:t>2 (settings, audit_logs)</w:t>
+              <w:t xml:space="preserve">2 (settings, </w:t>
+            </w:r>
+            <w:proofErr w:type="spellStart"/>
+            <w:r>
+              <w:t>audit_logs</w:t>
+            </w:r>
+            <w:proofErr w:type="spellEnd"/>
+            <w:r>
+              <w:t>)</w:t>
             </w:r>
           </w:p>
         </w:tc>
@@ -3904,7 +4289,14 @@
       </w:r>
       <w:r>
         <w:br/>
-        <w:t>db pull</w:t>
+      </w:r>
+      <w:proofErr w:type="spellStart"/>
+      <w:r>
+        <w:t>db</w:t>
+      </w:r>
+      <w:proofErr w:type="spellEnd"/>
+      <w:r>
+        <w:t xml:space="preserve"> pull</w:t>
       </w:r>
       <w:r>
         <w:br/>
@@ -3912,7 +4304,14 @@
       </w:r>
       <w:r>
         <w:br/>
-        <w:t>schema.prisma (generated)</w:t>
+      </w:r>
+      <w:proofErr w:type="spellStart"/>
+      <w:r>
+        <w:t>schema.prisma</w:t>
+      </w:r>
+      <w:proofErr w:type="spellEnd"/>
+      <w:r>
+        <w:t xml:space="preserve"> (generated)</w:t>
       </w:r>
       <w:r>
         <w:br/>
@@ -3920,7 +4319,14 @@
       </w:r>
       <w:r>
         <w:br/>
-        <w:t>prisma generate</w:t>
+      </w:r>
+      <w:proofErr w:type="spellStart"/>
+      <w:r>
+        <w:t>prisma</w:t>
+      </w:r>
+      <w:proofErr w:type="spellEnd"/>
+      <w:r>
+        <w:t xml:space="preserve"> generate</w:t>
       </w:r>
       <w:r>
         <w:br/>
@@ -4208,6 +4614,7 @@
             <w:hideMark/>
           </w:tcPr>
           <w:p>
+            <w:proofErr w:type="spellStart"/>
             <w:r>
               <w:rPr>
                 <w:b/>
@@ -4215,6 +4622,7 @@
               </w:rPr>
               <w:t>bcrypt</w:t>
             </w:r>
+            <w:proofErr w:type="spellEnd"/>
             <w:r>
               <w:t xml:space="preserve"> (already installed)</w:t>
             </w:r>
@@ -4625,20 +5033,27 @@
             <w:hideMark/>
           </w:tcPr>
           <w:p>
+            <w:proofErr w:type="spellStart"/>
             <w:r>
               <w:t>original_name</w:t>
             </w:r>
-          </w:p>
-        </w:tc>
-        <w:tc>
-          <w:tcPr>
-            <w:tcW w:w="0" w:type="auto"/>
-            <w:vAlign w:val="center"/>
-            <w:hideMark/>
-          </w:tcPr>
-          <w:p>
-            <w:r>
-              <w:t>getFileMetadata()</w:t>
+            <w:proofErr w:type="spellEnd"/>
+          </w:p>
+        </w:tc>
+        <w:tc>
+          <w:tcPr>
+            <w:tcW w:w="0" w:type="auto"/>
+            <w:vAlign w:val="center"/>
+            <w:hideMark/>
+          </w:tcPr>
+          <w:p>
+            <w:proofErr w:type="spellStart"/>
+            <w:r>
+              <w:t>getFileMetadata</w:t>
+            </w:r>
+            <w:proofErr w:type="spellEnd"/>
+            <w:r>
+              <w:t>()</w:t>
             </w:r>
           </w:p>
         </w:tc>
@@ -4654,20 +5069,27 @@
             <w:hideMark/>
           </w:tcPr>
           <w:p>
+            <w:proofErr w:type="spellStart"/>
             <w:r>
               <w:t>stored_name</w:t>
             </w:r>
-          </w:p>
-        </w:tc>
-        <w:tc>
-          <w:tcPr>
-            <w:tcW w:w="0" w:type="auto"/>
-            <w:vAlign w:val="center"/>
-            <w:hideMark/>
-          </w:tcPr>
-          <w:p>
-            <w:r>
-              <w:t>getFileMetadata()</w:t>
+            <w:proofErr w:type="spellEnd"/>
+          </w:p>
+        </w:tc>
+        <w:tc>
+          <w:tcPr>
+            <w:tcW w:w="0" w:type="auto"/>
+            <w:vAlign w:val="center"/>
+            <w:hideMark/>
+          </w:tcPr>
+          <w:p>
+            <w:proofErr w:type="spellStart"/>
+            <w:r>
+              <w:t>getFileMetadata</w:t>
+            </w:r>
+            <w:proofErr w:type="spellEnd"/>
+            <w:r>
+              <w:t>()</w:t>
             </w:r>
           </w:p>
         </w:tc>
@@ -4683,20 +5105,27 @@
             <w:hideMark/>
           </w:tcPr>
           <w:p>
+            <w:proofErr w:type="spellStart"/>
             <w:r>
               <w:t>mime_type</w:t>
             </w:r>
-          </w:p>
-        </w:tc>
-        <w:tc>
-          <w:tcPr>
-            <w:tcW w:w="0" w:type="auto"/>
-            <w:vAlign w:val="center"/>
-            <w:hideMark/>
-          </w:tcPr>
-          <w:p>
-            <w:r>
-              <w:t>getFileMetadata()</w:t>
+            <w:proofErr w:type="spellEnd"/>
+          </w:p>
+        </w:tc>
+        <w:tc>
+          <w:tcPr>
+            <w:tcW w:w="0" w:type="auto"/>
+            <w:vAlign w:val="center"/>
+            <w:hideMark/>
+          </w:tcPr>
+          <w:p>
+            <w:proofErr w:type="spellStart"/>
+            <w:r>
+              <w:t>getFileMetadata</w:t>
+            </w:r>
+            <w:proofErr w:type="spellEnd"/>
+            <w:r>
+              <w:t>()</w:t>
             </w:r>
           </w:p>
         </w:tc>
@@ -4724,8 +5153,13 @@
             <w:hideMark/>
           </w:tcPr>
           <w:p>
-            <w:r>
-              <w:t>getFileMetadata()</w:t>
+            <w:proofErr w:type="spellStart"/>
+            <w:r>
+              <w:t>getFileMetadata</w:t>
+            </w:r>
+            <w:proofErr w:type="spellEnd"/>
+            <w:r>
+              <w:t>()</w:t>
             </w:r>
           </w:p>
         </w:tc>
@@ -4741,20 +5175,27 @@
             <w:hideMark/>
           </w:tcPr>
           <w:p>
+            <w:proofErr w:type="spellStart"/>
             <w:r>
               <w:t>size_bytes</w:t>
             </w:r>
-          </w:p>
-        </w:tc>
-        <w:tc>
-          <w:tcPr>
-            <w:tcW w:w="0" w:type="auto"/>
-            <w:vAlign w:val="center"/>
-            <w:hideMark/>
-          </w:tcPr>
-          <w:p>
-            <w:r>
-              <w:t>getFileMetadata()</w:t>
+            <w:proofErr w:type="spellEnd"/>
+          </w:p>
+        </w:tc>
+        <w:tc>
+          <w:tcPr>
+            <w:tcW w:w="0" w:type="auto"/>
+            <w:vAlign w:val="center"/>
+            <w:hideMark/>
+          </w:tcPr>
+          <w:p>
+            <w:proofErr w:type="spellStart"/>
+            <w:r>
+              <w:t>getFileMetadata</w:t>
+            </w:r>
+            <w:proofErr w:type="spellEnd"/>
+            <w:r>
+              <w:t>()</w:t>
             </w:r>
           </w:p>
         </w:tc>
@@ -4770,20 +5211,27 @@
             <w:hideMark/>
           </w:tcPr>
           <w:p>
+            <w:proofErr w:type="spellStart"/>
             <w:r>
               <w:t>storage_provider</w:t>
             </w:r>
-          </w:p>
-        </w:tc>
-        <w:tc>
-          <w:tcPr>
-            <w:tcW w:w="0" w:type="auto"/>
-            <w:vAlign w:val="center"/>
-            <w:hideMark/>
-          </w:tcPr>
-          <w:p>
-            <w:r>
-              <w:t>getFileMetadata()</w:t>
+            <w:proofErr w:type="spellEnd"/>
+          </w:p>
+        </w:tc>
+        <w:tc>
+          <w:tcPr>
+            <w:tcW w:w="0" w:type="auto"/>
+            <w:vAlign w:val="center"/>
+            <w:hideMark/>
+          </w:tcPr>
+          <w:p>
+            <w:proofErr w:type="spellStart"/>
+            <w:r>
+              <w:t>getFileMetadata</w:t>
+            </w:r>
+            <w:proofErr w:type="spellEnd"/>
+            <w:r>
+              <w:t>()</w:t>
             </w:r>
           </w:p>
         </w:tc>
@@ -4799,20 +5247,27 @@
             <w:hideMark/>
           </w:tcPr>
           <w:p>
+            <w:proofErr w:type="spellStart"/>
             <w:r>
               <w:t>storage_path</w:t>
             </w:r>
-          </w:p>
-        </w:tc>
-        <w:tc>
-          <w:tcPr>
-            <w:tcW w:w="0" w:type="auto"/>
-            <w:vAlign w:val="center"/>
-            <w:hideMark/>
-          </w:tcPr>
-          <w:p>
-            <w:r>
-              <w:t>getFileMetadata()</w:t>
+            <w:proofErr w:type="spellEnd"/>
+          </w:p>
+        </w:tc>
+        <w:tc>
+          <w:tcPr>
+            <w:tcW w:w="0" w:type="auto"/>
+            <w:vAlign w:val="center"/>
+            <w:hideMark/>
+          </w:tcPr>
+          <w:p>
+            <w:proofErr w:type="spellStart"/>
+            <w:r>
+              <w:t>getFileMetadata</w:t>
+            </w:r>
+            <w:proofErr w:type="spellEnd"/>
+            <w:r>
+              <w:t>()</w:t>
             </w:r>
           </w:p>
         </w:tc>
@@ -4840,8 +5295,13 @@
             <w:hideMark/>
           </w:tcPr>
           <w:p>
-            <w:r>
-              <w:t>extractMetadata()</w:t>
+            <w:proofErr w:type="spellStart"/>
+            <w:r>
+              <w:t>extractMetadata</w:t>
+            </w:r>
+            <w:proofErr w:type="spellEnd"/>
+            <w:r>
+              <w:t>()</w:t>
             </w:r>
           </w:p>
         </w:tc>
@@ -4869,8 +5329,13 @@
             <w:hideMark/>
           </w:tcPr>
           <w:p>
-            <w:r>
-              <w:t>extractMetadata()</w:t>
+            <w:proofErr w:type="spellStart"/>
+            <w:r>
+              <w:t>extractMetadata</w:t>
+            </w:r>
+            <w:proofErr w:type="spellEnd"/>
+            <w:r>
+              <w:t>()</w:t>
             </w:r>
           </w:p>
         </w:tc>
@@ -4886,20 +5351,27 @@
             <w:hideMark/>
           </w:tcPr>
           <w:p>
+            <w:proofErr w:type="spellStart"/>
             <w:r>
               <w:t>duration_seconds</w:t>
             </w:r>
-          </w:p>
-        </w:tc>
-        <w:tc>
-          <w:tcPr>
-            <w:tcW w:w="0" w:type="auto"/>
-            <w:vAlign w:val="center"/>
-            <w:hideMark/>
-          </w:tcPr>
-          <w:p>
-            <w:r>
-              <w:t>extractMetadata()</w:t>
+            <w:proofErr w:type="spellEnd"/>
+          </w:p>
+        </w:tc>
+        <w:tc>
+          <w:tcPr>
+            <w:tcW w:w="0" w:type="auto"/>
+            <w:vAlign w:val="center"/>
+            <w:hideMark/>
+          </w:tcPr>
+          <w:p>
+            <w:proofErr w:type="spellStart"/>
+            <w:r>
+              <w:t>extractMetadata</w:t>
+            </w:r>
+            <w:proofErr w:type="spellEnd"/>
+            <w:r>
+              <w:t>()</w:t>
             </w:r>
           </w:p>
         </w:tc>
@@ -4915,9 +5387,11 @@
             <w:hideMark/>
           </w:tcPr>
           <w:p>
+            <w:proofErr w:type="spellStart"/>
             <w:r>
               <w:t>folder_id</w:t>
             </w:r>
+            <w:proofErr w:type="spellEnd"/>
           </w:p>
         </w:tc>
         <w:tc>
@@ -4944,10 +5418,12 @@
             <w:hideMark/>
           </w:tcPr>
           <w:p>
+            <w:proofErr w:type="spellStart"/>
             <w:r>
               <w:lastRenderedPageBreak/>
               <w:t>alt_text</w:t>
             </w:r>
+            <w:proofErr w:type="spellEnd"/>
           </w:p>
         </w:tc>
         <w:tc>
@@ -5003,9 +5479,11 @@
             <w:hideMark/>
           </w:tcPr>
           <w:p>
+            <w:proofErr w:type="spellStart"/>
             <w:r>
               <w:t>uploaded_by</w:t>
             </w:r>
+            <w:proofErr w:type="spellEnd"/>
           </w:p>
         </w:tc>
         <w:tc>
@@ -5469,8 +5947,19 @@
           <w:sz w:val="28"/>
           <w:szCs w:val="28"/>
         </w:rPr>
-        <w:t xml:space="preserve"> jul</w:t>
-      </w:r>
+        <w:t xml:space="preserve"> </w:t>
+      </w:r>
+      <w:proofErr w:type="spellStart"/>
+      <w:r>
+        <w:rPr>
+          <w:b/>
+          <w:bCs/>
+          <w:sz w:val="28"/>
+          <w:szCs w:val="28"/>
+        </w:rPr>
+        <w:t>jul</w:t>
+      </w:r>
+      <w:proofErr w:type="spellEnd"/>
     </w:p>
     <w:p/>
     <w:p>
@@ -5633,7 +6122,15 @@
     <w:p>
       <w:r>
         <w:lastRenderedPageBreak/>
-        <w:t xml:space="preserve">    "media_file_id": 5</w:t>
+        <w:t xml:space="preserve">    "</w:t>
+      </w:r>
+      <w:proofErr w:type="spellStart"/>
+      <w:r>
+        <w:t>media_file_id</w:t>
+      </w:r>
+      <w:proofErr w:type="spellEnd"/>
+      <w:r>
+        <w:t>": 5</w:t>
       </w:r>
     </w:p>
     <w:p>
@@ -5698,17 +6195,41 @@
     </w:p>
     <w:p>
       <w:r>
-        <w:t xml:space="preserve">    "url": "...",</w:t>
-      </w:r>
-    </w:p>
-    <w:p>
-      <w:r>
-        <w:t xml:space="preserve">    "originalName": "...",</w:t>
-      </w:r>
-    </w:p>
-    <w:p>
-      <w:r>
-        <w:t xml:space="preserve">    "mimeType": "...",</w:t>
+        <w:t xml:space="preserve">    "</w:t>
+      </w:r>
+      <w:proofErr w:type="spellStart"/>
+      <w:r>
+        <w:t>url</w:t>
+      </w:r>
+      <w:proofErr w:type="spellEnd"/>
+      <w:r>
+        <w:t>": "...",</w:t>
+      </w:r>
+    </w:p>
+    <w:p>
+      <w:r>
+        <w:t xml:space="preserve">    "</w:t>
+      </w:r>
+      <w:proofErr w:type="spellStart"/>
+      <w:r>
+        <w:t>originalName</w:t>
+      </w:r>
+      <w:proofErr w:type="spellEnd"/>
+      <w:r>
+        <w:t>": "...",</w:t>
+      </w:r>
+    </w:p>
+    <w:p>
+      <w:r>
+        <w:t xml:space="preserve">    "</w:t>
+      </w:r>
+      <w:proofErr w:type="spellStart"/>
+      <w:r>
+        <w:t>mimeType</w:t>
+      </w:r>
+      <w:proofErr w:type="spellEnd"/>
+      <w:r>
+        <w:t>": "...",</w:t>
       </w:r>
     </w:p>
     <w:p>
@@ -5816,12 +6337,28 @@
     </w:p>
     <w:p>
       <w:r>
-        <w:t xml:space="preserve">    "recentNews":[...],</w:t>
-      </w:r>
-    </w:p>
-    <w:p>
-      <w:r>
-        <w:t xml:space="preserve">    "recentProjects":[...]</w:t>
+        <w:t xml:space="preserve">    "</w:t>
+      </w:r>
+      <w:proofErr w:type="spellStart"/>
+      <w:r>
+        <w:t>recentNews</w:t>
+      </w:r>
+      <w:proofErr w:type="spellEnd"/>
+      <w:r>
+        <w:t>":[...],</w:t>
+      </w:r>
+    </w:p>
+    <w:p>
+      <w:r>
+        <w:t xml:space="preserve">    "</w:t>
+      </w:r>
+      <w:proofErr w:type="spellStart"/>
+      <w:r>
+        <w:t>recentProjects</w:t>
+      </w:r>
+      <w:proofErr w:type="spellEnd"/>
+      <w:r>
+        <w:t>":[...]</w:t>
       </w:r>
     </w:p>
     <w:p>
@@ -6075,25 +6612,62 @@
     </w:p>
     <w:p>
       <w:r>
-        <w:t>GET /admin/projects?search=subansiri</w:t>
-      </w:r>
-    </w:p>
-    <w:p/>
-    <w:p>
-      <w:r>
-        <w:t>GET /admin/news?search=solar</w:t>
-      </w:r>
-    </w:p>
-    <w:p/>
-    <w:p>
-      <w:r>
-        <w:t>GET /admin/tenders?status=OPEN</w:t>
-      </w:r>
-    </w:p>
-    <w:p/>
-    <w:p>
-      <w:r>
-        <w:t>GET /admin/careers?employmentType=REGULAR</w:t>
+        <w:t>GET /admin/</w:t>
+      </w:r>
+      <w:proofErr w:type="spellStart"/>
+      <w:r>
+        <w:t>projects?search</w:t>
+      </w:r>
+      <w:proofErr w:type="spellEnd"/>
+      <w:r>
+        <w:t>=</w:t>
+      </w:r>
+      <w:proofErr w:type="spellStart"/>
+      <w:r>
+        <w:t>subansiri</w:t>
+      </w:r>
+      <w:proofErr w:type="spellEnd"/>
+    </w:p>
+    <w:p/>
+    <w:p>
+      <w:r>
+        <w:t>GET /admin/</w:t>
+      </w:r>
+      <w:proofErr w:type="spellStart"/>
+      <w:r>
+        <w:t>news?search</w:t>
+      </w:r>
+      <w:proofErr w:type="spellEnd"/>
+      <w:r>
+        <w:t>=solar</w:t>
+      </w:r>
+    </w:p>
+    <w:p/>
+    <w:p>
+      <w:r>
+        <w:t>GET /admin/</w:t>
+      </w:r>
+      <w:proofErr w:type="spellStart"/>
+      <w:r>
+        <w:t>tenders?status</w:t>
+      </w:r>
+      <w:proofErr w:type="spellEnd"/>
+      <w:r>
+        <w:t>=OPEN</w:t>
+      </w:r>
+    </w:p>
+    <w:p/>
+    <w:p>
+      <w:r>
+        <w:t>GET /admin/</w:t>
+      </w:r>
+      <w:proofErr w:type="spellStart"/>
+      <w:r>
+        <w:t>careers?employmentType</w:t>
+      </w:r>
+      <w:proofErr w:type="spellEnd"/>
+      <w:r>
+        <w:t>=REGULAR</w:t>
       </w:r>
     </w:p>
     <w:p>
@@ -6281,6 +6855,654 @@
         <w:t>Once these are in place, your backend will be essentially production-ready for the admin frontend.</w:t>
       </w:r>
     </w:p>
+    <w:p>
+      <w:pPr>
+        <w:pBdr>
+          <w:bottom w:val="double" w:sz="6" w:space="1" w:color="auto"/>
+        </w:pBdr>
+      </w:pPr>
+    </w:p>
+    <w:p>
+      <w:pPr>
+        <w:rPr>
+          <w:b/>
+          <w:bCs/>
+        </w:rPr>
+      </w:pPr>
+      <w:r>
+        <w:rPr>
+          <w:b/>
+          <w:bCs/>
+        </w:rPr>
+        <w:t>Backend Review</w:t>
+      </w:r>
+    </w:p>
+    <w:p>
+      <w:r>
+        <w:t>After following your project from the database design through every module, here's my assessment.</w:t>
+      </w:r>
+    </w:p>
+    <w:p>
+      <w:pPr>
+        <w:rPr>
+          <w:b/>
+          <w:bCs/>
+        </w:rPr>
+      </w:pPr>
+      <w:r>
+        <w:rPr>
+          <w:b/>
+          <w:bCs/>
+        </w:rPr>
+        <w:t>Core Infrastructure</w:t>
+      </w:r>
+    </w:p>
+    <w:p>
+      <w:pPr>
+        <w:numPr>
+          <w:ilvl w:val="0"/>
+          <w:numId w:val="3"/>
+        </w:numPr>
+      </w:pPr>
+      <w:r>
+        <w:rPr>
+          <w:rFonts w:ascii="Segoe UI Emoji" w:hAnsi="Segoe UI Emoji" w:cs="Segoe UI Emoji"/>
+        </w:rPr>
+        <w:t>✅</w:t>
+      </w:r>
+      <w:r>
+        <w:t xml:space="preserve"> Authentication (JWT + Refresh) </w:t>
+      </w:r>
+    </w:p>
+    <w:p>
+      <w:pPr>
+        <w:numPr>
+          <w:ilvl w:val="0"/>
+          <w:numId w:val="3"/>
+        </w:numPr>
+      </w:pPr>
+      <w:r>
+        <w:rPr>
+          <w:rFonts w:ascii="Segoe UI Emoji" w:hAnsi="Segoe UI Emoji" w:cs="Segoe UI Emoji"/>
+        </w:rPr>
+        <w:t>✅</w:t>
+      </w:r>
+      <w:r>
+        <w:t xml:space="preserve"> Authorization </w:t>
+      </w:r>
+    </w:p>
+    <w:p>
+      <w:pPr>
+        <w:numPr>
+          <w:ilvl w:val="0"/>
+          <w:numId w:val="3"/>
+        </w:numPr>
+      </w:pPr>
+      <w:r>
+        <w:rPr>
+          <w:rFonts w:ascii="Segoe UI Emoji" w:hAnsi="Segoe UI Emoji" w:cs="Segoe UI Emoji"/>
+        </w:rPr>
+        <w:t>✅</w:t>
+      </w:r>
+      <w:r>
+        <w:t xml:space="preserve"> Validation </w:t>
+      </w:r>
+    </w:p>
+    <w:p>
+      <w:pPr>
+        <w:numPr>
+          <w:ilvl w:val="0"/>
+          <w:numId w:val="3"/>
+        </w:numPr>
+      </w:pPr>
+      <w:r>
+        <w:rPr>
+          <w:rFonts w:ascii="Segoe UI Emoji" w:hAnsi="Segoe UI Emoji" w:cs="Segoe UI Emoji"/>
+        </w:rPr>
+        <w:t>✅</w:t>
+      </w:r>
+      <w:r>
+        <w:t xml:space="preserve"> Error Handling </w:t>
+      </w:r>
+    </w:p>
+    <w:p>
+      <w:pPr>
+        <w:numPr>
+          <w:ilvl w:val="0"/>
+          <w:numId w:val="3"/>
+        </w:numPr>
+      </w:pPr>
+      <w:r>
+        <w:rPr>
+          <w:rFonts w:ascii="Segoe UI Emoji" w:hAnsi="Segoe UI Emoji" w:cs="Segoe UI Emoji"/>
+        </w:rPr>
+        <w:t>✅</w:t>
+      </w:r>
+      <w:r>
+        <w:t xml:space="preserve"> Repository Pattern </w:t>
+      </w:r>
+    </w:p>
+    <w:p>
+      <w:pPr>
+        <w:numPr>
+          <w:ilvl w:val="0"/>
+          <w:numId w:val="3"/>
+        </w:numPr>
+      </w:pPr>
+      <w:r>
+        <w:rPr>
+          <w:rFonts w:ascii="Segoe UI Emoji" w:hAnsi="Segoe UI Emoji" w:cs="Segoe UI Emoji"/>
+        </w:rPr>
+        <w:t>✅</w:t>
+      </w:r>
+      <w:r>
+        <w:t xml:space="preserve"> Service Layer </w:t>
+      </w:r>
+    </w:p>
+    <w:p>
+      <w:pPr>
+        <w:numPr>
+          <w:ilvl w:val="0"/>
+          <w:numId w:val="3"/>
+        </w:numPr>
+      </w:pPr>
+      <w:r>
+        <w:rPr>
+          <w:rFonts w:ascii="Segoe UI Emoji" w:hAnsi="Segoe UI Emoji" w:cs="Segoe UI Emoji"/>
+        </w:rPr>
+        <w:t>✅</w:t>
+      </w:r>
+      <w:r>
+        <w:t xml:space="preserve"> Pagination </w:t>
+      </w:r>
+    </w:p>
+    <w:p>
+      <w:pPr>
+        <w:numPr>
+          <w:ilvl w:val="0"/>
+          <w:numId w:val="3"/>
+        </w:numPr>
+      </w:pPr>
+      <w:r>
+        <w:rPr>
+          <w:rFonts w:ascii="Segoe UI Emoji" w:hAnsi="Segoe UI Emoji" w:cs="Segoe UI Emoji"/>
+        </w:rPr>
+        <w:t>✅</w:t>
+      </w:r>
+      <w:r>
+        <w:t xml:space="preserve"> Media Upload </w:t>
+      </w:r>
+    </w:p>
+    <w:p>
+      <w:pPr>
+        <w:numPr>
+          <w:ilvl w:val="0"/>
+          <w:numId w:val="3"/>
+        </w:numPr>
+      </w:pPr>
+      <w:r>
+        <w:rPr>
+          <w:rFonts w:ascii="Segoe UI Emoji" w:hAnsi="Segoe UI Emoji" w:cs="Segoe UI Emoji"/>
+        </w:rPr>
+        <w:t>✅</w:t>
+      </w:r>
+      <w:r>
+        <w:t xml:space="preserve"> Lookup APIs </w:t>
+      </w:r>
+    </w:p>
+    <w:p>
+      <w:pPr>
+        <w:numPr>
+          <w:ilvl w:val="0"/>
+          <w:numId w:val="3"/>
+        </w:numPr>
+      </w:pPr>
+      <w:r>
+        <w:rPr>
+          <w:rFonts w:ascii="Segoe UI Emoji" w:hAnsi="Segoe UI Emoji" w:cs="Segoe UI Emoji"/>
+        </w:rPr>
+        <w:t>✅</w:t>
+      </w:r>
+      <w:r>
+        <w:t xml:space="preserve"> Dashboard </w:t>
+      </w:r>
+    </w:p>
+    <w:p>
+      <w:r>
+        <w:pict w14:anchorId="7551A272">
+          <v:rect id="_x0000_i1110" style="width:0;height:1.5pt" o:hralign="center" o:hrstd="t" o:hr="t" fillcolor="#a0a0a0" stroked="f"/>
+        </w:pict>
+      </w:r>
+    </w:p>
+    <w:p>
+      <w:pPr>
+        <w:rPr>
+          <w:b/>
+          <w:bCs/>
+        </w:rPr>
+      </w:pPr>
+      <w:r>
+        <w:rPr>
+          <w:b/>
+          <w:bCs/>
+        </w:rPr>
+        <w:t>Public APIs</w:t>
+      </w:r>
+    </w:p>
+    <w:p>
+      <w:pPr>
+        <w:numPr>
+          <w:ilvl w:val="0"/>
+          <w:numId w:val="4"/>
+        </w:numPr>
+      </w:pPr>
+      <w:r>
+        <w:rPr>
+          <w:rFonts w:ascii="Segoe UI Emoji" w:hAnsi="Segoe UI Emoji" w:cs="Segoe UI Emoji"/>
+        </w:rPr>
+        <w:t>✅</w:t>
+      </w:r>
+      <w:r>
+        <w:t xml:space="preserve"> Homepage </w:t>
+      </w:r>
+    </w:p>
+    <w:p>
+      <w:pPr>
+        <w:numPr>
+          <w:ilvl w:val="0"/>
+          <w:numId w:val="4"/>
+        </w:numPr>
+      </w:pPr>
+      <w:r>
+        <w:rPr>
+          <w:rFonts w:ascii="Segoe UI Emoji" w:hAnsi="Segoe UI Emoji" w:cs="Segoe UI Emoji"/>
+        </w:rPr>
+        <w:t>✅</w:t>
+      </w:r>
+      <w:r>
+        <w:t xml:space="preserve"> Projects </w:t>
+      </w:r>
+    </w:p>
+    <w:p>
+      <w:pPr>
+        <w:numPr>
+          <w:ilvl w:val="0"/>
+          <w:numId w:val="4"/>
+        </w:numPr>
+      </w:pPr>
+      <w:r>
+        <w:rPr>
+          <w:rFonts w:ascii="Segoe UI Emoji" w:hAnsi="Segoe UI Emoji" w:cs="Segoe UI Emoji"/>
+        </w:rPr>
+        <w:t>✅</w:t>
+      </w:r>
+      <w:r>
+        <w:t xml:space="preserve"> News </w:t>
+      </w:r>
+    </w:p>
+    <w:p>
+      <w:pPr>
+        <w:numPr>
+          <w:ilvl w:val="0"/>
+          <w:numId w:val="4"/>
+        </w:numPr>
+      </w:pPr>
+      <w:r>
+        <w:rPr>
+          <w:rFonts w:ascii="Segoe UI Emoji" w:hAnsi="Segoe UI Emoji" w:cs="Segoe UI Emoji"/>
+        </w:rPr>
+        <w:t>✅</w:t>
+      </w:r>
+      <w:r>
+        <w:t xml:space="preserve"> Careers </w:t>
+      </w:r>
+    </w:p>
+    <w:p>
+      <w:pPr>
+        <w:numPr>
+          <w:ilvl w:val="0"/>
+          <w:numId w:val="4"/>
+        </w:numPr>
+      </w:pPr>
+      <w:r>
+        <w:rPr>
+          <w:rFonts w:ascii="Segoe UI Emoji" w:hAnsi="Segoe UI Emoji" w:cs="Segoe UI Emoji"/>
+        </w:rPr>
+        <w:t>✅</w:t>
+      </w:r>
+      <w:r>
+        <w:t xml:space="preserve"> Tenders </w:t>
+      </w:r>
+    </w:p>
+    <w:p>
+      <w:pPr>
+        <w:numPr>
+          <w:ilvl w:val="0"/>
+          <w:numId w:val="4"/>
+        </w:numPr>
+      </w:pPr>
+      <w:r>
+        <w:rPr>
+          <w:rFonts w:ascii="Segoe UI Emoji" w:hAnsi="Segoe UI Emoji" w:cs="Segoe UI Emoji"/>
+        </w:rPr>
+        <w:t>✅</w:t>
+      </w:r>
+      <w:r>
+        <w:t xml:space="preserve"> Leadership </w:t>
+      </w:r>
+    </w:p>
+    <w:p>
+      <w:pPr>
+        <w:numPr>
+          <w:ilvl w:val="0"/>
+          <w:numId w:val="4"/>
+        </w:numPr>
+      </w:pPr>
+      <w:r>
+        <w:rPr>
+          <w:rFonts w:ascii="Segoe UI Emoji" w:hAnsi="Segoe UI Emoji" w:cs="Segoe UI Emoji"/>
+        </w:rPr>
+        <w:t>✅</w:t>
+      </w:r>
+      <w:r>
+        <w:t xml:space="preserve"> Sustainability </w:t>
+      </w:r>
+    </w:p>
+    <w:p>
+      <w:pPr>
+        <w:numPr>
+          <w:ilvl w:val="0"/>
+          <w:numId w:val="4"/>
+        </w:numPr>
+      </w:pPr>
+      <w:r>
+        <w:rPr>
+          <w:rFonts w:ascii="Segoe UI Emoji" w:hAnsi="Segoe UI Emoji" w:cs="Segoe UI Emoji"/>
+        </w:rPr>
+        <w:t>✅</w:t>
+      </w:r>
+      <w:r>
+        <w:t xml:space="preserve"> Investors </w:t>
+      </w:r>
+    </w:p>
+    <w:p>
+      <w:r>
+        <w:lastRenderedPageBreak/>
+        <w:pict w14:anchorId="57D1E6B3">
+          <v:rect id="_x0000_i1111" style="width:0;height:1.5pt" o:hralign="center" o:hrstd="t" o:hr="t" fillcolor="#a0a0a0" stroked="f"/>
+        </w:pict>
+      </w:r>
+    </w:p>
+    <w:p>
+      <w:pPr>
+        <w:rPr>
+          <w:b/>
+          <w:bCs/>
+        </w:rPr>
+      </w:pPr>
+      <w:r>
+        <w:rPr>
+          <w:b/>
+          <w:bCs/>
+        </w:rPr>
+        <w:t>Admin APIs</w:t>
+      </w:r>
+    </w:p>
+    <w:p>
+      <w:pPr>
+        <w:numPr>
+          <w:ilvl w:val="0"/>
+          <w:numId w:val="5"/>
+        </w:numPr>
+      </w:pPr>
+      <w:r>
+        <w:rPr>
+          <w:rFonts w:ascii="Segoe UI Emoji" w:hAnsi="Segoe UI Emoji" w:cs="Segoe UI Emoji"/>
+        </w:rPr>
+        <w:t>✅</w:t>
+      </w:r>
+      <w:r>
+        <w:t xml:space="preserve"> Homepage Hero </w:t>
+      </w:r>
+    </w:p>
+    <w:p>
+      <w:pPr>
+        <w:numPr>
+          <w:ilvl w:val="0"/>
+          <w:numId w:val="5"/>
+        </w:numPr>
+      </w:pPr>
+      <w:r>
+        <w:rPr>
+          <w:rFonts w:ascii="Segoe UI Emoji" w:hAnsi="Segoe UI Emoji" w:cs="Segoe UI Emoji"/>
+        </w:rPr>
+        <w:t>✅</w:t>
+      </w:r>
+      <w:r>
+        <w:t xml:space="preserve"> Projects CRUD </w:t>
+      </w:r>
+    </w:p>
+    <w:p>
+      <w:pPr>
+        <w:numPr>
+          <w:ilvl w:val="0"/>
+          <w:numId w:val="5"/>
+        </w:numPr>
+      </w:pPr>
+      <w:r>
+        <w:rPr>
+          <w:rFonts w:ascii="Segoe UI Emoji" w:hAnsi="Segoe UI Emoji" w:cs="Segoe UI Emoji"/>
+        </w:rPr>
+        <w:t>✅</w:t>
+      </w:r>
+      <w:r>
+        <w:t xml:space="preserve"> News CRUD </w:t>
+      </w:r>
+    </w:p>
+    <w:p>
+      <w:pPr>
+        <w:numPr>
+          <w:ilvl w:val="0"/>
+          <w:numId w:val="5"/>
+        </w:numPr>
+      </w:pPr>
+      <w:r>
+        <w:rPr>
+          <w:rFonts w:ascii="Segoe UI Emoji" w:hAnsi="Segoe UI Emoji" w:cs="Segoe UI Emoji"/>
+        </w:rPr>
+        <w:t>✅</w:t>
+      </w:r>
+      <w:r>
+        <w:t xml:space="preserve"> Careers CRUD </w:t>
+      </w:r>
+    </w:p>
+    <w:p>
+      <w:pPr>
+        <w:numPr>
+          <w:ilvl w:val="0"/>
+          <w:numId w:val="5"/>
+        </w:numPr>
+      </w:pPr>
+      <w:r>
+        <w:rPr>
+          <w:rFonts w:ascii="Segoe UI Emoji" w:hAnsi="Segoe UI Emoji" w:cs="Segoe UI Emoji"/>
+        </w:rPr>
+        <w:t>✅</w:t>
+      </w:r>
+      <w:r>
+        <w:t xml:space="preserve"> Tenders CRUD </w:t>
+      </w:r>
+    </w:p>
+    <w:p>
+      <w:pPr>
+        <w:numPr>
+          <w:ilvl w:val="0"/>
+          <w:numId w:val="5"/>
+        </w:numPr>
+      </w:pPr>
+      <w:r>
+        <w:rPr>
+          <w:rFonts w:ascii="Segoe UI Emoji" w:hAnsi="Segoe UI Emoji" w:cs="Segoe UI Emoji"/>
+        </w:rPr>
+        <w:t>✅</w:t>
+      </w:r>
+      <w:r>
+        <w:t xml:space="preserve"> Leadership CRUD </w:t>
+      </w:r>
+    </w:p>
+    <w:p>
+      <w:pPr>
+        <w:numPr>
+          <w:ilvl w:val="0"/>
+          <w:numId w:val="5"/>
+        </w:numPr>
+      </w:pPr>
+      <w:r>
+        <w:rPr>
+          <w:rFonts w:ascii="Segoe UI Emoji" w:hAnsi="Segoe UI Emoji" w:cs="Segoe UI Emoji"/>
+        </w:rPr>
+        <w:t>✅</w:t>
+      </w:r>
+      <w:r>
+        <w:t xml:space="preserve"> Sustainability CRUD </w:t>
+      </w:r>
+    </w:p>
+    <w:p>
+      <w:pPr>
+        <w:numPr>
+          <w:ilvl w:val="0"/>
+          <w:numId w:val="5"/>
+        </w:numPr>
+      </w:pPr>
+      <w:r>
+        <w:rPr>
+          <w:rFonts w:ascii="Segoe UI Emoji" w:hAnsi="Segoe UI Emoji" w:cs="Segoe UI Emoji"/>
+        </w:rPr>
+        <w:t>✅</w:t>
+      </w:r>
+      <w:r>
+        <w:t xml:space="preserve"> Investors CRUD </w:t>
+      </w:r>
+    </w:p>
+    <w:p>
+      <w:pPr>
+        <w:numPr>
+          <w:ilvl w:val="0"/>
+          <w:numId w:val="5"/>
+        </w:numPr>
+      </w:pPr>
+      <w:r>
+        <w:rPr>
+          <w:rFonts w:ascii="Segoe UI Emoji" w:hAnsi="Segoe UI Emoji" w:cs="Segoe UI Emoji"/>
+        </w:rPr>
+        <w:t>✅</w:t>
+      </w:r>
+      <w:r>
+        <w:t xml:space="preserve"> Media Library </w:t>
+      </w:r>
+    </w:p>
+    <w:p>
+      <w:pPr>
+        <w:numPr>
+          <w:ilvl w:val="0"/>
+          <w:numId w:val="5"/>
+        </w:numPr>
+      </w:pPr>
+      <w:r>
+        <w:rPr>
+          <w:rFonts w:ascii="Segoe UI Emoji" w:hAnsi="Segoe UI Emoji" w:cs="Segoe UI Emoji"/>
+        </w:rPr>
+        <w:t>✅</w:t>
+      </w:r>
+      <w:r>
+        <w:t xml:space="preserve"> Dashboard </w:t>
+      </w:r>
+    </w:p>
+    <w:p>
+      <w:pPr>
+        <w:numPr>
+          <w:ilvl w:val="0"/>
+          <w:numId w:val="5"/>
+        </w:numPr>
+      </w:pPr>
+      <w:r>
+        <w:rPr>
+          <w:rFonts w:ascii="Segoe UI Emoji" w:hAnsi="Segoe UI Emoji" w:cs="Segoe UI Emoji"/>
+        </w:rPr>
+        <w:t>✅</w:t>
+      </w:r>
+      <w:r>
+        <w:t xml:space="preserve"> Lookups </w:t>
+      </w:r>
+    </w:p>
+    <w:p>
+      <w:r>
+        <w:pict w14:anchorId="2A8C4176">
+          <v:rect id="_x0000_i1112" style="width:0;height:1.5pt" o:hralign="center" o:hrstd="t" o:hr="t" fillcolor="#a0a0a0" stroked="f"/>
+        </w:pict>
+      </w:r>
+    </w:p>
+    <w:p>
+      <w:pPr>
+        <w:rPr>
+          <w:b/>
+          <w:bCs/>
+        </w:rPr>
+      </w:pPr>
+      <w:r>
+        <w:rPr>
+          <w:b/>
+          <w:bCs/>
+        </w:rPr>
+        <w:t>Architecture</w:t>
+      </w:r>
+    </w:p>
+    <w:p>
+      <w:r>
+        <w:t>You now have a very consistent architecture:</w:t>
+      </w:r>
+    </w:p>
+    <w:p>
+      <w:r>
+        <w:t>Controller</w:t>
+      </w:r>
+    </w:p>
+    <w:p>
+      <w:r>
+        <w:t xml:space="preserve">      ↓</w:t>
+      </w:r>
+    </w:p>
+    <w:p>
+      <w:r>
+        <w:t>Service</w:t>
+      </w:r>
+    </w:p>
+    <w:p>
+      <w:r>
+        <w:t xml:space="preserve">      ↓</w:t>
+      </w:r>
+    </w:p>
+    <w:p>
+      <w:r>
+        <w:t>Repository</w:t>
+      </w:r>
+    </w:p>
+    <w:p>
+      <w:r>
+        <w:t xml:space="preserve">      ↓</w:t>
+      </w:r>
+    </w:p>
+    <w:p>
+      <w:r>
+        <w:t>Prisma</w:t>
+      </w:r>
+    </w:p>
+    <w:p>
+      <w:r>
+        <w:t>Every module follows the same structure, which will make future maintenance much easier</w:t>
+      </w:r>
+    </w:p>
+    <w:p/>
     <w:p/>
     <w:p/>
     <w:p/>
@@ -6297,122 +7519,9 @@
 <file path=word/numbering.xml><?xml version="1.0" encoding="utf-8"?>
 <w:numbering xmlns:wpc="http://schemas.microsoft.com/office/word/2010/wordprocessingCanvas" xmlns:cx="http://schemas.microsoft.com/office/drawing/2014/chartex" xmlns:cx1="http://schemas.microsoft.com/office/drawing/2015/9/8/chartex" xmlns:cx2="http://schemas.microsoft.com/office/drawing/2015/10/21/chartex" xmlns:cx3="http://schemas.microsoft.com/office/drawing/2016/5/9/chartex" xmlns:cx4="http://schemas.microsoft.com/office/drawing/2016/5/10/chartex" xmlns:cx5="http://schemas.microsoft.com/office/drawing/2016/5/11/chartex" xmlns:cx6="http://schemas.microsoft.com/office/drawing/2016/5/12/chartex" xmlns:cx7="http://schemas.microsoft.com/office/drawing/2016/5/13/chartex" xmlns:cx8="http://schemas.microsoft.com/office/drawing/2016/5/14/chartex" xmlns:mc="http://schemas.openxmlformats.org/markup-compatibility/2006" xmlns:aink="http://schemas.microsoft.com/office/drawing/2016/ink" xmlns:am3d="http://schemas.microsoft.com/office/drawing/2017/model3d" xmlns:o="urn:schemas-microsoft-com:office:office" xmlns:oel="http://schemas.microsoft.com/office/2019/extlst" xmlns:r="http://schemas.openxmlformats.org/officeDocument/2006/relationships" xmlns:m="http://schemas.openxmlformats.org/officeDocument/2006/math" xmlns:v="urn:schemas-microsoft-com:vml" xmlns:wp14="http://schemas.microsoft.com/office/word/2010/wordprocessingDrawing" xmlns:wp="http://schemas.openxmlformats.org/drawingml/2006/wordprocessingDrawing" xmlns:w10="urn:schemas-microsoft-com:office:word" xmlns:w="http://schemas.openxmlformats.org/wordprocessingml/2006/main" xmlns:w14="http://schemas.microsoft.com/office/word/2010/wordml" xmlns:w15="http://schemas.microsoft.com/office/word/2012/wordml" xmlns:w16cex="http://schemas.microsoft.com/office/word/2018/wordml/cex" xmlns:w16cid="http://schemas.microsoft.com/office/word/2016/wordml/cid" xmlns:w16="http://schemas.microsoft.com/office/word/2018/wordml" xmlns:w16du="http://schemas.microsoft.com/office/word/2023/wordml/word16du" xmlns:w16sdtdh="http://schemas.microsoft.com/office/word/2020/wordml/sdtdatahash" xmlns:w16sdtfl="http://schemas.microsoft.com/office/word/2024/wordml/sdtformatlock" xmlns:w16se="http://schemas.microsoft.com/office/word/2015/wordml/symex" xmlns:wpg="http://schemas.microsoft.com/office/word/2010/wordprocessingGroup" xmlns:wpi="http://schemas.microsoft.com/office/word/2010/wordprocessingInk" xmlns:wne="http://schemas.microsoft.com/office/word/2006/wordml" xmlns:wps="http://schemas.microsoft.com/office/word/2010/wordprocessingShape" mc:Ignorable="w14 w15 w16se w16cid w16 w16cex w16sdtdh w16sdtfl w16du wp14">
   <w:abstractNum w:abstractNumId="0" w15:restartNumberingAfterBreak="0">
-    <w:nsid w:val="506F6DE6"/>
+    <w:nsid w:val="00991BF4"/>
     <w:multiLevelType w:val="multilevel"/>
-    <w:tmpl w:val="AE126D08"/>
-    <w:lvl w:ilvl="0">
-      <w:start w:val="1"/>
-      <w:numFmt w:val="decimal"/>
-      <w:lvlText w:val="%1."/>
-      <w:lvlJc w:val="left"/>
-      <w:pPr>
-        <w:tabs>
-          <w:tab w:val="num" w:pos="720"/>
-        </w:tabs>
-        <w:ind w:left="720" w:hanging="360"/>
-      </w:pPr>
-    </w:lvl>
-    <w:lvl w:ilvl="1" w:tentative="1">
-      <w:start w:val="1"/>
-      <w:numFmt w:val="decimal"/>
-      <w:lvlText w:val="%2."/>
-      <w:lvlJc w:val="left"/>
-      <w:pPr>
-        <w:tabs>
-          <w:tab w:val="num" w:pos="1440"/>
-        </w:tabs>
-        <w:ind w:left="1440" w:hanging="360"/>
-      </w:pPr>
-    </w:lvl>
-    <w:lvl w:ilvl="2" w:tentative="1">
-      <w:start w:val="1"/>
-      <w:numFmt w:val="decimal"/>
-      <w:lvlText w:val="%3."/>
-      <w:lvlJc w:val="left"/>
-      <w:pPr>
-        <w:tabs>
-          <w:tab w:val="num" w:pos="2160"/>
-        </w:tabs>
-        <w:ind w:left="2160" w:hanging="360"/>
-      </w:pPr>
-    </w:lvl>
-    <w:lvl w:ilvl="3" w:tentative="1">
-      <w:start w:val="1"/>
-      <w:numFmt w:val="decimal"/>
-      <w:lvlText w:val="%4."/>
-      <w:lvlJc w:val="left"/>
-      <w:pPr>
-        <w:tabs>
-          <w:tab w:val="num" w:pos="2880"/>
-        </w:tabs>
-        <w:ind w:left="2880" w:hanging="360"/>
-      </w:pPr>
-    </w:lvl>
-    <w:lvl w:ilvl="4" w:tentative="1">
-      <w:start w:val="1"/>
-      <w:numFmt w:val="decimal"/>
-      <w:lvlText w:val="%5."/>
-      <w:lvlJc w:val="left"/>
-      <w:pPr>
-        <w:tabs>
-          <w:tab w:val="num" w:pos="3600"/>
-        </w:tabs>
-        <w:ind w:left="3600" w:hanging="360"/>
-      </w:pPr>
-    </w:lvl>
-    <w:lvl w:ilvl="5" w:tentative="1">
-      <w:start w:val="1"/>
-      <w:numFmt w:val="decimal"/>
-      <w:lvlText w:val="%6."/>
-      <w:lvlJc w:val="left"/>
-      <w:pPr>
-        <w:tabs>
-          <w:tab w:val="num" w:pos="4320"/>
-        </w:tabs>
-        <w:ind w:left="4320" w:hanging="360"/>
-      </w:pPr>
-    </w:lvl>
-    <w:lvl w:ilvl="6" w:tentative="1">
-      <w:start w:val="1"/>
-      <w:numFmt w:val="decimal"/>
-      <w:lvlText w:val="%7."/>
-      <w:lvlJc w:val="left"/>
-      <w:pPr>
-        <w:tabs>
-          <w:tab w:val="num" w:pos="5040"/>
-        </w:tabs>
-        <w:ind w:left="5040" w:hanging="360"/>
-      </w:pPr>
-    </w:lvl>
-    <w:lvl w:ilvl="7" w:tentative="1">
-      <w:start w:val="1"/>
-      <w:numFmt w:val="decimal"/>
-      <w:lvlText w:val="%8."/>
-      <w:lvlJc w:val="left"/>
-      <w:pPr>
-        <w:tabs>
-          <w:tab w:val="num" w:pos="5760"/>
-        </w:tabs>
-        <w:ind w:left="5760" w:hanging="360"/>
-      </w:pPr>
-    </w:lvl>
-    <w:lvl w:ilvl="8" w:tentative="1">
-      <w:start w:val="1"/>
-      <w:numFmt w:val="decimal"/>
-      <w:lvlText w:val="%9."/>
-      <w:lvlJc w:val="left"/>
-      <w:pPr>
-        <w:tabs>
-          <w:tab w:val="num" w:pos="6480"/>
-        </w:tabs>
-        <w:ind w:left="6480" w:hanging="360"/>
-      </w:pPr>
-    </w:lvl>
-  </w:abstractNum>
-  <w:abstractNum w:abstractNumId="1" w15:restartNumberingAfterBreak="0">
-    <w:nsid w:val="65BD624F"/>
-    <w:multiLevelType w:val="multilevel"/>
-    <w:tmpl w:val="7966B26A"/>
+    <w:tmpl w:val="5192BEEA"/>
     <w:lvl w:ilvl="0">
       <w:start w:val="1"/>
       <w:numFmt w:val="bullet"/>
@@ -6558,11 +7667,580 @@
       </w:rPr>
     </w:lvl>
   </w:abstractNum>
+  <w:abstractNum w:abstractNumId="1" w15:restartNumberingAfterBreak="0">
+    <w:nsid w:val="4AD105C3"/>
+    <w:multiLevelType w:val="multilevel"/>
+    <w:tmpl w:val="7966D0C6"/>
+    <w:lvl w:ilvl="0">
+      <w:start w:val="1"/>
+      <w:numFmt w:val="bullet"/>
+      <w:lvlText w:val=""/>
+      <w:lvlJc w:val="left"/>
+      <w:pPr>
+        <w:tabs>
+          <w:tab w:val="num" w:pos="720"/>
+        </w:tabs>
+        <w:ind w:left="720" w:hanging="360"/>
+      </w:pPr>
+      <w:rPr>
+        <w:rFonts w:ascii="Symbol" w:hAnsi="Symbol" w:hint="default"/>
+        <w:sz w:val="20"/>
+      </w:rPr>
+    </w:lvl>
+    <w:lvl w:ilvl="1" w:tentative="1">
+      <w:start w:val="1"/>
+      <w:numFmt w:val="bullet"/>
+      <w:lvlText w:val="o"/>
+      <w:lvlJc w:val="left"/>
+      <w:pPr>
+        <w:tabs>
+          <w:tab w:val="num" w:pos="1440"/>
+        </w:tabs>
+        <w:ind w:left="1440" w:hanging="360"/>
+      </w:pPr>
+      <w:rPr>
+        <w:rFonts w:ascii="Courier New" w:hAnsi="Courier New" w:hint="default"/>
+        <w:sz w:val="20"/>
+      </w:rPr>
+    </w:lvl>
+    <w:lvl w:ilvl="2" w:tentative="1">
+      <w:start w:val="1"/>
+      <w:numFmt w:val="bullet"/>
+      <w:lvlText w:val=""/>
+      <w:lvlJc w:val="left"/>
+      <w:pPr>
+        <w:tabs>
+          <w:tab w:val="num" w:pos="2160"/>
+        </w:tabs>
+        <w:ind w:left="2160" w:hanging="360"/>
+      </w:pPr>
+      <w:rPr>
+        <w:rFonts w:ascii="Wingdings" w:hAnsi="Wingdings" w:hint="default"/>
+        <w:sz w:val="20"/>
+      </w:rPr>
+    </w:lvl>
+    <w:lvl w:ilvl="3" w:tentative="1">
+      <w:start w:val="1"/>
+      <w:numFmt w:val="bullet"/>
+      <w:lvlText w:val=""/>
+      <w:lvlJc w:val="left"/>
+      <w:pPr>
+        <w:tabs>
+          <w:tab w:val="num" w:pos="2880"/>
+        </w:tabs>
+        <w:ind w:left="2880" w:hanging="360"/>
+      </w:pPr>
+      <w:rPr>
+        <w:rFonts w:ascii="Wingdings" w:hAnsi="Wingdings" w:hint="default"/>
+        <w:sz w:val="20"/>
+      </w:rPr>
+    </w:lvl>
+    <w:lvl w:ilvl="4" w:tentative="1">
+      <w:start w:val="1"/>
+      <w:numFmt w:val="bullet"/>
+      <w:lvlText w:val=""/>
+      <w:lvlJc w:val="left"/>
+      <w:pPr>
+        <w:tabs>
+          <w:tab w:val="num" w:pos="3600"/>
+        </w:tabs>
+        <w:ind w:left="3600" w:hanging="360"/>
+      </w:pPr>
+      <w:rPr>
+        <w:rFonts w:ascii="Wingdings" w:hAnsi="Wingdings" w:hint="default"/>
+        <w:sz w:val="20"/>
+      </w:rPr>
+    </w:lvl>
+    <w:lvl w:ilvl="5" w:tentative="1">
+      <w:start w:val="1"/>
+      <w:numFmt w:val="bullet"/>
+      <w:lvlText w:val=""/>
+      <w:lvlJc w:val="left"/>
+      <w:pPr>
+        <w:tabs>
+          <w:tab w:val="num" w:pos="4320"/>
+        </w:tabs>
+        <w:ind w:left="4320" w:hanging="360"/>
+      </w:pPr>
+      <w:rPr>
+        <w:rFonts w:ascii="Wingdings" w:hAnsi="Wingdings" w:hint="default"/>
+        <w:sz w:val="20"/>
+      </w:rPr>
+    </w:lvl>
+    <w:lvl w:ilvl="6" w:tentative="1">
+      <w:start w:val="1"/>
+      <w:numFmt w:val="bullet"/>
+      <w:lvlText w:val=""/>
+      <w:lvlJc w:val="left"/>
+      <w:pPr>
+        <w:tabs>
+          <w:tab w:val="num" w:pos="5040"/>
+        </w:tabs>
+        <w:ind w:left="5040" w:hanging="360"/>
+      </w:pPr>
+      <w:rPr>
+        <w:rFonts w:ascii="Wingdings" w:hAnsi="Wingdings" w:hint="default"/>
+        <w:sz w:val="20"/>
+      </w:rPr>
+    </w:lvl>
+    <w:lvl w:ilvl="7" w:tentative="1">
+      <w:start w:val="1"/>
+      <w:numFmt w:val="bullet"/>
+      <w:lvlText w:val=""/>
+      <w:lvlJc w:val="left"/>
+      <w:pPr>
+        <w:tabs>
+          <w:tab w:val="num" w:pos="5760"/>
+        </w:tabs>
+        <w:ind w:left="5760" w:hanging="360"/>
+      </w:pPr>
+      <w:rPr>
+        <w:rFonts w:ascii="Wingdings" w:hAnsi="Wingdings" w:hint="default"/>
+        <w:sz w:val="20"/>
+      </w:rPr>
+    </w:lvl>
+    <w:lvl w:ilvl="8" w:tentative="1">
+      <w:start w:val="1"/>
+      <w:numFmt w:val="bullet"/>
+      <w:lvlText w:val=""/>
+      <w:lvlJc w:val="left"/>
+      <w:pPr>
+        <w:tabs>
+          <w:tab w:val="num" w:pos="6480"/>
+        </w:tabs>
+        <w:ind w:left="6480" w:hanging="360"/>
+      </w:pPr>
+      <w:rPr>
+        <w:rFonts w:ascii="Wingdings" w:hAnsi="Wingdings" w:hint="default"/>
+        <w:sz w:val="20"/>
+      </w:rPr>
+    </w:lvl>
+  </w:abstractNum>
+  <w:abstractNum w:abstractNumId="2" w15:restartNumberingAfterBreak="0">
+    <w:nsid w:val="506F6DE6"/>
+    <w:multiLevelType w:val="multilevel"/>
+    <w:tmpl w:val="AE126D08"/>
+    <w:lvl w:ilvl="0">
+      <w:start w:val="1"/>
+      <w:numFmt w:val="decimal"/>
+      <w:lvlText w:val="%1."/>
+      <w:lvlJc w:val="left"/>
+      <w:pPr>
+        <w:tabs>
+          <w:tab w:val="num" w:pos="720"/>
+        </w:tabs>
+        <w:ind w:left="720" w:hanging="360"/>
+      </w:pPr>
+    </w:lvl>
+    <w:lvl w:ilvl="1" w:tentative="1">
+      <w:start w:val="1"/>
+      <w:numFmt w:val="decimal"/>
+      <w:lvlText w:val="%2."/>
+      <w:lvlJc w:val="left"/>
+      <w:pPr>
+        <w:tabs>
+          <w:tab w:val="num" w:pos="1440"/>
+        </w:tabs>
+        <w:ind w:left="1440" w:hanging="360"/>
+      </w:pPr>
+    </w:lvl>
+    <w:lvl w:ilvl="2" w:tentative="1">
+      <w:start w:val="1"/>
+      <w:numFmt w:val="decimal"/>
+      <w:lvlText w:val="%3."/>
+      <w:lvlJc w:val="left"/>
+      <w:pPr>
+        <w:tabs>
+          <w:tab w:val="num" w:pos="2160"/>
+        </w:tabs>
+        <w:ind w:left="2160" w:hanging="360"/>
+      </w:pPr>
+    </w:lvl>
+    <w:lvl w:ilvl="3" w:tentative="1">
+      <w:start w:val="1"/>
+      <w:numFmt w:val="decimal"/>
+      <w:lvlText w:val="%4."/>
+      <w:lvlJc w:val="left"/>
+      <w:pPr>
+        <w:tabs>
+          <w:tab w:val="num" w:pos="2880"/>
+        </w:tabs>
+        <w:ind w:left="2880" w:hanging="360"/>
+      </w:pPr>
+    </w:lvl>
+    <w:lvl w:ilvl="4" w:tentative="1">
+      <w:start w:val="1"/>
+      <w:numFmt w:val="decimal"/>
+      <w:lvlText w:val="%5."/>
+      <w:lvlJc w:val="left"/>
+      <w:pPr>
+        <w:tabs>
+          <w:tab w:val="num" w:pos="3600"/>
+        </w:tabs>
+        <w:ind w:left="3600" w:hanging="360"/>
+      </w:pPr>
+    </w:lvl>
+    <w:lvl w:ilvl="5" w:tentative="1">
+      <w:start w:val="1"/>
+      <w:numFmt w:val="decimal"/>
+      <w:lvlText w:val="%6."/>
+      <w:lvlJc w:val="left"/>
+      <w:pPr>
+        <w:tabs>
+          <w:tab w:val="num" w:pos="4320"/>
+        </w:tabs>
+        <w:ind w:left="4320" w:hanging="360"/>
+      </w:pPr>
+    </w:lvl>
+    <w:lvl w:ilvl="6" w:tentative="1">
+      <w:start w:val="1"/>
+      <w:numFmt w:val="decimal"/>
+      <w:lvlText w:val="%7."/>
+      <w:lvlJc w:val="left"/>
+      <w:pPr>
+        <w:tabs>
+          <w:tab w:val="num" w:pos="5040"/>
+        </w:tabs>
+        <w:ind w:left="5040" w:hanging="360"/>
+      </w:pPr>
+    </w:lvl>
+    <w:lvl w:ilvl="7" w:tentative="1">
+      <w:start w:val="1"/>
+      <w:numFmt w:val="decimal"/>
+      <w:lvlText w:val="%8."/>
+      <w:lvlJc w:val="left"/>
+      <w:pPr>
+        <w:tabs>
+          <w:tab w:val="num" w:pos="5760"/>
+        </w:tabs>
+        <w:ind w:left="5760" w:hanging="360"/>
+      </w:pPr>
+    </w:lvl>
+    <w:lvl w:ilvl="8" w:tentative="1">
+      <w:start w:val="1"/>
+      <w:numFmt w:val="decimal"/>
+      <w:lvlText w:val="%9."/>
+      <w:lvlJc w:val="left"/>
+      <w:pPr>
+        <w:tabs>
+          <w:tab w:val="num" w:pos="6480"/>
+        </w:tabs>
+        <w:ind w:left="6480" w:hanging="360"/>
+      </w:pPr>
+    </w:lvl>
+  </w:abstractNum>
+  <w:abstractNum w:abstractNumId="3" w15:restartNumberingAfterBreak="0">
+    <w:nsid w:val="65BD624F"/>
+    <w:multiLevelType w:val="multilevel"/>
+    <w:tmpl w:val="7966B26A"/>
+    <w:lvl w:ilvl="0">
+      <w:start w:val="1"/>
+      <w:numFmt w:val="bullet"/>
+      <w:lvlText w:val=""/>
+      <w:lvlJc w:val="left"/>
+      <w:pPr>
+        <w:tabs>
+          <w:tab w:val="num" w:pos="720"/>
+        </w:tabs>
+        <w:ind w:left="720" w:hanging="360"/>
+      </w:pPr>
+      <w:rPr>
+        <w:rFonts w:ascii="Symbol" w:hAnsi="Symbol" w:hint="default"/>
+        <w:sz w:val="20"/>
+      </w:rPr>
+    </w:lvl>
+    <w:lvl w:ilvl="1" w:tentative="1">
+      <w:start w:val="1"/>
+      <w:numFmt w:val="bullet"/>
+      <w:lvlText w:val="o"/>
+      <w:lvlJc w:val="left"/>
+      <w:pPr>
+        <w:tabs>
+          <w:tab w:val="num" w:pos="1440"/>
+        </w:tabs>
+        <w:ind w:left="1440" w:hanging="360"/>
+      </w:pPr>
+      <w:rPr>
+        <w:rFonts w:ascii="Courier New" w:hAnsi="Courier New" w:hint="default"/>
+        <w:sz w:val="20"/>
+      </w:rPr>
+    </w:lvl>
+    <w:lvl w:ilvl="2" w:tentative="1">
+      <w:start w:val="1"/>
+      <w:numFmt w:val="bullet"/>
+      <w:lvlText w:val=""/>
+      <w:lvlJc w:val="left"/>
+      <w:pPr>
+        <w:tabs>
+          <w:tab w:val="num" w:pos="2160"/>
+        </w:tabs>
+        <w:ind w:left="2160" w:hanging="360"/>
+      </w:pPr>
+      <w:rPr>
+        <w:rFonts w:ascii="Wingdings" w:hAnsi="Wingdings" w:hint="default"/>
+        <w:sz w:val="20"/>
+      </w:rPr>
+    </w:lvl>
+    <w:lvl w:ilvl="3" w:tentative="1">
+      <w:start w:val="1"/>
+      <w:numFmt w:val="bullet"/>
+      <w:lvlText w:val=""/>
+      <w:lvlJc w:val="left"/>
+      <w:pPr>
+        <w:tabs>
+          <w:tab w:val="num" w:pos="2880"/>
+        </w:tabs>
+        <w:ind w:left="2880" w:hanging="360"/>
+      </w:pPr>
+      <w:rPr>
+        <w:rFonts w:ascii="Wingdings" w:hAnsi="Wingdings" w:hint="default"/>
+        <w:sz w:val="20"/>
+      </w:rPr>
+    </w:lvl>
+    <w:lvl w:ilvl="4" w:tentative="1">
+      <w:start w:val="1"/>
+      <w:numFmt w:val="bullet"/>
+      <w:lvlText w:val=""/>
+      <w:lvlJc w:val="left"/>
+      <w:pPr>
+        <w:tabs>
+          <w:tab w:val="num" w:pos="3600"/>
+        </w:tabs>
+        <w:ind w:left="3600" w:hanging="360"/>
+      </w:pPr>
+      <w:rPr>
+        <w:rFonts w:ascii="Wingdings" w:hAnsi="Wingdings" w:hint="default"/>
+        <w:sz w:val="20"/>
+      </w:rPr>
+    </w:lvl>
+    <w:lvl w:ilvl="5" w:tentative="1">
+      <w:start w:val="1"/>
+      <w:numFmt w:val="bullet"/>
+      <w:lvlText w:val=""/>
+      <w:lvlJc w:val="left"/>
+      <w:pPr>
+        <w:tabs>
+          <w:tab w:val="num" w:pos="4320"/>
+        </w:tabs>
+        <w:ind w:left="4320" w:hanging="360"/>
+      </w:pPr>
+      <w:rPr>
+        <w:rFonts w:ascii="Wingdings" w:hAnsi="Wingdings" w:hint="default"/>
+        <w:sz w:val="20"/>
+      </w:rPr>
+    </w:lvl>
+    <w:lvl w:ilvl="6" w:tentative="1">
+      <w:start w:val="1"/>
+      <w:numFmt w:val="bullet"/>
+      <w:lvlText w:val=""/>
+      <w:lvlJc w:val="left"/>
+      <w:pPr>
+        <w:tabs>
+          <w:tab w:val="num" w:pos="5040"/>
+        </w:tabs>
+        <w:ind w:left="5040" w:hanging="360"/>
+      </w:pPr>
+      <w:rPr>
+        <w:rFonts w:ascii="Wingdings" w:hAnsi="Wingdings" w:hint="default"/>
+        <w:sz w:val="20"/>
+      </w:rPr>
+    </w:lvl>
+    <w:lvl w:ilvl="7" w:tentative="1">
+      <w:start w:val="1"/>
+      <w:numFmt w:val="bullet"/>
+      <w:lvlText w:val=""/>
+      <w:lvlJc w:val="left"/>
+      <w:pPr>
+        <w:tabs>
+          <w:tab w:val="num" w:pos="5760"/>
+        </w:tabs>
+        <w:ind w:left="5760" w:hanging="360"/>
+      </w:pPr>
+      <w:rPr>
+        <w:rFonts w:ascii="Wingdings" w:hAnsi="Wingdings" w:hint="default"/>
+        <w:sz w:val="20"/>
+      </w:rPr>
+    </w:lvl>
+    <w:lvl w:ilvl="8" w:tentative="1">
+      <w:start w:val="1"/>
+      <w:numFmt w:val="bullet"/>
+      <w:lvlText w:val=""/>
+      <w:lvlJc w:val="left"/>
+      <w:pPr>
+        <w:tabs>
+          <w:tab w:val="num" w:pos="6480"/>
+        </w:tabs>
+        <w:ind w:left="6480" w:hanging="360"/>
+      </w:pPr>
+      <w:rPr>
+        <w:rFonts w:ascii="Wingdings" w:hAnsi="Wingdings" w:hint="default"/>
+        <w:sz w:val="20"/>
+      </w:rPr>
+    </w:lvl>
+  </w:abstractNum>
+  <w:abstractNum w:abstractNumId="4" w15:restartNumberingAfterBreak="0">
+    <w:nsid w:val="76043C92"/>
+    <w:multiLevelType w:val="multilevel"/>
+    <w:tmpl w:val="FAA65984"/>
+    <w:lvl w:ilvl="0">
+      <w:start w:val="1"/>
+      <w:numFmt w:val="bullet"/>
+      <w:lvlText w:val=""/>
+      <w:lvlJc w:val="left"/>
+      <w:pPr>
+        <w:tabs>
+          <w:tab w:val="num" w:pos="720"/>
+        </w:tabs>
+        <w:ind w:left="720" w:hanging="360"/>
+      </w:pPr>
+      <w:rPr>
+        <w:rFonts w:ascii="Symbol" w:hAnsi="Symbol" w:hint="default"/>
+        <w:sz w:val="20"/>
+      </w:rPr>
+    </w:lvl>
+    <w:lvl w:ilvl="1" w:tentative="1">
+      <w:start w:val="1"/>
+      <w:numFmt w:val="bullet"/>
+      <w:lvlText w:val="o"/>
+      <w:lvlJc w:val="left"/>
+      <w:pPr>
+        <w:tabs>
+          <w:tab w:val="num" w:pos="1440"/>
+        </w:tabs>
+        <w:ind w:left="1440" w:hanging="360"/>
+      </w:pPr>
+      <w:rPr>
+        <w:rFonts w:ascii="Courier New" w:hAnsi="Courier New" w:hint="default"/>
+        <w:sz w:val="20"/>
+      </w:rPr>
+    </w:lvl>
+    <w:lvl w:ilvl="2" w:tentative="1">
+      <w:start w:val="1"/>
+      <w:numFmt w:val="bullet"/>
+      <w:lvlText w:val=""/>
+      <w:lvlJc w:val="left"/>
+      <w:pPr>
+        <w:tabs>
+          <w:tab w:val="num" w:pos="2160"/>
+        </w:tabs>
+        <w:ind w:left="2160" w:hanging="360"/>
+      </w:pPr>
+      <w:rPr>
+        <w:rFonts w:ascii="Wingdings" w:hAnsi="Wingdings" w:hint="default"/>
+        <w:sz w:val="20"/>
+      </w:rPr>
+    </w:lvl>
+    <w:lvl w:ilvl="3" w:tentative="1">
+      <w:start w:val="1"/>
+      <w:numFmt w:val="bullet"/>
+      <w:lvlText w:val=""/>
+      <w:lvlJc w:val="left"/>
+      <w:pPr>
+        <w:tabs>
+          <w:tab w:val="num" w:pos="2880"/>
+        </w:tabs>
+        <w:ind w:left="2880" w:hanging="360"/>
+      </w:pPr>
+      <w:rPr>
+        <w:rFonts w:ascii="Wingdings" w:hAnsi="Wingdings" w:hint="default"/>
+        <w:sz w:val="20"/>
+      </w:rPr>
+    </w:lvl>
+    <w:lvl w:ilvl="4" w:tentative="1">
+      <w:start w:val="1"/>
+      <w:numFmt w:val="bullet"/>
+      <w:lvlText w:val=""/>
+      <w:lvlJc w:val="left"/>
+      <w:pPr>
+        <w:tabs>
+          <w:tab w:val="num" w:pos="3600"/>
+        </w:tabs>
+        <w:ind w:left="3600" w:hanging="360"/>
+      </w:pPr>
+      <w:rPr>
+        <w:rFonts w:ascii="Wingdings" w:hAnsi="Wingdings" w:hint="default"/>
+        <w:sz w:val="20"/>
+      </w:rPr>
+    </w:lvl>
+    <w:lvl w:ilvl="5" w:tentative="1">
+      <w:start w:val="1"/>
+      <w:numFmt w:val="bullet"/>
+      <w:lvlText w:val=""/>
+      <w:lvlJc w:val="left"/>
+      <w:pPr>
+        <w:tabs>
+          <w:tab w:val="num" w:pos="4320"/>
+        </w:tabs>
+        <w:ind w:left="4320" w:hanging="360"/>
+      </w:pPr>
+      <w:rPr>
+        <w:rFonts w:ascii="Wingdings" w:hAnsi="Wingdings" w:hint="default"/>
+        <w:sz w:val="20"/>
+      </w:rPr>
+    </w:lvl>
+    <w:lvl w:ilvl="6" w:tentative="1">
+      <w:start w:val="1"/>
+      <w:numFmt w:val="bullet"/>
+      <w:lvlText w:val=""/>
+      <w:lvlJc w:val="left"/>
+      <w:pPr>
+        <w:tabs>
+          <w:tab w:val="num" w:pos="5040"/>
+        </w:tabs>
+        <w:ind w:left="5040" w:hanging="360"/>
+      </w:pPr>
+      <w:rPr>
+        <w:rFonts w:ascii="Wingdings" w:hAnsi="Wingdings" w:hint="default"/>
+        <w:sz w:val="20"/>
+      </w:rPr>
+    </w:lvl>
+    <w:lvl w:ilvl="7" w:tentative="1">
+      <w:start w:val="1"/>
+      <w:numFmt w:val="bullet"/>
+      <w:lvlText w:val=""/>
+      <w:lvlJc w:val="left"/>
+      <w:pPr>
+        <w:tabs>
+          <w:tab w:val="num" w:pos="5760"/>
+        </w:tabs>
+        <w:ind w:left="5760" w:hanging="360"/>
+      </w:pPr>
+      <w:rPr>
+        <w:rFonts w:ascii="Wingdings" w:hAnsi="Wingdings" w:hint="default"/>
+        <w:sz w:val="20"/>
+      </w:rPr>
+    </w:lvl>
+    <w:lvl w:ilvl="8" w:tentative="1">
+      <w:start w:val="1"/>
+      <w:numFmt w:val="bullet"/>
+      <w:lvlText w:val=""/>
+      <w:lvlJc w:val="left"/>
+      <w:pPr>
+        <w:tabs>
+          <w:tab w:val="num" w:pos="6480"/>
+        </w:tabs>
+        <w:ind w:left="6480" w:hanging="360"/>
+      </w:pPr>
+      <w:rPr>
+        <w:rFonts w:ascii="Wingdings" w:hAnsi="Wingdings" w:hint="default"/>
+        <w:sz w:val="20"/>
+      </w:rPr>
+    </w:lvl>
+  </w:abstractNum>
   <w:num w:numId="1" w16cid:durableId="218636641">
+    <w:abstractNumId w:val="3"/>
+  </w:num>
+  <w:num w:numId="2" w16cid:durableId="569659083">
+    <w:abstractNumId w:val="2"/>
+  </w:num>
+  <w:num w:numId="3" w16cid:durableId="1576234014">
     <w:abstractNumId w:val="1"/>
   </w:num>
-  <w:num w:numId="2" w16cid:durableId="569659083">
+  <w:num w:numId="4" w16cid:durableId="1429305067">
     <w:abstractNumId w:val="0"/>
+  </w:num>
+  <w:num w:numId="5" w16cid:durableId="1471631505">
+    <w:abstractNumId w:val="4"/>
   </w:num>
 </w:numbering>
 </file>

</xml_diff>